<commit_message>
Audit replay claim impact and bound manuscript reproducibility claims
</commit_message>
<xml_diff>
--- a/manuscript/SPADE-PLOS-ONE-submission.docx
+++ b/manuscript/SPADE-PLOS-ONE-submission.docx
@@ -136,7 +136,7 @@
           <w:color w:val="000000"/>
           <w:sz w:val="24"/>
         </w:rPr>
-        <w:t>Selecting one formulation and estimating an acceptable operating region require different evaluations of an experimental campaign. We compared SPADE, Bayesian optimization, response-surface designs, and space-filling strategies under a 48-evaluation budget on synthetic landscapes. Retrospective rescoring examined terminal decisions; a prospectively specified benchmark comprised 8,300 campaign-arm executions across seven conditions, represented by 99,600 repeated scoring records. Changing from the best noisy observation to a common Gaussian-process recommendation reduced SPADE regret by 0.0543 but increased classical-design regret by 0.1035 in the retrospective Hill comparison. In the prespecified six-factor, lower-noise Hill target, primary SPADE achieved map error 0.1804 versus 0.2131 for noisy Bayesian optimization, a 15.3% relative reduction. Paired inference used 25 landscape instances. The point-regret gap was 0.00937 (95% bootstrap interval 0.00258–0.01615), within the prespecified ±0.02 practical margin, with two feedback rounds rather than ten. Boundary targeting did not improve on a random second round: random-minus-targeted map error was −0.00188 (95% interval −0.00624 to 0.00261). Source reconciliation showed that map scores used a 0.50 probability cutoff and the reported certificate statistic measured posterior self-consistency, not empirical containment against the oracle. A separate 2,750-row development study tested future-response reliability. None of nine candidates satisfied the cross-family containment requirement, so selection stopped without opening the lockbox. These results quantify how terminal decisions and evaluation targets change method rankings within fixed budgets. They do not establish a new level-set principle, transferable certification, or biological performance.</w:t>
+        <w:t>Selecting one formulation and estimating an acceptable operating region require different evaluations of an experimental campaign. We compared SPADE, Bayesian optimization, response-surface designs, and space-filling strategies under a 48-evaluation budget on synthetic landscapes. Retrospective rescoring examined terminal decisions; a prospectively specified benchmark comprised 8,300 campaign-arm executions across seven conditions, represented by 99,600 repeated scoring records. Changing from the best noisy observation to a common Gaussian-process recommendation reduced SPADE regret by 0.0543 but increased classical-design regret by 0.1035 in the retrospective Hill comparison. In the retained regenerated benchmark's prespecified six-factor, lower-noise Hill target, primary SPADE achieved map error 0.1804 versus 0.2131 for noisy Bayesian optimization, a 15.3% relative reduction. Paired inference used 25 landscape instances. The point-regret gap was 0.00937 (95% bootstrap interval 0.00258–0.01615), within the prespecified ±0.02 practical margin, with two feedback rounds rather than ten. Boundary targeting did not improve on a random second round: random-minus-targeted map error was −0.00188 (95% interval −0.00624 to 0.00261). Source reconciliation showed that map scores used a 0.50 probability cutoff and the reported certificate statistic measured posterior self-consistency, not empirical containment against the oracle. A separate 2,750-row development study tested future-response reliability. None of nine candidates satisfied the cross-family containment requirement, so selection stopped without opening the lockbox. These results quantify how terminal decisions and evaluation targets change method rankings within fixed budgets. Historical replay remains incomplete; neither transferable certification nor biological performance is established.</w:t>
       </w:r>
     </w:p>
     <w:p>
@@ -12103,6 +12103,199 @@
           <w:color w:val="000000"/>
           <w:sz w:val="24"/>
         </w:rPr>
+        <w:t>Replay impact on the reported claims</w:t>
+      </w:r>
+    </w:p>
+    <w:p>
+      <w:pPr>
+        <w:widowControl/>
+      </w:pPr>
+      <w:r>
+        <w:rPr>
+          <w:rFonts w:ascii="Times New Roman" w:hAnsi="Times New Roman" w:eastAsia="Times New Roman" w:cs="Times New Roman"/>
+          <w:color w:val="000000"/>
+          <w:sz w:val="24"/>
+        </w:rPr>
+        <w:t>A claim-level dependency audit separated the eight failing historical gates from the inputs to this paper. The material adaptive discrepancies concern the older Q42/Q59 external-function Rule-A references. Those reference columns are not used to support cross-family method rankings in this paper. The prospective comparisons instead use the retained regenerated final-SPADE condition files. Reaggregation of the target file gave map errors 0.180414 for primary SPADE and 0.2130685 for qLogNEI, a 15.3258% relative reduction. This verifies the reported summary, not regeneration of the underlying adaptive campaigns.</w:t>
+      </w:r>
+    </w:p>
+    <w:p>
+      <w:pPr>
+        <w:widowControl/>
+      </w:pPr>
+      <w:r>
+        <w:rPr>
+          <w:rFonts w:ascii="Times New Roman" w:hAnsi="Times New Roman" w:eastAsia="Times New Roman" w:cs="Times New Roman"/>
+          <w:color w:val="000000"/>
+          <w:sz w:val="24"/>
+        </w:rPr>
+        <w:t xml:space="preserve">The distinction is version-specific: the current default sampler is not the archived sampler. Commit </w:t>
+      </w:r>
+      <w:r>
+        <w:rPr>
+          <w:rFonts w:ascii="Courier New" w:hAnsi="Courier New" w:eastAsia="Courier New" w:cs="Courier New"/>
+          <w:color w:val="000000"/>
+          <w:sz w:val="22"/>
+        </w:rPr>
+        <w:t>01d2ea5</w:t>
+      </w:r>
+      <w:r>
+        <w:rPr>
+          <w:rFonts w:ascii="Times New Roman" w:hAnsi="Times New Roman" w:eastAsia="Times New Roman" w:cs="Times New Roman"/>
+          <w:color w:val="000000"/>
+          <w:sz w:val="24"/>
+        </w:rPr>
+        <w:t xml:space="preserve"> introduced an explicit acquisition-sampler seed after the prospective recovery version </w:t>
+      </w:r>
+      <w:r>
+        <w:rPr>
+          <w:rFonts w:ascii="Courier New" w:hAnsi="Courier New" w:eastAsia="Courier New" w:cs="Courier New"/>
+          <w:color w:val="000000"/>
+          <w:sz w:val="22"/>
+        </w:rPr>
+        <w:t>1bf51f1</w:t>
+      </w:r>
+      <w:r>
+        <w:rPr>
+          <w:rFonts w:ascii="Times New Roman" w:hAnsi="Times New Roman" w:eastAsia="Times New Roman" w:cs="Times New Roman"/>
+          <w:color w:val="000000"/>
+          <w:sz w:val="24"/>
+        </w:rPr>
+        <w:t>. In three existing external-function diagnostic cases, restoring the legacy sampler reproduced the prospective archive's Rule-A scalars exactly but did not recover the older Q42/Q59 references. Scalar agreement is not a trajectory or map-replay validation. Shared optimizer code therefore remains a reproducibility risk even where the failing reference files are not numerical inputs. The prospective Hartmann and Ackley comparisons are descriptions of the archived benchmark, not independently replay-validated robustness claims.</w:t>
+      </w:r>
+    </w:p>
+    <w:p>
+      <w:pPr>
+        <w:widowControl/>
+      </w:pPr>
+      <w:r>
+        <w:rPr>
+          <w:rFonts w:ascii="Times New Roman" w:hAnsi="Times New Roman" w:eastAsia="Times New Roman" w:cs="Times New Roman"/>
+          <w:color w:val="000000"/>
+          <w:sz w:val="24"/>
+        </w:rPr>
+        <w:t xml:space="preserve">For the observed classical Hill discrepancy, a one-row sensitivity reanalysis changed the 50-campaign mean Rule-P regret by only </w:t>
+      </w:r>
+      <m:oMath>
+        <m:box>
+          <m:e>
+            <m:r>
+              <m:rPr>
+                <m:sty m:val="p"/>
+              </m:rPr>
+              <m:t>7.76</m:t>
+            </m:r>
+            <m:r>
+              <m:rPr>
+                <m:sty m:val="p"/>
+              </m:rPr>
+              <m:t>×</m:t>
+            </m:r>
+            <m:sSup>
+              <m:e>
+                <m:r>
+                  <m:rPr>
+                    <m:sty m:val="p"/>
+                  </m:rPr>
+                  <m:t>10</m:t>
+                </m:r>
+              </m:e>
+              <m:sup>
+                <m:box>
+                  <m:e>
+                    <m:r>
+                      <m:rPr>
+                        <m:sty m:val="p"/>
+                      </m:rPr>
+                      <m:t>−</m:t>
+                    </m:r>
+                    <m:r>
+                      <m:rPr>
+                        <m:sty m:val="p"/>
+                      </m:rPr>
+                      <m:t>9</m:t>
+                    </m:r>
+                  </m:e>
+                </m:box>
+              </m:sup>
+            </m:sSup>
+          </m:e>
+        </m:box>
+      </m:oMath>
+      <w:r>
+        <w:rPr>
+          <w:rFonts w:ascii="Times New Roman" w:hAnsi="Times New Roman" w:eastAsia="Times New Roman" w:cs="Times New Roman"/>
+          <w:color w:val="000000"/>
+          <w:sz w:val="24"/>
+        </w:rPr>
+        <w:t xml:space="preserve"> and left the displayed four-decimal contrast, its bootstrap interval, Wilcoxon result, and selected-arm ordering unchanged. Replacing only the checked calibration campaign's 24 cells in memory changed the classical arm's mean calibration error by </w:t>
+      </w:r>
+      <m:oMath>
+        <m:box>
+          <m:e>
+            <m:r>
+              <m:rPr>
+                <m:sty m:val="p"/>
+              </m:rPr>
+              <m:t>2.58</m:t>
+            </m:r>
+            <m:r>
+              <m:rPr>
+                <m:sty m:val="p"/>
+              </m:rPr>
+              <m:t>×</m:t>
+            </m:r>
+            <m:sSup>
+              <m:e>
+                <m:r>
+                  <m:rPr>
+                    <m:sty m:val="p"/>
+                  </m:rPr>
+                  <m:t>10</m:t>
+                </m:r>
+              </m:e>
+              <m:sup>
+                <m:box>
+                  <m:e>
+                    <m:r>
+                      <m:rPr>
+                        <m:sty m:val="p"/>
+                      </m:rPr>
+                      <m:t>−</m:t>
+                    </m:r>
+                    <m:r>
+                      <m:rPr>
+                        <m:sty m:val="p"/>
+                      </m:rPr>
+                      <m:t>15</m:t>
+                    </m:r>
+                  </m:e>
+                </m:box>
+              </m:sup>
+            </m:sSup>
+          </m:e>
+        </m:box>
+      </m:oMath>
+      <w:r>
+        <w:rPr>
+          <w:rFonts w:ascii="Times New Roman" w:hAnsi="Times New Roman" w:eastAsia="Times New Roman" w:cs="Times New Roman"/>
+          <w:color w:val="000000"/>
+          <w:sz w:val="24"/>
+        </w:rPr>
+        <w:t>, without changing the displayed four-arm ordering; its refinement and AUC were unchanged. These substitutions were diagnostics only: no archived rows were replaced. This evidence does not bound errors in untested campaigns or establish a general numerical tolerance. We retain the exact failure gates and restrict conclusions to the identified archived evidence bodies.</w:t>
+      </w:r>
+    </w:p>
+    <w:p>
+      <w:pPr>
+        <w:pStyle w:val="Heading2"/>
+        <w:widowControl/>
+      </w:pPr>
+      <w:r>
+        <w:rPr>
+          <w:rFonts w:ascii="Times New Roman" w:hAnsi="Times New Roman" w:eastAsia="Times New Roman" w:cs="Times New Roman"/>
+          <w:color w:val="000000"/>
+          <w:sz w:val="24"/>
+        </w:rPr>
         <w:t>Implications for subsequent evaluations</w:t>
       </w:r>
     </w:p>
@@ -12156,7 +12349,7 @@
           <w:color w:val="000000"/>
           <w:sz w:val="24"/>
         </w:rPr>
-        <w:t xml:space="preserve">Under matched experimental budgets, point and region objectives reversed method rankings. In the registered six-factor synthetic target condition, SPADE m0 reduced latent-map error by 15.3% relative to qLogNEI, retained practical point-regret parity, and used two feedback rounds rather than ten. Its map advantage over Sobol was below the practical threshold, and one-shot LHS had similar mean map error with lower mean point regret. Boundary targeting did not beat random placement. The original prospective posterior checks did not establish empirical certificate validity. A separate future-response protocol returned </w:t>
+        <w:t xml:space="preserve">Within the retained benchmark, point and region objectives reversed method rankings under matched experimental budgets. In the registered six-factor synthetic target condition, SPADE m0 reduced latent-map error by 15.3% relative to qLogNEI, retained practical point-regret parity, and used two feedback rounds rather than ten. Its map advantage over Sobol was below the practical threshold, and one-shot LHS had similar mean map error with lower mean point regret. Boundary targeting did not beat random placement. The original prospective posterior checks did not establish empirical certificate validity. A separate future-response protocol returned </w:t>
       </w:r>
       <w:r>
         <w:rPr>
@@ -12172,7 +12365,7 @@
           <w:color w:val="000000"/>
           <w:sz w:val="24"/>
         </w:rPr>
-        <w:t xml:space="preserve"> at its five-family development gate, so no lockbox evidence was opened. These results support explicit separation of sampling, final selection, mapping, and certificate validation in experimental-design benchmarks. They do not establish universal SPADE superiority or a validated biological design space.</w:t>
+        <w:t xml:space="preserve"> at its five-family development gate, so no lockbox evidence was opened. These results support explicit separation of sampling, final selection, mapping, and certificate validation in experimental-design benchmarks. They do not establish universal SPADE superiority, complete historical replay, or a validated biological design space.</w:t>
       </w:r>
     </w:p>
     <w:p>

</xml_diff>

<commit_message>
docs: unwrap hard line breaks in SPADE PLOS manuscript
Join Markdown hard-wraps into real paragraphs so Word no longer treats each
wrapped line as its own paragraph; harden the DOCX builder the same way.
</commit_message>
<xml_diff>
--- a/manuscript/SPADE-PLOS-ONE-submission.docx
+++ b/manuscript/SPADE-PLOS-ONE-submission.docx
@@ -76,31 +76,13 @@
         </w:rPr>
         <w:t>Affiliations:</w:t>
       </w:r>
-    </w:p>
-    <w:p>
-      <w:pPr>
-        <w:widowControl/>
-      </w:pPr>
       <w:r>
         <w:rPr>
           <w:rFonts w:ascii="Times New Roman" w:hAnsi="Times New Roman" w:eastAsia="Times New Roman" w:cs="Times New Roman"/>
           <w:color w:val="000000"/>
           <w:sz w:val="24"/>
         </w:rPr>
-        <w:t>¹ Department of Chemical Engineering, Columbia University, New York, New York, United States of America</w:t>
-      </w:r>
-    </w:p>
-    <w:p>
-      <w:pPr>
-        <w:widowControl/>
-      </w:pPr>
-      <w:r>
-        <w:rPr>
-          <w:rFonts w:ascii="Times New Roman" w:hAnsi="Times New Roman" w:eastAsia="Times New Roman" w:cs="Times New Roman"/>
-          <w:color w:val="000000"/>
-          <w:sz w:val="24"/>
-        </w:rPr>
-        <w:t>² Department of Industrial Engineering and Operations Research, Columbia University, New York, New York, United States of America</w:t>
+        <w:t xml:space="preserve"> ¹ Department of Chemical Engineering, Columbia University, New York, New York, United States of America ² Department of Industrial Engineering and Operations Research, Columbia University, New York, New York, United States of America</w:t>
       </w:r>
     </w:p>
     <w:p>
@@ -176,254 +158,7 @@
           <w:color w:val="000000"/>
           <w:sz w:val="24"/>
         </w:rPr>
-        <w:t>An experimental campaign may need one optimized recipe or a conservative operating</w:t>
-      </w:r>
-    </w:p>
-    <w:p>
-      <w:pPr>
-        <w:widowControl/>
-      </w:pPr>
-      <w:r>
-        <w:rPr>
-          <w:rFonts w:ascii="Times New Roman" w:hAnsi="Times New Roman" w:eastAsia="Times New Roman" w:cs="Times New Roman"/>
-          <w:color w:val="000000"/>
-          <w:sz w:val="24"/>
-        </w:rPr>
-        <w:t>region; these are different decisions. We evaluated SPADE, an assay-oriented integration</w:t>
-      </w:r>
-    </w:p>
-    <w:p>
-      <w:pPr>
-        <w:widowControl/>
-      </w:pPr>
-      <w:r>
-        <w:rPr>
-          <w:rFonts w:ascii="Times New Roman" w:hAnsi="Times New Roman" w:eastAsia="Times New Roman" w:cs="Times New Roman"/>
-          <w:color w:val="000000"/>
-          <w:sz w:val="24"/>
-        </w:rPr>
-        <w:t>of established Gaussian-process level-set and conservative-set methods, against noisy</w:t>
-      </w:r>
-    </w:p>
-    <w:p>
-      <w:pPr>
-        <w:widowControl/>
-      </w:pPr>
-      <w:r>
-        <w:rPr>
-          <w:rFonts w:ascii="Times New Roman" w:hAnsi="Times New Roman" w:eastAsia="Times New Roman" w:cs="Times New Roman"/>
-          <w:color w:val="000000"/>
-          <w:sz w:val="24"/>
-        </w:rPr>
-        <w:t>Bayesian optimization (qLogNEI) and a response-surface design of experiments (DoE) on</w:t>
-      </w:r>
-    </w:p>
-    <w:p>
-      <w:pPr>
-        <w:widowControl/>
-      </w:pPr>
-      <w:r>
-        <w:rPr>
-          <w:rFonts w:ascii="Times New Roman" w:hAnsi="Times New Roman" w:eastAsia="Times New Roman" w:cs="Times New Roman"/>
-          <w:color w:val="000000"/>
-          <w:sz w:val="24"/>
-        </w:rPr>
-        <w:t>synthetic families under 48-well budgets. Primary matched-round evidence came first: at</w:t>
-      </w:r>
-    </w:p>
-    <w:p>
-      <w:pPr>
-        <w:widowControl/>
-      </w:pPr>
-      <w:r>
-        <w:rPr>
-          <w:rFonts w:ascii="Times New Roman" w:hAnsi="Times New Roman" w:eastAsia="Times New Roman" w:cs="Times New Roman"/>
-          <w:color w:val="000000"/>
-          <w:sz w:val="24"/>
-        </w:rPr>
-        <w:t>five rounds, SPADE returned greater certified volume than qLogNEI</w:t>
-      </w:r>
-    </w:p>
-    <w:p>
-      <w:pPr>
-        <w:widowControl/>
-      </w:pPr>
-      <w:r>
-        <w:rPr>
-          <w:rFonts w:ascii="Times New Roman" w:hAnsi="Times New Roman" w:eastAsia="Times New Roman" w:cs="Times New Roman"/>
-          <w:color w:val="000000"/>
-          <w:sz w:val="24"/>
-        </w:rPr>
-        <w:t>(+0.000855, 95% CI [+0.000691, +0.001028], p &lt; 0.0001, n = 320 dependent</w:t>
-      </w:r>
-    </w:p>
-    <w:p>
-      <w:pPr>
-        <w:widowControl/>
-      </w:pPr>
-      <w:r>
-        <w:rPr>
-          <w:rFonts w:ascii="Times New Roman" w:hAnsi="Times New Roman" w:eastAsia="Times New Roman" w:cs="Times New Roman"/>
-          <w:color w:val="000000"/>
-          <w:sz w:val="24"/>
-        </w:rPr>
-        <w:t>family-seed-prevalence cells under leave-one-family-out calibration). Thus SPADE</w:t>
-      </w:r>
-    </w:p>
-    <w:p>
-      <w:pPr>
-        <w:widowControl/>
-      </w:pPr>
-      <w:r>
-        <w:rPr>
-          <w:rFonts w:ascii="Times New Roman" w:hAnsi="Times New Roman" w:eastAsia="Times New Roman" w:cs="Times New Roman"/>
-          <w:color w:val="000000"/>
-          <w:sz w:val="24"/>
-        </w:rPr>
-        <w:t>was better for the tested operating-region decision, not universally better. In the</w:t>
-      </w:r>
-    </w:p>
-    <w:p>
-      <w:pPr>
-        <w:widowControl/>
-      </w:pPr>
-      <w:r>
-        <w:rPr>
-          <w:rFonts w:ascii="Times New Roman" w:hAnsi="Times New Roman" w:eastAsia="Times New Roman" w:cs="Times New Roman"/>
-          <w:color w:val="000000"/>
-          <w:sz w:val="24"/>
-        </w:rPr>
-        <w:t>one-process point comparison, five-round SPADE showed no detectable regret difference</w:t>
-      </w:r>
-    </w:p>
-    <w:p>
-      <w:pPr>
-        <w:widowControl/>
-      </w:pPr>
-      <w:r>
-        <w:rPr>
-          <w:rFonts w:ascii="Times New Roman" w:hAnsi="Times New Roman" w:eastAsia="Times New Roman" w:cs="Times New Roman"/>
-          <w:color w:val="000000"/>
-          <w:sz w:val="24"/>
-        </w:rPr>
-        <w:t>from ten-round qLogNEI (-0.0005, 95% CI [-0.0221, +0.0207], p = 0.96, n = 160),</w:t>
-      </w:r>
-    </w:p>
-    <w:p>
-      <w:pPr>
-        <w:widowControl/>
-      </w:pPr>
-      <w:r>
-        <w:rPr>
-          <w:rFonts w:ascii="Times New Roman" w:hAnsi="Times New Roman" w:eastAsia="Times New Roman" w:cs="Times New Roman"/>
-          <w:color w:val="000000"/>
-          <w:sz w:val="24"/>
-        </w:rPr>
-        <w:t>but the interval did not establish equivalence. The adverse DoE result was</w:t>
-      </w:r>
-    </w:p>
-    <w:p>
-      <w:pPr>
-        <w:widowControl/>
-      </w:pPr>
-      <w:r>
-        <w:rPr>
-          <w:rFonts w:ascii="Times New Roman" w:hAnsi="Times New Roman" w:eastAsia="Times New Roman" w:cs="Times New Roman"/>
-          <w:color w:val="000000"/>
-          <w:sz w:val="24"/>
-        </w:rPr>
-        <w:t>substantial: screened three-round DoE found the better point recipe</w:t>
-      </w:r>
-    </w:p>
-    <w:p>
-      <w:pPr>
-        <w:widowControl/>
-      </w:pPr>
-      <w:r>
-        <w:rPr>
-          <w:rFonts w:ascii="Times New Roman" w:hAnsi="Times New Roman" w:eastAsia="Times New Roman" w:cs="Times New Roman"/>
-          <w:color w:val="000000"/>
-          <w:sz w:val="24"/>
-        </w:rPr>
-        <w:t>(+0.1026 SPADE-minus-DoE regret, 95% CI [+0.0486, +0.1578], p = 0.0003),</w:t>
-      </w:r>
-    </w:p>
-    <w:p>
-      <w:pPr>
-        <w:widowControl/>
-      </w:pPr>
-      <w:r>
-        <w:rPr>
-          <w:rFonts w:ascii="Times New Roman" w:hAnsi="Times New Roman" w:eastAsia="Times New Roman" w:cs="Times New Roman"/>
-          <w:color w:val="000000"/>
-          <w:sz w:val="24"/>
-        </w:rPr>
-        <w:t>while five-round SPADE answered 66/160 regional decisions and</w:t>
-      </w:r>
-    </w:p>
-    <w:p>
-      <w:pPr>
-        <w:widowControl/>
-      </w:pPr>
-      <w:r>
-        <w:rPr>
-          <w:rFonts w:ascii="Times New Roman" w:hAnsi="Times New Roman" w:eastAsia="Times New Roman" w:cs="Times New Roman"/>
-          <w:color w:val="000000"/>
-          <w:sz w:val="24"/>
-        </w:rPr>
-        <w:t>contained truth in 66/66, compared with 85/122 and 77/134 contained answers for</w:t>
-      </w:r>
-    </w:p>
-    <w:p>
-      <w:pPr>
-        <w:widowControl/>
-      </w:pPr>
-      <w:r>
-        <w:rPr>
-          <w:rFonts w:ascii="Times New Roman" w:hAnsi="Times New Roman" w:eastAsia="Times New Roman" w:cs="Times New Roman"/>
-          <w:color w:val="000000"/>
-          <w:sz w:val="24"/>
-        </w:rPr>
-        <w:t>screened and unscreened DoE. Flat-cell intervals are conditional and dependence may make</w:t>
-      </w:r>
-    </w:p>
-    <w:p>
-      <w:pPr>
-        <w:widowControl/>
-      </w:pPr>
-      <w:r>
-        <w:rPr>
-          <w:rFonts w:ascii="Times New Roman" w:hAnsi="Times New Roman" w:eastAsia="Times New Roman" w:cs="Times New Roman"/>
-          <w:color w:val="000000"/>
-          <w:sz w:val="24"/>
-        </w:rPr>
-        <w:t>them too narrow. Results are limited to the tested synthetic benchmark, moderate noise,</w:t>
-      </w:r>
-    </w:p>
-    <w:p>
-      <w:pPr>
-        <w:widowControl/>
-      </w:pPr>
-      <w:r>
-        <w:rPr>
-          <w:rFonts w:ascii="Times New Roman" w:hAnsi="Times New Roman" w:eastAsia="Times New Roman" w:cs="Times New Roman"/>
-          <w:color w:val="000000"/>
-          <w:sz w:val="24"/>
-        </w:rPr>
-        <w:t>finite grids, and calibration rules; they do not establish regulatory qualification or</w:t>
-      </w:r>
-    </w:p>
-    <w:p>
-      <w:pPr>
-        <w:widowControl/>
-      </w:pPr>
-      <w:r>
-        <w:rPr>
-          <w:rFonts w:ascii="Times New Roman" w:hAnsi="Times New Roman" w:eastAsia="Times New Roman" w:cs="Times New Roman"/>
-          <w:color w:val="000000"/>
-          <w:sz w:val="24"/>
-        </w:rPr>
-        <w:t>prospective wet-lab performance.</w:t>
+        <w:t>An experimental campaign may need one optimized recipe or a conservative operating region; these are different decisions. We evaluated SPADE, an assay-oriented integration of established Gaussian-process level-set and conservative-set methods, against noisy Bayesian optimization (qLogNEI) and a response-surface design of experiments (DoE) on synthetic families under 48-well budgets. Primary matched-round evidence came first: at five rounds, SPADE returned greater certified volume than qLogNEI (+0.000855, 95% CI [+0.000691, +0.001028], p &lt; 0.0001, n = 320 dependent family-seed-prevalence cells under leave-one-family-out calibration). Thus SPADE was better for the tested operating-region decision, not universally better. In the one-process point comparison, five-round SPADE showed no detectable regret difference from ten-round qLogNEI (-0.0005, 95% CI [-0.0221, +0.0207], p = 0.96, n = 160), but the interval did not establish equivalence. The adverse DoE result was substantial: screened three-round DoE found the better point recipe (+0.1026 SPADE-minus-DoE regret, 95% CI [+0.0486, +0.1578], p = 0.0003), while five-round SPADE answered 66/160 regional decisions and contained truth in 66/66, compared with 85/122 and 77/134 contained answers for screened and unscreened DoE. Flat-cell intervals are conditional and dependence may make them too narrow. Results are limited to the tested synthetic benchmark, moderate noise, finite grids, and calibration rules; they do not establish regulatory qualification or prospective wet-lab performance.</w:t>
       </w:r>
     </w:p>
     <w:p>
@@ -450,7 +185,7 @@
           <w:color w:val="000000"/>
           <w:sz w:val="24"/>
         </w:rPr>
-        <w:t>Cell-culture media, extracellular-matrix composition, and bioprocess parameters are</w:t>
+        <w:t>Cell-culture media, extracellular-matrix composition, and bioprocess parameters are chosen jointly, so even a modest factor grid can exceed a practical assay budget. Classical response-surface methodology provides screening, sequential movement, and low-order local modelling [1–3]. Bayesian optimization (BO) instead fits a probabilistic surrogate and allocates observations to improve an objective [4–6]. Both approaches are used in biological and bioprocess development [7–12].</w:t>
       </w:r>
     </w:p>
     <w:p>
@@ -463,7 +198,7 @@
           <w:color w:val="000000"/>
           <w:sz w:val="24"/>
         </w:rPr>
-        <w:t>chosen jointly, so even a modest factor grid can exceed a practical assay budget.</w:t>
+        <w:t>The decision made after sampling matters as much as the sampling rule. One laboratory may need a single carry-forward recipe, appropriately scored by point regret. Another may need an operating region: a set of compositions expected to exceed a specification, with an explicit option to abstain when the evidence is insufficient. A method can find a strong point while learning little about the surrounding region, or map a region without finding the global optimum. Point regret, map error, answer rate, empirical truth containment, and certified volume are therefore distinct estimands.</w:t>
       </w:r>
     </w:p>
     <w:p>
@@ -476,7 +211,7 @@
           <w:color w:val="000000"/>
           <w:sz w:val="24"/>
         </w:rPr>
-        <w:t>Classical response-surface methodology provides screening, sequential movement, and</w:t>
+        <w:t>Region estimation is not new. Gaussian-process (GP) level-set classification and boundary-focused batch sampling are established [13], as are conservative excursion-set estimators based on posterior inclusion [14] and methods such as TruVaR that connect optimization with level-set learning [15]. qLogNEI is a modern noisy expected-improvement method [16]. Proper scoring separates probabilistic forecasts from downstream decisions [17], while BoTorch supplies established computational components [18]. Recent synthetic batch-BO work further shows that noise and geometry can alter rankings [19], and good simulation-study practice requires explicit estimands and data-generating scope [20].</w:t>
       </w:r>
     </w:p>
     <w:p>
@@ -489,7 +224,7 @@
           <w:color w:val="000000"/>
           <w:sz w:val="24"/>
         </w:rPr>
-        <w:t>low-order local modelling [1–3]. Bayesian optimization (BO) instead fits a probabilistic</w:t>
+        <w:t>SPADE is an assay-oriented architecture built from these established ingredients, not a new excursion-set theory. It combines a space-filling opening, adaptive high-response sampling, a common posterior conservative-set estimator that can also score comparator observations, and abstention. Its acquisition should not be described as successfully threshold-targeted: a registered target-aligned variant failed its adoption gate. The scientific question is instead whether this architecture improves the tested regional decision while honestly retaining point-optimization trade-offs.</w:t>
       </w:r>
     </w:p>
     <w:p>
@@ -502,390 +237,8 @@
           <w:color w:val="000000"/>
           <w:sz w:val="24"/>
         </w:rPr>
-        <w:t>surrogate and allocates observations to improve an objective [4–6]. Both approaches are</w:t>
+        <w:t xml:space="preserve">We report six linked findings. C3 asks whether matched five-round SPADE returns greater certified volume than qLogNEI. C1 asks whether five-round SPADE differs detectably from ten-round qLogNEI on point regret. C2 compares regional containment and point regret with one screened and one unscreened response-surface DoE pipeline. C5 and C6 examine family/prevalence scope. S2 and S3 diagnose real-data posterior collapse and assay-specific calibration. Finally, S1, a real-noise ceiling, and a later </w:t>
       </w:r>
-    </w:p>
-    <w:p>
-      <w:pPr>
-        <w:widowControl/>
-      </w:pPr>
-      <w:r>
-        <w:rPr>
-          <w:rFonts w:ascii="Times New Roman" w:hAnsi="Times New Roman" w:eastAsia="Times New Roman" w:cs="Times New Roman"/>
-          <w:color w:val="000000"/>
-          <w:sz w:val="24"/>
-        </w:rPr>
-        <w:t>used in biological and bioprocess development [7–12].</w:t>
-      </w:r>
-    </w:p>
-    <w:p>
-      <w:pPr>
-        <w:widowControl/>
-      </w:pPr>
-      <w:r>
-        <w:rPr>
-          <w:rFonts w:ascii="Times New Roman" w:hAnsi="Times New Roman" w:eastAsia="Times New Roman" w:cs="Times New Roman"/>
-          <w:color w:val="000000"/>
-          <w:sz w:val="24"/>
-        </w:rPr>
-        <w:t>The decision made after sampling matters as much as the sampling rule. One laboratory</w:t>
-      </w:r>
-    </w:p>
-    <w:p>
-      <w:pPr>
-        <w:widowControl/>
-      </w:pPr>
-      <w:r>
-        <w:rPr>
-          <w:rFonts w:ascii="Times New Roman" w:hAnsi="Times New Roman" w:eastAsia="Times New Roman" w:cs="Times New Roman"/>
-          <w:color w:val="000000"/>
-          <w:sz w:val="24"/>
-        </w:rPr>
-        <w:t>may need a single carry-forward recipe, appropriately scored by point regret. Another</w:t>
-      </w:r>
-    </w:p>
-    <w:p>
-      <w:pPr>
-        <w:widowControl/>
-      </w:pPr>
-      <w:r>
-        <w:rPr>
-          <w:rFonts w:ascii="Times New Roman" w:hAnsi="Times New Roman" w:eastAsia="Times New Roman" w:cs="Times New Roman"/>
-          <w:color w:val="000000"/>
-          <w:sz w:val="24"/>
-        </w:rPr>
-        <w:t>may need an operating region: a set of compositions expected to exceed a specification,</w:t>
-      </w:r>
-    </w:p>
-    <w:p>
-      <w:pPr>
-        <w:widowControl/>
-      </w:pPr>
-      <w:r>
-        <w:rPr>
-          <w:rFonts w:ascii="Times New Roman" w:hAnsi="Times New Roman" w:eastAsia="Times New Roman" w:cs="Times New Roman"/>
-          <w:color w:val="000000"/>
-          <w:sz w:val="24"/>
-        </w:rPr>
-        <w:t>with an explicit option to abstain when the evidence is insufficient. A method can find</w:t>
-      </w:r>
-    </w:p>
-    <w:p>
-      <w:pPr>
-        <w:widowControl/>
-      </w:pPr>
-      <w:r>
-        <w:rPr>
-          <w:rFonts w:ascii="Times New Roman" w:hAnsi="Times New Roman" w:eastAsia="Times New Roman" w:cs="Times New Roman"/>
-          <w:color w:val="000000"/>
-          <w:sz w:val="24"/>
-        </w:rPr>
-        <w:t>a strong point while learning little about the surrounding region, or map a region</w:t>
-      </w:r>
-    </w:p>
-    <w:p>
-      <w:pPr>
-        <w:widowControl/>
-      </w:pPr>
-      <w:r>
-        <w:rPr>
-          <w:rFonts w:ascii="Times New Roman" w:hAnsi="Times New Roman" w:eastAsia="Times New Roman" w:cs="Times New Roman"/>
-          <w:color w:val="000000"/>
-          <w:sz w:val="24"/>
-        </w:rPr>
-        <w:t>without finding the global optimum. Point regret, map error, answer rate, empirical</w:t>
-      </w:r>
-    </w:p>
-    <w:p>
-      <w:pPr>
-        <w:widowControl/>
-      </w:pPr>
-      <w:r>
-        <w:rPr>
-          <w:rFonts w:ascii="Times New Roman" w:hAnsi="Times New Roman" w:eastAsia="Times New Roman" w:cs="Times New Roman"/>
-          <w:color w:val="000000"/>
-          <w:sz w:val="24"/>
-        </w:rPr>
-        <w:t>truth containment, and certified volume are therefore distinct estimands.</w:t>
-      </w:r>
-    </w:p>
-    <w:p>
-      <w:pPr>
-        <w:widowControl/>
-      </w:pPr>
-      <w:r>
-        <w:rPr>
-          <w:rFonts w:ascii="Times New Roman" w:hAnsi="Times New Roman" w:eastAsia="Times New Roman" w:cs="Times New Roman"/>
-          <w:color w:val="000000"/>
-          <w:sz w:val="24"/>
-        </w:rPr>
-        <w:t>Region estimation is not new. Gaussian-process (GP) level-set classification and</w:t>
-      </w:r>
-    </w:p>
-    <w:p>
-      <w:pPr>
-        <w:widowControl/>
-      </w:pPr>
-      <w:r>
-        <w:rPr>
-          <w:rFonts w:ascii="Times New Roman" w:hAnsi="Times New Roman" w:eastAsia="Times New Roman" w:cs="Times New Roman"/>
-          <w:color w:val="000000"/>
-          <w:sz w:val="24"/>
-        </w:rPr>
-        <w:t>boundary-focused batch sampling are established [13], as are conservative excursion-set</w:t>
-      </w:r>
-    </w:p>
-    <w:p>
-      <w:pPr>
-        <w:widowControl/>
-      </w:pPr>
-      <w:r>
-        <w:rPr>
-          <w:rFonts w:ascii="Times New Roman" w:hAnsi="Times New Roman" w:eastAsia="Times New Roman" w:cs="Times New Roman"/>
-          <w:color w:val="000000"/>
-          <w:sz w:val="24"/>
-        </w:rPr>
-        <w:t>estimators based on posterior inclusion [14] and methods such as TruVaR that connect</w:t>
-      </w:r>
-    </w:p>
-    <w:p>
-      <w:pPr>
-        <w:widowControl/>
-      </w:pPr>
-      <w:r>
-        <w:rPr>
-          <w:rFonts w:ascii="Times New Roman" w:hAnsi="Times New Roman" w:eastAsia="Times New Roman" w:cs="Times New Roman"/>
-          <w:color w:val="000000"/>
-          <w:sz w:val="24"/>
-        </w:rPr>
-        <w:t>optimization with level-set learning [15]. qLogNEI is a modern noisy expected-improvement</w:t>
-      </w:r>
-    </w:p>
-    <w:p>
-      <w:pPr>
-        <w:widowControl/>
-      </w:pPr>
-      <w:r>
-        <w:rPr>
-          <w:rFonts w:ascii="Times New Roman" w:hAnsi="Times New Roman" w:eastAsia="Times New Roman" w:cs="Times New Roman"/>
-          <w:color w:val="000000"/>
-          <w:sz w:val="24"/>
-        </w:rPr>
-        <w:t>method [16]. Proper scoring separates probabilistic forecasts from downstream decisions</w:t>
-      </w:r>
-    </w:p>
-    <w:p>
-      <w:pPr>
-        <w:widowControl/>
-      </w:pPr>
-      <w:r>
-        <w:rPr>
-          <w:rFonts w:ascii="Times New Roman" w:hAnsi="Times New Roman" w:eastAsia="Times New Roman" w:cs="Times New Roman"/>
-          <w:color w:val="000000"/>
-          <w:sz w:val="24"/>
-        </w:rPr>
-        <w:t>[17], while BoTorch supplies established computational components [18]. Recent synthetic</w:t>
-      </w:r>
-    </w:p>
-    <w:p>
-      <w:pPr>
-        <w:widowControl/>
-      </w:pPr>
-      <w:r>
-        <w:rPr>
-          <w:rFonts w:ascii="Times New Roman" w:hAnsi="Times New Roman" w:eastAsia="Times New Roman" w:cs="Times New Roman"/>
-          <w:color w:val="000000"/>
-          <w:sz w:val="24"/>
-        </w:rPr>
-        <w:t>batch-BO work further shows that noise and geometry can alter rankings [19], and good</w:t>
-      </w:r>
-    </w:p>
-    <w:p>
-      <w:pPr>
-        <w:widowControl/>
-      </w:pPr>
-      <w:r>
-        <w:rPr>
-          <w:rFonts w:ascii="Times New Roman" w:hAnsi="Times New Roman" w:eastAsia="Times New Roman" w:cs="Times New Roman"/>
-          <w:color w:val="000000"/>
-          <w:sz w:val="24"/>
-        </w:rPr>
-        <w:t>simulation-study practice requires explicit estimands and data-generating scope [20].</w:t>
-      </w:r>
-    </w:p>
-    <w:p>
-      <w:pPr>
-        <w:widowControl/>
-      </w:pPr>
-      <w:r>
-        <w:rPr>
-          <w:rFonts w:ascii="Times New Roman" w:hAnsi="Times New Roman" w:eastAsia="Times New Roman" w:cs="Times New Roman"/>
-          <w:color w:val="000000"/>
-          <w:sz w:val="24"/>
-        </w:rPr>
-        <w:t>SPADE is an assay-oriented architecture built from these established ingredients, not</w:t>
-      </w:r>
-    </w:p>
-    <w:p>
-      <w:pPr>
-        <w:widowControl/>
-      </w:pPr>
-      <w:r>
-        <w:rPr>
-          <w:rFonts w:ascii="Times New Roman" w:hAnsi="Times New Roman" w:eastAsia="Times New Roman" w:cs="Times New Roman"/>
-          <w:color w:val="000000"/>
-          <w:sz w:val="24"/>
-        </w:rPr>
-        <w:t>a new excursion-set theory. It combines a space-filling opening, adaptive high-response</w:t>
-      </w:r>
-    </w:p>
-    <w:p>
-      <w:pPr>
-        <w:widowControl/>
-      </w:pPr>
-      <w:r>
-        <w:rPr>
-          <w:rFonts w:ascii="Times New Roman" w:hAnsi="Times New Roman" w:eastAsia="Times New Roman" w:cs="Times New Roman"/>
-          <w:color w:val="000000"/>
-          <w:sz w:val="24"/>
-        </w:rPr>
-        <w:t>sampling, a common posterior conservative-set estimator that can also score comparator</w:t>
-      </w:r>
-    </w:p>
-    <w:p>
-      <w:pPr>
-        <w:widowControl/>
-      </w:pPr>
-      <w:r>
-        <w:rPr>
-          <w:rFonts w:ascii="Times New Roman" w:hAnsi="Times New Roman" w:eastAsia="Times New Roman" w:cs="Times New Roman"/>
-          <w:color w:val="000000"/>
-          <w:sz w:val="24"/>
-        </w:rPr>
-        <w:t>observations, and abstention. Its acquisition should not be described as successfully</w:t>
-      </w:r>
-    </w:p>
-    <w:p>
-      <w:pPr>
-        <w:widowControl/>
-      </w:pPr>
-      <w:r>
-        <w:rPr>
-          <w:rFonts w:ascii="Times New Roman" w:hAnsi="Times New Roman" w:eastAsia="Times New Roman" w:cs="Times New Roman"/>
-          <w:color w:val="000000"/>
-          <w:sz w:val="24"/>
-        </w:rPr>
-        <w:t>threshold-targeted: a registered target-aligned variant failed its adoption gate. The</w:t>
-      </w:r>
-    </w:p>
-    <w:p>
-      <w:pPr>
-        <w:widowControl/>
-      </w:pPr>
-      <w:r>
-        <w:rPr>
-          <w:rFonts w:ascii="Times New Roman" w:hAnsi="Times New Roman" w:eastAsia="Times New Roman" w:cs="Times New Roman"/>
-          <w:color w:val="000000"/>
-          <w:sz w:val="24"/>
-        </w:rPr>
-        <w:t>scientific question is instead whether this architecture improves the tested regional</w:t>
-      </w:r>
-    </w:p>
-    <w:p>
-      <w:pPr>
-        <w:widowControl/>
-      </w:pPr>
-      <w:r>
-        <w:rPr>
-          <w:rFonts w:ascii="Times New Roman" w:hAnsi="Times New Roman" w:eastAsia="Times New Roman" w:cs="Times New Roman"/>
-          <w:color w:val="000000"/>
-          <w:sz w:val="24"/>
-        </w:rPr>
-        <w:t>decision while honestly retaining point-optimization trade-offs.</w:t>
-      </w:r>
-    </w:p>
-    <w:p>
-      <w:pPr>
-        <w:widowControl/>
-      </w:pPr>
-      <w:r>
-        <w:rPr>
-          <w:rFonts w:ascii="Times New Roman" w:hAnsi="Times New Roman" w:eastAsia="Times New Roman" w:cs="Times New Roman"/>
-          <w:color w:val="000000"/>
-          <w:sz w:val="24"/>
-        </w:rPr>
-        <w:t>We report six linked findings. C3 asks whether matched five-round SPADE returns greater</w:t>
-      </w:r>
-    </w:p>
-    <w:p>
-      <w:pPr>
-        <w:widowControl/>
-      </w:pPr>
-      <w:r>
-        <w:rPr>
-          <w:rFonts w:ascii="Times New Roman" w:hAnsi="Times New Roman" w:eastAsia="Times New Roman" w:cs="Times New Roman"/>
-          <w:color w:val="000000"/>
-          <w:sz w:val="24"/>
-        </w:rPr>
-        <w:t>certified volume than qLogNEI. C1 asks whether five-round SPADE differs detectably from</w:t>
-      </w:r>
-    </w:p>
-    <w:p>
-      <w:pPr>
-        <w:widowControl/>
-      </w:pPr>
-      <w:r>
-        <w:rPr>
-          <w:rFonts w:ascii="Times New Roman" w:hAnsi="Times New Roman" w:eastAsia="Times New Roman" w:cs="Times New Roman"/>
-          <w:color w:val="000000"/>
-          <w:sz w:val="24"/>
-        </w:rPr>
-        <w:t>ten-round qLogNEI on point regret. C2 compares regional containment and point regret with</w:t>
-      </w:r>
-    </w:p>
-    <w:p>
-      <w:pPr>
-        <w:widowControl/>
-      </w:pPr>
-      <w:r>
-        <w:rPr>
-          <w:rFonts w:ascii="Times New Roman" w:hAnsi="Times New Roman" w:eastAsia="Times New Roman" w:cs="Times New Roman"/>
-          <w:color w:val="000000"/>
-          <w:sz w:val="24"/>
-        </w:rPr>
-        <w:t>one screened and one unscreened response-surface DoE pipeline. C5 and C6 examine</w:t>
-      </w:r>
-    </w:p>
-    <w:p>
-      <w:pPr>
-        <w:widowControl/>
-      </w:pPr>
-      <w:r>
-        <w:rPr>
-          <w:rFonts w:ascii="Times New Roman" w:hAnsi="Times New Roman" w:eastAsia="Times New Roman" w:cs="Times New Roman"/>
-          <w:color w:val="000000"/>
-          <w:sz w:val="24"/>
-        </w:rPr>
-        <w:t>family/prevalence scope. S2 and S3 diagnose real-data posterior collapse and</w:t>
-      </w:r>
-    </w:p>
-    <w:p>
-      <w:pPr>
-        <w:widowControl/>
-      </w:pPr>
-      <w:r>
-        <w:rPr>
-          <w:rFonts w:ascii="Times New Roman" w:hAnsi="Times New Roman" w:eastAsia="Times New Roman" w:cs="Times New Roman"/>
-          <w:color w:val="000000"/>
-          <w:sz w:val="24"/>
-        </w:rPr>
-        <w:t>assay-specific calibration. Finally, S1, a real-noise ceiling, and a later</w:t>
-      </w:r>
-    </w:p>
-    <w:p>
-      <w:pPr>
-        <w:widowControl/>
-      </w:pPr>
       <w:r>
         <w:rPr>
           <w:rFonts w:ascii="Times New Roman" w:hAnsi="Times New Roman" w:eastAsia="Times New Roman" w:cs="Times New Roman"/>
@@ -942,85 +295,7 @@
           <w:color w:val="000000"/>
           <w:sz w:val="24"/>
         </w:rPr>
-        <w:t>The confirmatory DC and LC programs used five synthetic response families—Ackley,</w:t>
-      </w:r>
-    </w:p>
-    <w:p>
-      <w:pPr>
-        <w:widowControl/>
-      </w:pPr>
-      <w:r>
-        <w:rPr>
-          <w:rFonts w:ascii="Times New Roman" w:hAnsi="Times New Roman" w:eastAsia="Times New Roman" w:cs="Times New Roman"/>
-          <w:color w:val="000000"/>
-          <w:sz w:val="24"/>
-        </w:rPr>
-        <w:t>Hartmann6, biphasic Hill, Levy, and Rosenbrock—32 deterministic seeds per family,</w:t>
-      </w:r>
-    </w:p>
-    <w:p>
-      <w:pPr>
-        <w:widowControl/>
-      </w:pPr>
-      <w:r>
-        <w:rPr>
-          <w:rFonts w:ascii="Times New Roman" w:hAnsi="Times New Roman" w:eastAsia="Times New Roman" w:cs="Times New Roman"/>
-          <w:color w:val="000000"/>
-          <w:sz w:val="24"/>
-        </w:rPr>
-        <w:t>six normalized factors, 48 measured wells, and relative observation noise 0.25.</w:t>
-      </w:r>
-    </w:p>
-    <w:p>
-      <w:pPr>
-        <w:widowControl/>
-      </w:pPr>
-      <w:r>
-        <w:rPr>
-          <w:rFonts w:ascii="Times New Roman" w:hAnsi="Times New Roman" w:eastAsia="Times New Roman" w:cs="Times New Roman"/>
-          <w:color w:val="000000"/>
-          <w:sz w:val="24"/>
-        </w:rPr>
-        <w:t>TAU used 64 seeds per family. Hill varied by registered instance; other evaluators used</w:t>
-      </w:r>
-    </w:p>
-    <w:p>
-      <w:pPr>
-        <w:widowControl/>
-      </w:pPr>
-      <w:r>
-        <w:rPr>
-          <w:rFonts w:ascii="Times New Roman" w:hAnsi="Times New Roman" w:eastAsia="Times New Roman" w:cs="Times New Roman"/>
-          <w:color w:val="000000"/>
-          <w:sz w:val="24"/>
-        </w:rPr>
-        <w:t>fixed landscapes with design and noise varying by seed. Known latent truth was used only</w:t>
-      </w:r>
-    </w:p>
-    <w:p>
-      <w:pPr>
-        <w:widowControl/>
-      </w:pPr>
-      <w:r>
-        <w:rPr>
-          <w:rFonts w:ascii="Times New Roman" w:hAnsi="Times New Roman" w:eastAsia="Times New Roman" w:cs="Times New Roman"/>
-          <w:color w:val="000000"/>
-          <w:sz w:val="24"/>
-        </w:rPr>
-        <w:t>for synthetic scoring. These landscapes are structural test functions, not fits to</w:t>
-      </w:r>
-    </w:p>
-    <w:p>
-      <w:pPr>
-        <w:widowControl/>
-      </w:pPr>
-      <w:r>
-        <w:rPr>
-          <w:rFonts w:ascii="Times New Roman" w:hAnsi="Times New Roman" w:eastAsia="Times New Roman" w:cs="Times New Roman"/>
-          <w:color w:val="000000"/>
-          <w:sz w:val="24"/>
-        </w:rPr>
-        <w:t>endothelial-cell measurements.</w:t>
+        <w:t>The confirmatory DC and LC programs used five synthetic response families—Ackley, Hartmann6, biphasic Hill, Levy, and Rosenbrock—32 deterministic seeds per family, six normalized factors, 48 measured wells, and relative observation noise 0.25. TAU used 64 seeds per family. Hill varied by registered instance; other evaluators used fixed landscapes with design and noise varying by seed. Known latent truth was used only for synthetic scoring. These landscapes are structural test functions, not fits to endothelial-cell measurements.</w:t>
       </w:r>
     </w:p>
     <w:p>
@@ -1153,24 +428,14 @@
           </m:e>
         </m:box>
       </m:oMath>
-    </w:p>
-    <w:p>
-      <w:pPr>
-        <w:widowControl/>
-      </w:pPr>
       <w:r>
         <w:rPr>
           <w:rFonts w:ascii="Times New Roman" w:hAnsi="Times New Roman" w:eastAsia="Times New Roman" w:cs="Times New Roman"/>
           <w:color w:val="000000"/>
           <w:sz w:val="24"/>
         </w:rPr>
-        <w:t>was the instance-specific truth quantile that produced the registered target prevalence</w:t>
+        <w:t xml:space="preserve"> was the instance-specific truth quantile that produced the registered target prevalence </w:t>
       </w:r>
-    </w:p>
-    <w:p>
-      <w:pPr>
-        <w:widowControl/>
-      </w:pPr>
       <m:oMath>
         <m:box>
           <m:e>
@@ -1189,13 +454,8 @@
           <w:color w:val="000000"/>
           <w:sz w:val="24"/>
         </w:rPr>
-        <w:t>. The acceptable region was</w:t>
+        <w:t xml:space="preserve">. The acceptable region was </w:t>
       </w:r>
-    </w:p>
-    <w:p>
-      <w:pPr>
-        <w:widowControl/>
-      </w:pPr>
       <m:oMath>
         <m:box>
           <m:e>
@@ -1292,7 +552,7 @@
           <w:color w:val="000000"/>
           <w:sz w:val="24"/>
         </w:rPr>
-        <w:t>. Thresholds were computed on a 20,000-point Sobol</w:t>
+        <w:t>. Thresholds were computed on a 20,000-point Sobol truth grid with seed 0. A 2,000-point Sobol certificate-candidate and scoring subset at the same seed was used for posterior-region construction and truth-containment scoring. Each certificate used 4,096 joint posterior draws and 64 nested Vorob'ev levels.</w:t>
       </w:r>
     </w:p>
     <w:p>
@@ -1305,98 +565,7 @@
           <w:color w:val="000000"/>
           <w:sz w:val="24"/>
         </w:rPr>
-        <w:t>truth grid with seed 0. A 2,000-point Sobol certificate-candidate and scoring subset</w:t>
-      </w:r>
-    </w:p>
-    <w:p>
-      <w:pPr>
-        <w:widowControl/>
-      </w:pPr>
-      <w:r>
-        <w:rPr>
-          <w:rFonts w:ascii="Times New Roman" w:hAnsi="Times New Roman" w:eastAsia="Times New Roman" w:cs="Times New Roman"/>
-          <w:color w:val="000000"/>
-          <w:sz w:val="24"/>
-        </w:rPr>
-        <w:t>at the same seed was used for posterior-region construction and truth-containment</w:t>
-      </w:r>
-    </w:p>
-    <w:p>
-      <w:pPr>
-        <w:widowControl/>
-      </w:pPr>
-      <w:r>
-        <w:rPr>
-          <w:rFonts w:ascii="Times New Roman" w:hAnsi="Times New Roman" w:eastAsia="Times New Roman" w:cs="Times New Roman"/>
-          <w:color w:val="000000"/>
-          <w:sz w:val="24"/>
-        </w:rPr>
-        <w:t>scoring. Each certificate used 4,096 joint posterior draws and 64 nested Vorob'ev levels.</w:t>
-      </w:r>
-    </w:p>
-    <w:p>
-      <w:pPr>
-        <w:widowControl/>
-      </w:pPr>
-      <w:r>
-        <w:rPr>
-          <w:rFonts w:ascii="Times New Roman" w:hAnsi="Times New Roman" w:eastAsia="Times New Roman" w:cs="Times New Roman"/>
-          <w:color w:val="000000"/>
-          <w:sz w:val="24"/>
-        </w:rPr>
-        <w:t>DC supplied the one-process point comparison (C1) and DoE comparison (C2). LC supplied</w:t>
-      </w:r>
-    </w:p>
-    <w:p>
-      <w:pPr>
-        <w:widowControl/>
-      </w:pPr>
-      <w:r>
-        <w:rPr>
-          <w:rFonts w:ascii="Times New Roman" w:hAnsi="Times New Roman" w:eastAsia="Times New Roman" w:cs="Times New Roman"/>
-          <w:color w:val="000000"/>
-          <w:sz w:val="24"/>
-        </w:rPr>
-        <w:t>the leave-one-family-out matched-round comparison (C3). TAU supplied the prevalence and</w:t>
-      </w:r>
-    </w:p>
-    <w:p>
-      <w:pPr>
-        <w:widowControl/>
-      </w:pPr>
-      <w:r>
-        <w:rPr>
-          <w:rFonts w:ascii="Times New Roman" w:hAnsi="Times New Roman" w:eastAsia="Times New Roman" w:cs="Times New Roman"/>
-          <w:color w:val="000000"/>
-          <w:sz w:val="24"/>
-        </w:rPr>
-        <w:t>margin-to-noise analyses (C5/C6). TT tested the proposed targeting mechanism (S1).</w:t>
-      </w:r>
-    </w:p>
-    <w:p>
-      <w:pPr>
-        <w:widowControl/>
-      </w:pPr>
-      <w:r>
-        <w:rPr>
-          <w:rFonts w:ascii="Times New Roman" w:hAnsi="Times New Roman" w:eastAsia="Times New Roman" w:cs="Times New Roman"/>
-          <w:color w:val="000000"/>
-          <w:sz w:val="24"/>
-        </w:rPr>
-        <w:t>Retrospective in-house and published Hall–Ogle data supplied supporting uncertainty</w:t>
-      </w:r>
-    </w:p>
-    <w:p>
-      <w:pPr>
-        <w:widowControl/>
-      </w:pPr>
-      <w:r>
-        <w:rPr>
-          <w:rFonts w:ascii="Times New Roman" w:hAnsi="Times New Roman" w:eastAsia="Times New Roman" w:cs="Times New Roman"/>
-          <w:color w:val="000000"/>
-          <w:sz w:val="24"/>
-        </w:rPr>
-        <w:t>diagnostics (S2/S3), not prospective validation.</w:t>
+        <w:t>DC supplied the one-process point comparison (C1) and DoE comparison (C2). LC supplied the leave-one-family-out matched-round comparison (C3). TAU supplied the prevalence and margin-to-noise analyses (C5/C6). TT tested the proposed targeting mechanism (S1). Retrospective in-house and published Hall–Ogle data supplied supporting uncertainty diagnostics (S2/S3), not prospective validation.</w:t>
       </w:r>
     </w:p>
     <w:p>
@@ -1437,59 +606,7 @@
           <w:color w:val="000000"/>
           <w:sz w:val="24"/>
         </w:rPr>
-        <w:t>one 48-well campaign. (B) The same sampled campaign supports a point decision</w:t>
-      </w:r>
-    </w:p>
-    <w:p>
-      <w:pPr>
-        <w:widowControl/>
-      </w:pPr>
-      <w:r>
-        <w:rPr>
-          <w:rFonts w:ascii="Times New Roman" w:hAnsi="Times New Roman" w:eastAsia="Times New Roman" w:cs="Times New Roman"/>
-          <w:color w:val="000000"/>
-          <w:sz w:val="24"/>
-        </w:rPr>
-        <w:t>or a region decision, including abstention. (C) The estimand ledger distinguishes</w:t>
-      </w:r>
-    </w:p>
-    <w:p>
-      <w:pPr>
-        <w:widowControl/>
-      </w:pPr>
-      <w:r>
-        <w:rPr>
-          <w:rFonts w:ascii="Times New Roman" w:hAnsi="Times New Roman" w:eastAsia="Times New Roman" w:cs="Times New Roman"/>
-          <w:color w:val="000000"/>
-          <w:sz w:val="24"/>
-        </w:rPr>
-        <w:t>the reported object, observability, score, extra wells, and rounds for each</w:t>
-      </w:r>
-    </w:p>
-    <w:p>
-      <w:pPr>
-        <w:widowControl/>
-      </w:pPr>
-      <w:r>
-        <w:rPr>
-          <w:rFonts w:ascii="Times New Roman" w:hAnsi="Times New Roman" w:eastAsia="Times New Roman" w:cs="Times New Roman"/>
-          <w:color w:val="000000"/>
-          <w:sz w:val="24"/>
-        </w:rPr>
-        <w:t>deliverable. This schematic defines the benchmark and contains no performance</w:t>
-      </w:r>
-    </w:p>
-    <w:p>
-      <w:pPr>
-        <w:widowControl/>
-      </w:pPr>
-      <w:r>
-        <w:rPr>
-          <w:rFonts w:ascii="Times New Roman" w:hAnsi="Times New Roman" w:eastAsia="Times New Roman" w:cs="Times New Roman"/>
-          <w:color w:val="000000"/>
-          <w:sz w:val="24"/>
-        </w:rPr>
-        <w:t>result.</w:t>
+        <w:t>one 48-well campaign. (B) The same sampled campaign supports a point decision or a region decision, including abstention. (C) The estimand ledger distinguishes the reported object, observability, score, extra wells, and rounds for each deliverable. This schematic defines the benchmark and contains no performance result.</w:t>
       </w:r>
     </w:p>
     <w:p>
@@ -1516,13 +633,8 @@
           <w:color w:val="000000"/>
           <w:sz w:val="24"/>
         </w:rPr>
-        <w:t>Observations followed</w:t>
+        <w:t xml:space="preserve">Observations followed </w:t>
       </w:r>
-    </w:p>
-    <w:p>
-      <w:pPr>
-        <w:widowControl/>
-      </w:pPr>
       <m:oMath>
         <m:box>
           <m:e>
@@ -1631,13 +743,8 @@
           <w:color w:val="000000"/>
           <w:sz w:val="24"/>
         </w:rPr>
-        <w:t>, with</w:t>
+        <w:t xml:space="preserve">, with </w:t>
       </w:r>
-    </w:p>
-    <w:p>
-      <w:pPr>
-        <w:widowControl/>
-      </w:pPr>
       <m:oMath>
         <m:box>
           <m:e>
@@ -1723,13 +830,8 @@
           <w:color w:val="000000"/>
           <w:sz w:val="24"/>
         </w:rPr>
-        <w:t>,</w:t>
+        <w:t xml:space="preserve">, </w:t>
       </w:r>
-    </w:p>
-    <w:p>
-      <w:pPr>
-        <w:widowControl/>
-      </w:pPr>
       <m:oMath>
         <m:box>
           <m:e>
@@ -1776,13 +878,8 @@
           <w:color w:val="000000"/>
           <w:sz w:val="24"/>
         </w:rPr>
-        <w:t>, and</w:t>
+        <w:t xml:space="preserve">, and </w:t>
       </w:r>
-    </w:p>
-    <w:p>
-      <w:pPr>
-        <w:widowControl/>
-      </w:pPr>
       <m:oMath>
         <m:box>
           <m:e>
@@ -1856,26 +953,8 @@
           <w:color w:val="000000"/>
           <w:sz w:val="24"/>
         </w:rPr>
-        <w:t>. SPADE and qLogNEI supplied the GP with the</w:t>
+        <w:t xml:space="preserve">. SPADE and qLogNEI supplied the GP with the raw-unit plug-in variance </w:t>
       </w:r>
-    </w:p>
-    <w:p>
-      <w:pPr>
-        <w:widowControl/>
-      </w:pPr>
-      <w:r>
-        <w:rPr>
-          <w:rFonts w:ascii="Times New Roman" w:hAnsi="Times New Roman" w:eastAsia="Times New Roman" w:cs="Times New Roman"/>
-          <w:color w:val="000000"/>
-          <w:sz w:val="24"/>
-        </w:rPr>
-        <w:t>raw-unit plug-in variance</w:t>
-      </w:r>
-    </w:p>
-    <w:p>
-      <w:pPr>
-        <w:widowControl/>
-      </w:pPr>
       <m:oMath>
         <m:box>
           <m:e>
@@ -2002,39 +1081,8 @@
           <w:color w:val="000000"/>
           <w:sz w:val="24"/>
         </w:rPr>
-        <w:t>, computed from the observed</w:t>
+        <w:t xml:space="preserve">, computed from the observed value rather than latent truth. The DoE adapters lacked per-well variances and used their registered arm-constant plug-in </w:t>
       </w:r>
-    </w:p>
-    <w:p>
-      <w:pPr>
-        <w:widowControl/>
-      </w:pPr>
-      <w:r>
-        <w:rPr>
-          <w:rFonts w:ascii="Times New Roman" w:hAnsi="Times New Roman" w:eastAsia="Times New Roman" w:cs="Times New Roman"/>
-          <w:color w:val="000000"/>
-          <w:sz w:val="24"/>
-        </w:rPr>
-        <w:t>value rather than latent truth. The DoE adapters lacked per-well variances and used</w:t>
-      </w:r>
-    </w:p>
-    <w:p>
-      <w:pPr>
-        <w:widowControl/>
-      </w:pPr>
-      <w:r>
-        <w:rPr>
-          <w:rFonts w:ascii="Times New Roman" w:hAnsi="Times New Roman" w:eastAsia="Times New Roman" w:cs="Times New Roman"/>
-          <w:color w:val="000000"/>
-          <w:sz w:val="24"/>
-        </w:rPr>
-        <w:t>their registered arm-constant plug-in</w:t>
-      </w:r>
-    </w:p>
-    <w:p>
-      <w:pPr>
-        <w:widowControl/>
-      </w:pPr>
       <m:oMath>
         <m:box>
           <m:e>
@@ -2153,111 +1201,7 @@
           <w:color w:val="000000"/>
           <w:sz w:val="24"/>
         </w:rPr>
-        <w:t xml:space="preserve"> with explicit unit-box input</w:t>
-      </w:r>
-    </w:p>
-    <w:p>
-      <w:pPr>
-        <w:widowControl/>
-      </w:pPr>
-      <w:r>
-        <w:rPr>
-          <w:rFonts w:ascii="Times New Roman" w:hAnsi="Times New Roman" w:eastAsia="Times New Roman" w:cs="Times New Roman"/>
-          <w:color w:val="000000"/>
-          <w:sz w:val="24"/>
-        </w:rPr>
-        <w:t>normalization, standardized outcomes, a fitted constant mean, and a scaled Matérn-5/2</w:t>
-      </w:r>
-    </w:p>
-    <w:p>
-      <w:pPr>
-        <w:widowControl/>
-      </w:pPr>
-      <w:r>
-        <w:rPr>
-          <w:rFonts w:ascii="Times New Roman" w:hAnsi="Times New Roman" w:eastAsia="Times New Roman" w:cs="Times New Roman"/>
-          <w:color w:val="000000"/>
-          <w:sz w:val="24"/>
-        </w:rPr>
-        <w:t>kernel with automatic relevance determination and a dimension-scaled length-scale</w:t>
-      </w:r>
-    </w:p>
-    <w:p>
-      <w:pPr>
-        <w:widowControl/>
-      </w:pPr>
-      <w:r>
-        <w:rPr>
-          <w:rFonts w:ascii="Times New Roman" w:hAnsi="Times New Roman" w:eastAsia="Times New Roman" w:cs="Times New Roman"/>
-          <w:color w:val="000000"/>
-          <w:sz w:val="24"/>
-        </w:rPr>
-        <w:t>prior. Hyperparameters were fitted by exact marginal likelihood. SPADE began with the</w:t>
-      </w:r>
-    </w:p>
-    <w:p>
-      <w:pPr>
-        <w:widowControl/>
-      </w:pPr>
-      <w:r>
-        <w:rPr>
-          <w:rFonts w:ascii="Times New Roman" w:hAnsi="Times New Roman" w:eastAsia="Times New Roman" w:cs="Times New Roman"/>
-          <w:color w:val="000000"/>
-          <w:sz w:val="24"/>
-        </w:rPr>
-        <w:t>Sobol space-filling opening, refitted after every later batch, and used its registered</w:t>
-      </w:r>
-    </w:p>
-    <w:p>
-      <w:pPr>
-        <w:widowControl/>
-      </w:pPr>
-      <w:r>
-        <w:rPr>
-          <w:rFonts w:ascii="Times New Roman" w:hAnsi="Times New Roman" w:eastAsia="Times New Roman" w:cs="Times New Roman"/>
-          <w:color w:val="000000"/>
-          <w:sz w:val="24"/>
-        </w:rPr>
-        <w:t>conservative-set straddle implementation for adaptive high-response sampling. The</w:t>
-      </w:r>
-    </w:p>
-    <w:p>
-      <w:pPr>
-        <w:widowControl/>
-      </w:pPr>
-      <w:r>
-        <w:rPr>
-          <w:rFonts w:ascii="Times New Roman" w:hAnsi="Times New Roman" w:eastAsia="Times New Roman" w:cs="Times New Roman"/>
-          <w:color w:val="000000"/>
-          <w:sz w:val="24"/>
-        </w:rPr>
-        <w:t>implemented historical acquisition is retained because the target-aligned replacement</w:t>
-      </w:r>
-    </w:p>
-    <w:p>
-      <w:pPr>
-        <w:widowControl/>
-      </w:pPr>
-      <w:r>
-        <w:rPr>
-          <w:rFonts w:ascii="Times New Roman" w:hAnsi="Times New Roman" w:eastAsia="Times New Roman" w:cs="Times New Roman"/>
-          <w:color w:val="000000"/>
-          <w:sz w:val="24"/>
-        </w:rPr>
-        <w:t>did not demonstrate improvement or earn adoption and worsened regret; no claim here</w:t>
-      </w:r>
-    </w:p>
-    <w:p>
-      <w:pPr>
-        <w:widowControl/>
-      </w:pPr>
-      <w:r>
-        <w:rPr>
-          <w:rFonts w:ascii="Times New Roman" w:hAnsi="Times New Roman" w:eastAsia="Times New Roman" w:cs="Times New Roman"/>
-          <w:color w:val="000000"/>
-          <w:sz w:val="24"/>
-        </w:rPr>
-        <w:t>attributes the results to successful threshold targeting.</w:t>
+        <w:t xml:space="preserve"> with explicit unit-box input normalization, standardized outcomes, a fitted constant mean, and a scaled Matérn-5/2 kernel with automatic relevance determination and a dimension-scaled length-scale prior. Hyperparameters were fitted by exact marginal likelihood. SPADE began with the Sobol space-filling opening, refitted after every later batch, and used its registered conservative-set straddle implementation for adaptive high-response sampling. The implemented historical acquisition is retained because the target-aligned replacement did not demonstrate improvement or earn adoption and worsened regret; no claim here attributes the results to successful threshold targeting.</w:t>
       </w:r>
     </w:p>
     <w:p>
@@ -2290,13 +1234,8 @@
           <w:color w:val="000000"/>
           <w:sz w:val="24"/>
         </w:rPr>
-        <w:t>, the finite-grid excursion set was</w:t>
+        <w:t xml:space="preserve">, the finite-grid excursion set was </w:t>
       </w:r>
-    </w:p>
-    <w:p>
-      <w:pPr>
-        <w:widowControl/>
-      </w:pPr>
       <m:oMath>
         <m:box>
           <m:e>
@@ -2445,33 +1384,7 @@
           <w:color w:val="000000"/>
           <w:sz w:val="24"/>
         </w:rPr>
-        <w:t xml:space="preserve"> on the 2,000-point scoring grid.</w:t>
-      </w:r>
-    </w:p>
-    <w:p>
-      <w:pPr>
-        <w:widowControl/>
-      </w:pPr>
-      <w:r>
-        <w:rPr>
-          <w:rFonts w:ascii="Times New Roman" w:hAnsi="Times New Roman" w:eastAsia="Times New Roman" w:cs="Times New Roman"/>
-          <w:color w:val="000000"/>
-          <w:sz w:val="24"/>
-        </w:rPr>
-        <w:t>The 4,096 draws formed a coverage function and 64 nested Vorob'ev candidates. For each</w:t>
-      </w:r>
-    </w:p>
-    <w:p>
-      <w:pPr>
-        <w:widowControl/>
-      </w:pPr>
-      <w:r>
-        <w:rPr>
-          <w:rFonts w:ascii="Times New Roman" w:hAnsi="Times New Roman" w:eastAsia="Times New Roman" w:cs="Times New Roman"/>
-          <w:color w:val="000000"/>
-          <w:sz w:val="24"/>
-        </w:rPr>
-        <w:t xml:space="preserve">inflation </w:t>
+        <w:t xml:space="preserve"> on the 2,000-point scoring grid. The 4,096 draws formed a coverage function and 64 nested Vorob'ev candidates. For each inflation </w:t>
       </w:r>
       <m:oMath>
         <m:box>
@@ -2551,7 +1464,7 @@
           <w:color w:val="000000"/>
           <w:sz w:val="24"/>
         </w:rPr>
-        <w:t>, the common downstream estimator returned the</w:t>
+        <w:t>, the common downstream estimator returned the largest scanned candidate whose same-draw Monte Carlo posterior joint containment reached alpha=0.95. “Largest” means largest in that finite nested family, not a global optimum over all continuous subsets. If no non-empty candidate passed, the procedure abstained.</w:t>
       </w:r>
     </w:p>
     <w:p>
@@ -2564,137 +1477,7 @@
           <w:color w:val="000000"/>
           <w:sz w:val="24"/>
         </w:rPr>
-        <w:t>largest scanned candidate whose same-draw Monte Carlo posterior joint containment</w:t>
-      </w:r>
-    </w:p>
-    <w:p>
-      <w:pPr>
-        <w:widowControl/>
-      </w:pPr>
-      <w:r>
-        <w:rPr>
-          <w:rFonts w:ascii="Times New Roman" w:hAnsi="Times New Roman" w:eastAsia="Times New Roman" w:cs="Times New Roman"/>
-          <w:color w:val="000000"/>
-          <w:sz w:val="24"/>
-        </w:rPr>
-        <w:t>reached alpha=0.95. “Largest” means largest in that finite nested family, not a</w:t>
-      </w:r>
-    </w:p>
-    <w:p>
-      <w:pPr>
-        <w:widowControl/>
-      </w:pPr>
-      <w:r>
-        <w:rPr>
-          <w:rFonts w:ascii="Times New Roman" w:hAnsi="Times New Roman" w:eastAsia="Times New Roman" w:cs="Times New Roman"/>
-          <w:color w:val="000000"/>
-          <w:sz w:val="24"/>
-        </w:rPr>
-        <w:t>global optimum over all continuous subsets. If no non-empty candidate passed, the</w:t>
-      </w:r>
-    </w:p>
-    <w:p>
-      <w:pPr>
-        <w:widowControl/>
-      </w:pPr>
-      <w:r>
-        <w:rPr>
-          <w:rFonts w:ascii="Times New Roman" w:hAnsi="Times New Roman" w:eastAsia="Times New Roman" w:cs="Times New Roman"/>
-          <w:color w:val="000000"/>
-          <w:sz w:val="24"/>
-        </w:rPr>
-        <w:t>procedure abstained.</w:t>
-      </w:r>
-    </w:p>
-    <w:p>
-      <w:pPr>
-        <w:widowControl/>
-      </w:pPr>
-      <w:r>
-        <w:rPr>
-          <w:rFonts w:ascii="Times New Roman" w:hAnsi="Times New Roman" w:eastAsia="Times New Roman" w:cs="Times New Roman"/>
-          <w:color w:val="000000"/>
-          <w:sz w:val="24"/>
-        </w:rPr>
-        <w:t>qLogNEI used the same GP outcome model and well budget while allocating batches by</w:t>
-      </w:r>
-    </w:p>
-    <w:p>
-      <w:pPr>
-        <w:widowControl/>
-      </w:pPr>
-      <w:r>
-        <w:rPr>
-          <w:rFonts w:ascii="Times New Roman" w:hAnsi="Times New Roman" w:eastAsia="Times New Roman" w:cs="Times New Roman"/>
-          <w:color w:val="000000"/>
-          <w:sz w:val="24"/>
-        </w:rPr>
-        <w:t>noisy expected improvement. Its observations were passed through the common posterior</w:t>
-      </w:r>
-    </w:p>
-    <w:p>
-      <w:pPr>
-        <w:widowControl/>
-      </w:pPr>
-      <w:r>
-        <w:rPr>
-          <w:rFonts w:ascii="Times New Roman" w:hAnsi="Times New Roman" w:eastAsia="Times New Roman" w:cs="Times New Roman"/>
-          <w:color w:val="000000"/>
-          <w:sz w:val="24"/>
-        </w:rPr>
-        <w:t>conservative-set estimator; regional certificates are therefore common post-processing,</w:t>
-      </w:r>
-    </w:p>
-    <w:p>
-      <w:pPr>
-        <w:widowControl/>
-      </w:pPr>
-      <w:r>
-        <w:rPr>
-          <w:rFonts w:ascii="Times New Roman" w:hAnsi="Times New Roman" w:eastAsia="Times New Roman" w:cs="Times New Roman"/>
-          <w:color w:val="000000"/>
-          <w:sz w:val="24"/>
-        </w:rPr>
-        <w:t>not an intrinsic qLogNEI output. Screened DoE used a 20-run six-factor screen, a 27-run</w:t>
-      </w:r>
-    </w:p>
-    <w:p>
-      <w:pPr>
-        <w:widowControl/>
-      </w:pPr>
-      <w:r>
-        <w:rPr>
-          <w:rFonts w:ascii="Times New Roman" w:hAnsi="Times New Roman" w:eastAsia="Times New Roman" w:cs="Times New Roman"/>
-          <w:color w:val="000000"/>
-          <w:sz w:val="24"/>
-        </w:rPr>
-        <w:t>face-centred response-surface design in four factors, and one confirmation well. The</w:t>
-      </w:r>
-    </w:p>
-    <w:p>
-      <w:pPr>
-        <w:widowControl/>
-      </w:pPr>
-      <w:r>
-        <w:rPr>
-          <w:rFonts w:ascii="Times New Roman" w:hAnsi="Times New Roman" w:eastAsia="Times New Roman" w:cs="Times New Roman"/>
-          <w:color w:val="000000"/>
-          <w:sz w:val="24"/>
-        </w:rPr>
-        <w:t>unscreened arm retained the low-order workflow without screening. These implementations</w:t>
-      </w:r>
-    </w:p>
-    <w:p>
-      <w:pPr>
-        <w:widowControl/>
-      </w:pPr>
-      <w:r>
-        <w:rPr>
-          <w:rFonts w:ascii="Times New Roman" w:hAnsi="Times New Roman" w:eastAsia="Times New Roman" w:cs="Times New Roman"/>
-          <w:color w:val="000000"/>
-          <w:sz w:val="24"/>
-        </w:rPr>
-        <w:t>do not represent all BO or classical-design methods.</w:t>
+        <w:t>qLogNEI used the same GP outcome model and well budget while allocating batches by noisy expected improvement. Its observations were passed through the common posterior conservative-set estimator; regional certificates are therefore common post-processing, not an intrinsic qLogNEI output. Screened DoE used a 20-run six-factor screen, a 27-run face-centred response-surface design in four factors, and one confirmation well. The unscreened arm retained the low-order workflow without screening. These implementations do not represent all BO or classical-design methods.</w:t>
       </w:r>
     </w:p>
     <w:p>
@@ -2721,33 +1504,7 @@
           <w:color w:val="000000"/>
           <w:sz w:val="24"/>
         </w:rPr>
-        <w:t>The terminal point recommendation was the visited condition with the largest observed</w:t>
-      </w:r>
-    </w:p>
-    <w:p>
-      <w:pPr>
-        <w:widowControl/>
-      </w:pPr>
-      <w:r>
-        <w:rPr>
-          <w:rFonts w:ascii="Times New Roman" w:hAnsi="Times New Roman" w:eastAsia="Times New Roman" w:cs="Times New Roman"/>
-          <w:color w:val="000000"/>
-          <w:sz w:val="24"/>
-        </w:rPr>
-        <w:t>response; it was then scored by latent truth. Because each family was normalized to</w:t>
-      </w:r>
-    </w:p>
-    <w:p>
-      <w:pPr>
-        <w:widowControl/>
-      </w:pPr>
-      <w:r>
-        <w:rPr>
-          <w:rFonts w:ascii="Times New Roman" w:hAnsi="Times New Roman" w:eastAsia="Times New Roman" w:cs="Times New Roman"/>
-          <w:color w:val="000000"/>
-          <w:sz w:val="24"/>
-        </w:rPr>
-        <w:t xml:space="preserve">optimum one, simple regret was </w:t>
+        <w:t xml:space="preserve">The terminal point recommendation was the visited condition with the largest observed response; it was then scored by latent truth. Because each family was normalized to optimum one, simple regret was </w:t>
       </w:r>
       <m:oMath>
         <m:box>
@@ -2809,7 +1566,7 @@
           <w:color w:val="000000"/>
           <w:sz w:val="24"/>
         </w:rPr>
-        <w:t>. This prevents crediting a method</w:t>
+        <w:t>. This prevents crediting a method for visiting a strong point that its noisy observations did not identify.</w:t>
       </w:r>
     </w:p>
     <w:p>
@@ -2822,7 +1579,7 @@
           <w:color w:val="000000"/>
           <w:sz w:val="24"/>
         </w:rPr>
-        <w:t>for visiting a strong point that its noisy observations did not identify.</w:t>
+        <w:t>A regional answered outcome was a non-empty returned conservative set. contained recorded whether an answered set was a subset of the known synthetic acceptable region; answer rate was answered divided by eligible cells, conditional empirical containment was contained divided by answered, and certified volume was the returned fraction of the 2,000-point scoring grid. Abstention was not counted as containment. The registered cross-cell gate required a one-sided 95% Clopper–Pearson lower bound of at least 0.90 among answered cells and answer rate of at least 0.05.</w:t>
       </w:r>
     </w:p>
     <w:p>
@@ -2835,7 +1592,7 @@
           <w:color w:val="000000"/>
           <w:sz w:val="24"/>
         </w:rPr>
-        <w:t>A regional answered outcome was a non-empty returned conservative set. contained</w:t>
+        <w:t>C3 selected the smallest posterior inflation c that passed the registered rule on four families and evaluated volume on the held-out fifth family. It pooled prevalence 0.30 and 0.10, yielding five families x 32 seeds x two prevalences = 320 dependent family-seed-prevalence cells. C2 used a weaker procedure: SPADE selected c=1 within the DC cells themselves. Neither DoE arm passed at any tested inflation, so its reported counts are fallback diagnostics at baseline c=1. C2 is within-sample and not transportable; it is not the held-out-family calibration used for C3.</w:t>
       </w:r>
     </w:p>
     <w:p>
@@ -2848,228 +1605,7 @@
           <w:color w:val="000000"/>
           <w:sz w:val="24"/>
         </w:rPr>
-        <w:t>recorded whether an answered set was a subset of the known synthetic acceptable region;</w:t>
-      </w:r>
-    </w:p>
-    <w:p>
-      <w:pPr>
-        <w:widowControl/>
-      </w:pPr>
-      <w:r>
-        <w:rPr>
-          <w:rFonts w:ascii="Times New Roman" w:hAnsi="Times New Roman" w:eastAsia="Times New Roman" w:cs="Times New Roman"/>
-          <w:color w:val="000000"/>
-          <w:sz w:val="24"/>
-        </w:rPr>
-        <w:t>answer rate was answered divided by eligible cells, conditional empirical containment</w:t>
-      </w:r>
-    </w:p>
-    <w:p>
-      <w:pPr>
-        <w:widowControl/>
-      </w:pPr>
-      <w:r>
-        <w:rPr>
-          <w:rFonts w:ascii="Times New Roman" w:hAnsi="Times New Roman" w:eastAsia="Times New Roman" w:cs="Times New Roman"/>
-          <w:color w:val="000000"/>
-          <w:sz w:val="24"/>
-        </w:rPr>
-        <w:t>was contained divided by answered, and certified volume was the returned fraction of</w:t>
-      </w:r>
-    </w:p>
-    <w:p>
-      <w:pPr>
-        <w:widowControl/>
-      </w:pPr>
-      <w:r>
-        <w:rPr>
-          <w:rFonts w:ascii="Times New Roman" w:hAnsi="Times New Roman" w:eastAsia="Times New Roman" w:cs="Times New Roman"/>
-          <w:color w:val="000000"/>
-          <w:sz w:val="24"/>
-        </w:rPr>
-        <w:t>the 2,000-point scoring grid. Abstention was not counted as containment. The registered</w:t>
-      </w:r>
-    </w:p>
-    <w:p>
-      <w:pPr>
-        <w:widowControl/>
-      </w:pPr>
-      <w:r>
-        <w:rPr>
-          <w:rFonts w:ascii="Times New Roman" w:hAnsi="Times New Roman" w:eastAsia="Times New Roman" w:cs="Times New Roman"/>
-          <w:color w:val="000000"/>
-          <w:sz w:val="24"/>
-        </w:rPr>
-        <w:t>cross-cell gate required a one-sided 95% Clopper–Pearson lower bound of at least 0.90</w:t>
-      </w:r>
-    </w:p>
-    <w:p>
-      <w:pPr>
-        <w:widowControl/>
-      </w:pPr>
-      <w:r>
-        <w:rPr>
-          <w:rFonts w:ascii="Times New Roman" w:hAnsi="Times New Roman" w:eastAsia="Times New Roman" w:cs="Times New Roman"/>
-          <w:color w:val="000000"/>
-          <w:sz w:val="24"/>
-        </w:rPr>
-        <w:t>among answered cells and answer rate of at least 0.05.</w:t>
-      </w:r>
-    </w:p>
-    <w:p>
-      <w:pPr>
-        <w:widowControl/>
-      </w:pPr>
-      <w:r>
-        <w:rPr>
-          <w:rFonts w:ascii="Times New Roman" w:hAnsi="Times New Roman" w:eastAsia="Times New Roman" w:cs="Times New Roman"/>
-          <w:color w:val="000000"/>
-          <w:sz w:val="24"/>
-        </w:rPr>
-        <w:t>C3 selected the smallest posterior inflation c that passed the registered rule on</w:t>
-      </w:r>
-    </w:p>
-    <w:p>
-      <w:pPr>
-        <w:widowControl/>
-      </w:pPr>
-      <w:r>
-        <w:rPr>
-          <w:rFonts w:ascii="Times New Roman" w:hAnsi="Times New Roman" w:eastAsia="Times New Roman" w:cs="Times New Roman"/>
-          <w:color w:val="000000"/>
-          <w:sz w:val="24"/>
-        </w:rPr>
-        <w:t>four families and evaluated volume on the held-out fifth family. It pooled prevalence</w:t>
-      </w:r>
-    </w:p>
-    <w:p>
-      <w:pPr>
-        <w:widowControl/>
-      </w:pPr>
-      <w:r>
-        <w:rPr>
-          <w:rFonts w:ascii="Times New Roman" w:hAnsi="Times New Roman" w:eastAsia="Times New Roman" w:cs="Times New Roman"/>
-          <w:color w:val="000000"/>
-          <w:sz w:val="24"/>
-        </w:rPr>
-        <w:t>0.30 and 0.10, yielding five families x 32 seeds x two prevalences = 320 dependent</w:t>
-      </w:r>
-    </w:p>
-    <w:p>
-      <w:pPr>
-        <w:widowControl/>
-      </w:pPr>
-      <w:r>
-        <w:rPr>
-          <w:rFonts w:ascii="Times New Roman" w:hAnsi="Times New Roman" w:eastAsia="Times New Roman" w:cs="Times New Roman"/>
-          <w:color w:val="000000"/>
-          <w:sz w:val="24"/>
-        </w:rPr>
-        <w:t>family-seed-prevalence cells. C2 used a weaker procedure: SPADE selected c=1 within</w:t>
-      </w:r>
-    </w:p>
-    <w:p>
-      <w:pPr>
-        <w:widowControl/>
-      </w:pPr>
-      <w:r>
-        <w:rPr>
-          <w:rFonts w:ascii="Times New Roman" w:hAnsi="Times New Roman" w:eastAsia="Times New Roman" w:cs="Times New Roman"/>
-          <w:color w:val="000000"/>
-          <w:sz w:val="24"/>
-        </w:rPr>
-        <w:t>the DC cells themselves. Neither DoE arm passed at any tested inflation, so its reported</w:t>
-      </w:r>
-    </w:p>
-    <w:p>
-      <w:pPr>
-        <w:widowControl/>
-      </w:pPr>
-      <w:r>
-        <w:rPr>
-          <w:rFonts w:ascii="Times New Roman" w:hAnsi="Times New Roman" w:eastAsia="Times New Roman" w:cs="Times New Roman"/>
-          <w:color w:val="000000"/>
-          <w:sz w:val="24"/>
-        </w:rPr>
-        <w:t>counts are fallback diagnostics at baseline c=1. C2 is within-sample and not</w:t>
-      </w:r>
-    </w:p>
-    <w:p>
-      <w:pPr>
-        <w:widowControl/>
-      </w:pPr>
-      <w:r>
-        <w:rPr>
-          <w:rFonts w:ascii="Times New Roman" w:hAnsi="Times New Roman" w:eastAsia="Times New Roman" w:cs="Times New Roman"/>
-          <w:color w:val="000000"/>
-          <w:sz w:val="24"/>
-        </w:rPr>
-        <w:t>transportable; it is not the held-out-family calibration used for C3.</w:t>
-      </w:r>
-    </w:p>
-    <w:p>
-      <w:pPr>
-        <w:widowControl/>
-      </w:pPr>
-      <w:r>
-        <w:rPr>
-          <w:rFonts w:ascii="Times New Roman" w:hAnsi="Times New Roman" w:eastAsia="Times New Roman" w:cs="Times New Roman"/>
-          <w:color w:val="000000"/>
-          <w:sz w:val="24"/>
-        </w:rPr>
-        <w:t>Earlier prospective map scoring used a fixed 0.50 cutoff. Its archived certificate</w:t>
-      </w:r>
-    </w:p>
-    <w:p>
-      <w:pPr>
-        <w:widowControl/>
-      </w:pPr>
-      <w:r>
-        <w:rPr>
-          <w:rFonts w:ascii="Times New Roman" w:hAnsi="Times New Roman" w:eastAsia="Times New Roman" w:cs="Times New Roman"/>
-          <w:color w:val="000000"/>
-          <w:sz w:val="24"/>
-        </w:rPr>
-        <w:t>count is a posterior self-consistency check, not empirical containment against the oracle.</w:t>
-      </w:r>
-    </w:p>
-    <w:p>
-      <w:pPr>
-        <w:widowControl/>
-      </w:pPr>
-      <w:r>
-        <w:rPr>
-          <w:rFonts w:ascii="Times New Roman" w:hAnsi="Times New Roman" w:eastAsia="Times New Roman" w:cs="Times New Roman"/>
-          <w:color w:val="000000"/>
-          <w:sz w:val="24"/>
-        </w:rPr>
-        <w:t>The retrospective terminal-rule comparison also used a common GP for all arms:</w:t>
-      </w:r>
-    </w:p>
-    <w:p>
-      <w:pPr>
-        <w:widowControl/>
-      </w:pPr>
-      <w:r>
-        <w:rPr>
-          <w:rFonts w:ascii="Times New Roman" w:hAnsi="Times New Roman" w:eastAsia="Times New Roman" w:cs="Times New Roman"/>
-          <w:color w:val="000000"/>
-          <w:sz w:val="24"/>
-        </w:rPr>
-        <w:t>a 20,000-point screen, twenty restarts and 4,096 raw starts. Earlier quadratic</w:t>
-      </w:r>
-    </w:p>
-    <w:p>
-      <w:pPr>
-        <w:widowControl/>
-      </w:pPr>
-      <w:r>
-        <w:rPr>
-          <w:rFonts w:ascii="Times New Roman" w:hAnsi="Times New Roman" w:eastAsia="Times New Roman" w:cs="Times New Roman"/>
-          <w:color w:val="000000"/>
-          <w:sz w:val="24"/>
-        </w:rPr>
-        <w:t>response-surface diagnostics are separate and are not substituted for that recommender.</w:t>
+        <w:t>Earlier prospective map scoring used a fixed 0.50 cutoff. Its archived certificate count is a posterior self-consistency check, not empirical containment against the oracle. The retrospective terminal-rule comparison also used a common GP for all arms: a 20,000-point screen, twenty restarts and 4,096 raw starts. Earlier quadratic response-surface diagnostics are separate and are not substituted for that recommender.</w:t>
       </w:r>
     </w:p>
     <w:p>
@@ -3096,7 +1632,7 @@
           <w:color w:val="000000"/>
           <w:sz w:val="24"/>
         </w:rPr>
-        <w:t>Contrasts were paired by family and seed or by family, seed, and prevalence. Frozen</w:t>
+        <w:t>Contrasts were paired by family and seed or by family, seed, and prevalence. Frozen analysers used 8,000 ordinary nonparametric resamples of flat contrast rows, percentile intervals, and two-sided bootstrap tail-area proportions relative to zero. The flat-cell bootstrap treats cells as exchangeable. Because rows can share families, landscapes, seeds, prevalences, and campaigns, its intervals are conditional descriptive summaries and may be too narrow under dependence; cells are not independent campaigns. Pooled Clopper–Pearson bounds similarly assume an ordinary binomial model.</w:t>
       </w:r>
     </w:p>
     <w:p>
@@ -3109,124 +1645,7 @@
           <w:color w:val="000000"/>
           <w:sz w:val="24"/>
         </w:rPr>
-        <w:t>analysers used 8,000 ordinary nonparametric resamples of flat contrast rows, percentile</w:t>
-      </w:r>
-    </w:p>
-    <w:p>
-      <w:pPr>
-        <w:widowControl/>
-      </w:pPr>
-      <w:r>
-        <w:rPr>
-          <w:rFonts w:ascii="Times New Roman" w:hAnsi="Times New Roman" w:eastAsia="Times New Roman" w:cs="Times New Roman"/>
-          <w:color w:val="000000"/>
-          <w:sz w:val="24"/>
-        </w:rPr>
-        <w:t>intervals, and two-sided bootstrap tail-area proportions relative to zero. The</w:t>
-      </w:r>
-    </w:p>
-    <w:p>
-      <w:pPr>
-        <w:widowControl/>
-      </w:pPr>
-      <w:r>
-        <w:rPr>
-          <w:rFonts w:ascii="Times New Roman" w:hAnsi="Times New Roman" w:eastAsia="Times New Roman" w:cs="Times New Roman"/>
-          <w:color w:val="000000"/>
-          <w:sz w:val="24"/>
-        </w:rPr>
-        <w:t>flat-cell bootstrap treats cells as exchangeable. Because rows can share families,</w:t>
-      </w:r>
-    </w:p>
-    <w:p>
-      <w:pPr>
-        <w:widowControl/>
-      </w:pPr>
-      <w:r>
-        <w:rPr>
-          <w:rFonts w:ascii="Times New Roman" w:hAnsi="Times New Roman" w:eastAsia="Times New Roman" w:cs="Times New Roman"/>
-          <w:color w:val="000000"/>
-          <w:sz w:val="24"/>
-        </w:rPr>
-        <w:t>landscapes, seeds, prevalences, and campaigns, its intervals are conditional descriptive</w:t>
-      </w:r>
-    </w:p>
-    <w:p>
-      <w:pPr>
-        <w:widowControl/>
-      </w:pPr>
-      <w:r>
-        <w:rPr>
-          <w:rFonts w:ascii="Times New Roman" w:hAnsi="Times New Roman" w:eastAsia="Times New Roman" w:cs="Times New Roman"/>
-          <w:color w:val="000000"/>
-          <w:sz w:val="24"/>
-        </w:rPr>
-        <w:t>summaries and may be too narrow under dependence; cells are not independent campaigns.</w:t>
-      </w:r>
-    </w:p>
-    <w:p>
-      <w:pPr>
-        <w:widowControl/>
-      </w:pPr>
-      <w:r>
-        <w:rPr>
-          <w:rFonts w:ascii="Times New Roman" w:hAnsi="Times New Roman" w:eastAsia="Times New Roman" w:cs="Times New Roman"/>
-          <w:color w:val="000000"/>
-          <w:sz w:val="24"/>
-        </w:rPr>
-        <w:t>Pooled Clopper–Pearson bounds similarly assume an ordinary binomial model.</w:t>
-      </w:r>
-    </w:p>
-    <w:p>
-      <w:pPr>
-        <w:widowControl/>
-      </w:pPr>
-      <w:r>
-        <w:rPr>
-          <w:rFonts w:ascii="Times New Roman" w:hAnsi="Times New Roman" w:eastAsia="Times New Roman" w:cs="Times New Roman"/>
-          <w:color w:val="000000"/>
-          <w:sz w:val="24"/>
-        </w:rPr>
-        <w:t>The regret smallest effect of interest was 0.02. An interval extending beyond that</w:t>
-      </w:r>
-    </w:p>
-    <w:p>
-      <w:pPr>
-        <w:widowControl/>
-      </w:pPr>
-      <w:r>
-        <w:rPr>
-          <w:rFonts w:ascii="Times New Roman" w:hAnsi="Times New Roman" w:eastAsia="Times New Roman" w:cs="Times New Roman"/>
-          <w:color w:val="000000"/>
-          <w:sz w:val="24"/>
-        </w:rPr>
-        <w:t>boundary was not interpreted as equivalence. The C5 Spearman coefficient is descriptive</w:t>
-      </w:r>
-    </w:p>
-    <w:p>
-      <w:pPr>
-        <w:widowControl/>
-      </w:pPr>
-      <w:r>
-        <w:rPr>
-          <w:rFonts w:ascii="Times New Roman" w:hAnsi="Times New Roman" w:eastAsia="Times New Roman" w:cs="Times New Roman"/>
-          <w:color w:val="000000"/>
-          <w:sz w:val="24"/>
-        </w:rPr>
-        <w:t>over 25 nested, nonexchangeable family-prevalence cells; no naive independence-based</w:t>
-      </w:r>
-    </w:p>
-    <w:p>
-      <w:pPr>
-        <w:widowControl/>
-      </w:pPr>
-      <w:r>
-        <w:rPr>
-          <w:rFonts w:ascii="Times New Roman" w:hAnsi="Times New Roman" w:eastAsia="Times New Roman" w:cs="Times New Roman"/>
-          <w:color w:val="000000"/>
-          <w:sz w:val="24"/>
-        </w:rPr>
-        <w:t>p-value is interpreted.</w:t>
+        <w:t>The regret smallest effect of interest was 0.02. An interval extending beyond that boundary was not interpreted as equivalence. The C5 Spearman coefficient is descriptive over 25 nested, nonexchangeable family-prevalence cells; no naive independence-based p-value is interpreted.</w:t>
       </w:r>
     </w:p>
     <w:p>
@@ -3253,33 +1672,7 @@
           <w:color w:val="000000"/>
           <w:sz w:val="24"/>
         </w:rPr>
-        <w:t>Analyses used Python 3.11 with PyTorch, GPyTorch, BoTorch, NumPy, SciPy, pandas, and</w:t>
-      </w:r>
-    </w:p>
-    <w:p>
-      <w:pPr>
-        <w:widowControl/>
-      </w:pPr>
-      <w:r>
-        <w:rPr>
-          <w:rFonts w:ascii="Times New Roman" w:hAnsi="Times New Roman" w:eastAsia="Times New Roman" w:cs="Times New Roman"/>
-          <w:color w:val="000000"/>
-          <w:sz w:val="24"/>
-        </w:rPr>
-        <w:t>scikit-learn. Frozen inputs, producing commands, exact estimates, guard coverage, and</w:t>
-      </w:r>
-    </w:p>
-    <w:p>
-      <w:pPr>
-        <w:widowControl/>
-      </w:pPr>
-      <w:r>
-        <w:rPr>
-          <w:rFonts w:ascii="Times New Roman" w:hAnsi="Times New Roman" w:eastAsia="Times New Roman" w:cs="Times New Roman"/>
-          <w:color w:val="000000"/>
-          <w:sz w:val="24"/>
-        </w:rPr>
-        <w:t xml:space="preserve">limitations are indexed in </w:t>
+        <w:t xml:space="preserve">Analyses used Python 3.11 with PyTorch, GPyTorch, BoTorch, NumPy, SciPy, pandas, and scikit-learn. Frozen inputs, producing commands, exact estimates, guard coverage, and limitations are indexed in </w:t>
       </w:r>
       <w:r>
         <w:rPr>
@@ -3295,33 +1688,7 @@
           <w:color w:val="000000"/>
           <w:sz w:val="24"/>
         </w:rPr>
-        <w:t>. The active PLOS source</w:t>
-      </w:r>
-    </w:p>
-    <w:p>
-      <w:pPr>
-        <w:widowControl/>
-      </w:pPr>
-      <w:r>
-        <w:rPr>
-          <w:rFonts w:ascii="Times New Roman" w:hAnsi="Times New Roman" w:eastAsia="Times New Roman" w:cs="Times New Roman"/>
-          <w:color w:val="000000"/>
-          <w:sz w:val="24"/>
-        </w:rPr>
-        <w:t>remains in this repository. Consolidated C1–C6/S1 provenance is pinned to repository</w:t>
-      </w:r>
-    </w:p>
-    <w:p>
-      <w:pPr>
-        <w:widowControl/>
-      </w:pPr>
-      <w:r>
-        <w:rPr>
-          <w:rFonts w:ascii="Times New Roman" w:hAnsi="Times New Roman" w:eastAsia="Times New Roman" w:cs="Times New Roman"/>
-          <w:color w:val="000000"/>
-          <w:sz w:val="24"/>
-        </w:rPr>
-        <w:t xml:space="preserve">commit </w:t>
+        <w:t xml:space="preserve">. The active PLOS source remains in this repository. Consolidated C1–C6/S1 provenance is pinned to repository commit </w:t>
       </w:r>
       <w:r>
         <w:rPr>
@@ -3355,20 +1722,7 @@
           <w:color w:val="000000"/>
           <w:sz w:val="24"/>
         </w:rPr>
-        <w:t xml:space="preserve"> and detached-worktree</w:t>
-      </w:r>
-    </w:p>
-    <w:p>
-      <w:pPr>
-        <w:widowControl/>
-      </w:pPr>
-      <w:r>
-        <w:rPr>
-          <w:rFonts w:ascii="Times New Roman" w:hAnsi="Times New Roman" w:eastAsia="Times New Roman" w:cs="Times New Roman"/>
-          <w:color w:val="000000"/>
-          <w:sz w:val="24"/>
-        </w:rPr>
-        <w:t>instructions. No frozen result was changed for this rewrite.</w:t>
+        <w:t xml:space="preserve"> and detached-worktree instructions. No frozen result was changed for this rewrite.</w:t>
       </w:r>
     </w:p>
     <w:p>
@@ -3395,59 +1749,7 @@
           <w:color w:val="000000"/>
           <w:sz w:val="24"/>
         </w:rPr>
-        <w:t>OpenAI Codex (GPT-based coding assistant) assisted with manuscript drafting and revision,</w:t>
-      </w:r>
-    </w:p>
-    <w:p>
-      <w:pPr>
-        <w:widowControl/>
-      </w:pPr>
-      <w:r>
-        <w:rPr>
-          <w:rFonts w:ascii="Times New Roman" w:hAnsi="Times New Roman" w:eastAsia="Times New Roman" w:cs="Times New Roman"/>
-          <w:color w:val="000000"/>
-          <w:sz w:val="24"/>
-        </w:rPr>
-        <w:t>source-code inspection, figure-generation scripts, and document formatting. The authors</w:t>
-      </w:r>
-    </w:p>
-    <w:p>
-      <w:pPr>
-        <w:widowControl/>
-      </w:pPr>
-      <w:r>
-        <w:rPr>
-          <w:rFonts w:ascii="Times New Roman" w:hAnsi="Times New Roman" w:eastAsia="Times New Roman" w:cs="Times New Roman"/>
-          <w:color w:val="000000"/>
-          <w:sz w:val="24"/>
-        </w:rPr>
-        <w:t>reviewed and edited all AI-assisted text and take responsibility for the scientific</w:t>
-      </w:r>
-    </w:p>
-    <w:p>
-      <w:pPr>
-        <w:widowControl/>
-      </w:pPr>
-      <w:r>
-        <w:rPr>
-          <w:rFonts w:ascii="Times New Roman" w:hAnsi="Times New Roman" w:eastAsia="Times New Roman" w:cs="Times New Roman"/>
-          <w:color w:val="000000"/>
-          <w:sz w:val="24"/>
-        </w:rPr>
-        <w:t>interpretation, references, code, figures, and reported results. No generative AI system</w:t>
-      </w:r>
-    </w:p>
-    <w:p>
-      <w:pPr>
-        <w:widowControl/>
-      </w:pPr>
-      <w:r>
-        <w:rPr>
-          <w:rFonts w:ascii="Times New Roman" w:hAnsi="Times New Roman" w:eastAsia="Times New Roman" w:cs="Times New Roman"/>
-          <w:color w:val="000000"/>
-          <w:sz w:val="24"/>
-        </w:rPr>
-        <w:t>was used to create experimental data.</w:t>
+        <w:t>OpenAI Codex (GPT-based coding assistant) assisted with manuscript drafting and revision, source-code inspection, figure-generation scripts, and document formatting. The authors reviewed and edited all AI-assisted text and take responsibility for the scientific interpretation, references, code, figures, and reported results. No generative AI system was used to create experimental data.</w:t>
       </w:r>
     </w:p>
     <w:p>
@@ -3488,85 +1790,7 @@
           <w:color w:val="000000"/>
           <w:sz w:val="24"/>
         </w:rPr>
-        <w:t>Table 1 states the local certification dimensions for C3. Under registered LOFO</w:t>
-      </w:r>
-    </w:p>
-    <w:p>
-      <w:pPr>
-        <w:widowControl/>
-      </w:pPr>
-      <w:r>
-        <w:rPr>
-          <w:rFonts w:ascii="Times New Roman" w:hAnsi="Times New Roman" w:eastAsia="Times New Roman" w:cs="Times New Roman"/>
-          <w:color w:val="000000"/>
-          <w:sz w:val="24"/>
-        </w:rPr>
-        <w:t>calibration, five-round SPADE returned greater certified volume than five-round qLogNEI:</w:t>
-      </w:r>
-    </w:p>
-    <w:p>
-      <w:pPr>
-        <w:widowControl/>
-      </w:pPr>
-      <w:r>
-        <w:rPr>
-          <w:rFonts w:ascii="Times New Roman" w:hAnsi="Times New Roman" w:eastAsia="Times New Roman" w:cs="Times New Roman"/>
-          <w:color w:val="000000"/>
-          <w:sz w:val="24"/>
-        </w:rPr>
-        <w:t>the SPADE-minus-qLogNEI difference was +0.000855 (95% CI</w:t>
-      </w:r>
-    </w:p>
-    <w:p>
-      <w:pPr>
-        <w:widowControl/>
-      </w:pPr>
-      <w:r>
-        <w:rPr>
-          <w:rFonts w:ascii="Times New Roman" w:hAnsi="Times New Roman" w:eastAsia="Times New Roman" w:cs="Times New Roman"/>
-          <w:color w:val="000000"/>
-          <w:sz w:val="24"/>
-        </w:rPr>
-        <w:t>[+0.000691, +0.001028], p &lt; 0.0001, n = 320 dependent cells).</w:t>
-      </w:r>
-    </w:p>
-    <w:p>
-      <w:pPr>
-        <w:widowControl/>
-      </w:pPr>
-      <w:r>
-        <w:rPr>
-          <w:rFonts w:ascii="Times New Roman" w:hAnsi="Times New Roman" w:eastAsia="Times New Roman" w:cs="Times New Roman"/>
-          <w:color w:val="000000"/>
-          <w:sz w:val="24"/>
-        </w:rPr>
-        <w:t>This is the primary result supporting SPADE for the tested operating-region decision.</w:t>
-      </w:r>
-    </w:p>
-    <w:p>
-      <w:pPr>
-        <w:widowControl/>
-      </w:pPr>
-      <w:r>
-        <w:rPr>
-          <w:rFonts w:ascii="Times New Roman" w:hAnsi="Times New Roman" w:eastAsia="Times New Roman" w:cs="Times New Roman"/>
-          <w:color w:val="000000"/>
-          <w:sz w:val="24"/>
-        </w:rPr>
-        <w:t>It does not establish a universal method ranking. The analogous positive three-round</w:t>
-      </w:r>
-    </w:p>
-    <w:p>
-      <w:pPr>
-        <w:widowControl/>
-      </w:pPr>
-      <w:r>
-        <w:rPr>
-          <w:rFonts w:ascii="Times New Roman" w:hAnsi="Times New Roman" w:eastAsia="Times New Roman" w:cs="Times New Roman"/>
-          <w:color w:val="000000"/>
-          <w:sz w:val="24"/>
-        </w:rPr>
-        <w:t>claim was withdrawn after extension to 32 seeds.</w:t>
+        <w:t>Table 1 states the local certification dimensions for C3. Under registered LOFO calibration, five-round SPADE returned greater certified volume than five-round qLogNEI: the SPADE-minus-qLogNEI difference was +0.000855 (95% CI [+0.000691, +0.001028], p &lt; 0.0001, n = 320 dependent cells). This is the primary result supporting SPADE for the tested operating-region decision. It does not establish a universal method ranking. The analogous positive three-round claim was withdrawn after extension to 32 seeds.</w:t>
       </w:r>
     </w:p>
     <w:p>
@@ -4084,59 +2308,7 @@
           <w:color w:val="000000"/>
           <w:sz w:val="24"/>
         </w:rPr>
-        <w:t>In DC, SPADE R5 minus qLogNEI R10 regret was -0.0005 (95% CI</w:t>
-      </w:r>
-    </w:p>
-    <w:p>
-      <w:pPr>
-        <w:widowControl/>
-      </w:pPr>
-      <w:r>
-        <w:rPr>
-          <w:rFonts w:ascii="Times New Roman" w:hAnsi="Times New Roman" w:eastAsia="Times New Roman" w:cs="Times New Roman"/>
-          <w:color w:val="000000"/>
-          <w:sz w:val="24"/>
-        </w:rPr>
-        <w:t>[-0.0221, +0.0207], p = 0.96, n = 160, five families x 32 seeds).</w:t>
-      </w:r>
-    </w:p>
-    <w:p>
-      <w:pPr>
-        <w:widowControl/>
-      </w:pPr>
-      <w:r>
-        <w:rPr>
-          <w:rFonts w:ascii="Times New Roman" w:hAnsi="Times New Roman" w:eastAsia="Times New Roman" w:cs="Times New Roman"/>
-          <w:color w:val="000000"/>
-          <w:sz w:val="24"/>
-        </w:rPr>
-        <w:t>Both used 48 wells. This is no detectable regret difference, not equivalence: the</w:t>
-      </w:r>
-    </w:p>
-    <w:p>
-      <w:pPr>
-        <w:widowControl/>
-      </w:pPr>
-      <w:r>
-        <w:rPr>
-          <w:rFonts w:ascii="Times New Roman" w:hAnsi="Times New Roman" w:eastAsia="Times New Roman" w:cs="Times New Roman"/>
-          <w:color w:val="000000"/>
-          <w:sz w:val="24"/>
-        </w:rPr>
-        <w:t>interval extends slightly beyond the registered ±0.02 effect boundary, and neither</w:t>
-      </w:r>
-    </w:p>
-    <w:p>
-      <w:pPr>
-        <w:widowControl/>
-      </w:pPr>
-      <w:r>
-        <w:rPr>
-          <w:rFonts w:ascii="Times New Roman" w:hAnsi="Times New Roman" w:eastAsia="Times New Roman" w:cs="Times New Roman"/>
-          <w:color w:val="000000"/>
-          <w:sz w:val="24"/>
-        </w:rPr>
-        <w:t>calendar duration nor cost was measured.</w:t>
+        <w:t>In DC, SPADE R5 minus qLogNEI R10 regret was -0.0005 (95% CI [-0.0221, +0.0207], p = 0.96, n = 160, five families x 32 seeds). Both used 48 wells. This is no detectable regret difference, not equivalence: the interval extends slightly beyond the registered ±0.02 effect boundary, and neither calendar duration nor cost was measured.</w:t>
       </w:r>
     </w:p>
     <w:p>
@@ -4178,7 +2350,7 @@
           <w:color w:val="000000"/>
           <w:sz w:val="24"/>
         </w:rPr>
-        <w:t>The adverse point result is essential: screened DoE found the better point recipe in</w:t>
+        <w:t>The adverse point result is essential: screened DoE found the better point recipe in three rounds. SPADE R5 minus screened-DoE R3 regret was +0.1026 (95% CI [+0.0486, +0.1578], p = 0.0003, n = 160). SPADE used five rounds.</w:t>
       </w:r>
     </w:p>
     <w:p>
@@ -4191,137 +2363,7 @@
           <w:color w:val="000000"/>
           <w:sz w:val="24"/>
         </w:rPr>
-        <w:t>three rounds. SPADE R5 minus screened-DoE R3 regret was +0.1026 (95% CI</w:t>
-      </w:r>
-    </w:p>
-    <w:p>
-      <w:pPr>
-        <w:widowControl/>
-      </w:pPr>
-      <w:r>
-        <w:rPr>
-          <w:rFonts w:ascii="Times New Roman" w:hAnsi="Times New Roman" w:eastAsia="Times New Roman" w:cs="Times New Roman"/>
-          <w:color w:val="000000"/>
-          <w:sz w:val="24"/>
-        </w:rPr>
-        <w:t>[+0.0486, +0.1578], p = 0.0003, n = 160). SPADE used five rounds.</w:t>
-      </w:r>
-    </w:p>
-    <w:p>
-      <w:pPr>
-        <w:widowControl/>
-      </w:pPr>
-      <w:r>
-        <w:rPr>
-          <w:rFonts w:ascii="Times New Roman" w:hAnsi="Times New Roman" w:eastAsia="Times New Roman" w:cs="Times New Roman"/>
-          <w:color w:val="000000"/>
-          <w:sz w:val="24"/>
-        </w:rPr>
-        <w:t>Regional evidence moved in the opposite direction (Table 2). At prevalence 0.30,</w:t>
-      </w:r>
-    </w:p>
-    <w:p>
-      <w:pPr>
-        <w:widowControl/>
-      </w:pPr>
-      <w:r>
-        <w:rPr>
-          <w:rFonts w:ascii="Times New Roman" w:hAnsi="Times New Roman" w:eastAsia="Times New Roman" w:cs="Times New Roman"/>
-          <w:color w:val="000000"/>
-          <w:sz w:val="24"/>
-        </w:rPr>
-        <w:t>relative noise 0.25, assurance 0.95, 48 wells, and five families x 32 seeds,</w:t>
-      </w:r>
-    </w:p>
-    <w:p>
-      <w:pPr>
-        <w:widowControl/>
-      </w:pPr>
-      <w:r>
-        <w:rPr>
-          <w:rFonts w:ascii="Times New Roman" w:hAnsi="Times New Roman" w:eastAsia="Times New Roman" w:cs="Times New Roman"/>
-          <w:color w:val="000000"/>
-          <w:sz w:val="24"/>
-        </w:rPr>
-        <w:t>SPADE selected c=1 within the same DC sample, answered 66/160, and contained truth</w:t>
-      </w:r>
-    </w:p>
-    <w:p>
-      <w:pPr>
-        <w:widowControl/>
-      </w:pPr>
-      <w:r>
-        <w:rPr>
-          <w:rFonts w:ascii="Times New Roman" w:hAnsi="Times New Roman" w:eastAsia="Times New Roman" w:cs="Times New Roman"/>
-          <w:color w:val="000000"/>
-          <w:sz w:val="24"/>
-        </w:rPr>
-        <w:t>in 66/66 answered regions (observed conditional containment 1.0000, ordinary</w:t>
-      </w:r>
-    </w:p>
-    <w:p>
-      <w:pPr>
-        <w:widowControl/>
-      </w:pPr>
-      <w:r>
-        <w:rPr>
-          <w:rFonts w:ascii="Times New Roman" w:hAnsi="Times New Roman" w:eastAsia="Times New Roman" w:cs="Times New Roman"/>
-          <w:color w:val="000000"/>
-          <w:sz w:val="24"/>
-        </w:rPr>
-        <w:t>binomial lower bound 0.9556). Neither DoE arm passed at any inflation, so baseline</w:t>
-      </w:r>
-    </w:p>
-    <w:p>
-      <w:pPr>
-        <w:widowControl/>
-      </w:pPr>
-      <w:r>
-        <w:rPr>
-          <w:rFonts w:ascii="Times New Roman" w:hAnsi="Times New Roman" w:eastAsia="Times New Roman" w:cs="Times New Roman"/>
-          <w:color w:val="000000"/>
-          <w:sz w:val="24"/>
-        </w:rPr>
-        <w:t>c=1 diagnostics are reported: screened DoE answered 122/160 and contained 85/122</w:t>
-      </w:r>
-    </w:p>
-    <w:p>
-      <w:pPr>
-        <w:widowControl/>
-      </w:pPr>
-      <w:r>
-        <w:rPr>
-          <w:rFonts w:ascii="Times New Roman" w:hAnsi="Times New Roman" w:eastAsia="Times New Roman" w:cs="Times New Roman"/>
-          <w:color w:val="000000"/>
-          <w:sz w:val="24"/>
-        </w:rPr>
-        <w:t>(0.6967); unscreened DoE answered 134/160 and contained 77/134 (0.5746).</w:t>
-      </w:r>
-    </w:p>
-    <w:p>
-      <w:pPr>
-        <w:widowControl/>
-      </w:pPr>
-      <w:r>
-        <w:rPr>
-          <w:rFonts w:ascii="Times New Roman" w:hAnsi="Times New Roman" w:eastAsia="Times New Roman" w:cs="Times New Roman"/>
-          <w:color w:val="000000"/>
-          <w:sz w:val="24"/>
-        </w:rPr>
-        <w:t>These within-sample descriptive results do not condemn DoE as a class or establish</w:t>
-      </w:r>
-    </w:p>
-    <w:p>
-      <w:pPr>
-        <w:widowControl/>
-      </w:pPr>
-      <w:r>
-        <w:rPr>
-          <w:rFonts w:ascii="Times New Roman" w:hAnsi="Times New Roman" w:eastAsia="Times New Roman" w:cs="Times New Roman"/>
-          <w:color w:val="000000"/>
-          <w:sz w:val="24"/>
-        </w:rPr>
-        <w:t>transportable coverage.</w:t>
+        <w:t>Regional evidence moved in the opposite direction (Table 2). At prevalence 0.30, relative noise 0.25, assurance 0.95, 48 wells, and five families x 32 seeds, SPADE selected c=1 within the same DC sample, answered 66/160, and contained truth in 66/66 answered regions (observed conditional containment 1.0000, ordinary binomial lower bound 0.9556). Neither DoE arm passed at any inflation, so baseline c=1 diagnostics are reported: screened DoE answered 122/160 and contained 85/122 (0.6967); unscreened DoE answered 134/160 and contained 77/134 (0.5746). These within-sample descriptive results do not condemn DoE as a class or establish transportable coverage.</w:t>
       </w:r>
     </w:p>
     <w:p>
@@ -5146,7 +3188,7 @@
           <w:color w:val="000000"/>
           <w:sz w:val="24"/>
         </w:rPr>
-        <w:t>Across five families and prevalences 0.70, 0.50, 0.30, 0.20, and 0.10, SPADE answer</w:t>
+        <w:t>Across five families and prevalences 0.70, 0.50, 0.30, 0.20, and 0.10, SPADE answer rate at c=1, alpha=0.95, 48 wells, R5, relative noise 0.25, and 64 seeds per family was descriptively associated with mean seed-specific true margin-to-noise (Spearman rho = 0.988; 25 nested family-prevalence cells). The diagnostic uses latent truth and is explanatory, not available prospectively. Shared families and ordered prevalences make the cells dependent and nonexchangeable.</w:t>
       </w:r>
     </w:p>
     <w:p>
@@ -5159,124 +3201,7 @@
           <w:color w:val="000000"/>
           <w:sz w:val="24"/>
         </w:rPr>
-        <w:t>rate at c=1, alpha=0.95, 48 wells, R5, relative noise 0.25, and 64 seeds per</w:t>
-      </w:r>
-    </w:p>
-    <w:p>
-      <w:pPr>
-        <w:widowControl/>
-      </w:pPr>
-      <w:r>
-        <w:rPr>
-          <w:rFonts w:ascii="Times New Roman" w:hAnsi="Times New Roman" w:eastAsia="Times New Roman" w:cs="Times New Roman"/>
-          <w:color w:val="000000"/>
-          <w:sz w:val="24"/>
-        </w:rPr>
-        <w:t>family was descriptively associated with mean seed-specific true margin-to-noise</w:t>
-      </w:r>
-    </w:p>
-    <w:p>
-      <w:pPr>
-        <w:widowControl/>
-      </w:pPr>
-      <w:r>
-        <w:rPr>
-          <w:rFonts w:ascii="Times New Roman" w:hAnsi="Times New Roman" w:eastAsia="Times New Roman" w:cs="Times New Roman"/>
-          <w:color w:val="000000"/>
-          <w:sz w:val="24"/>
-        </w:rPr>
-        <w:t>(Spearman rho = 0.988; 25 nested family-prevalence cells). The diagnostic</w:t>
-      </w:r>
-    </w:p>
-    <w:p>
-      <w:pPr>
-        <w:widowControl/>
-      </w:pPr>
-      <w:r>
-        <w:rPr>
-          <w:rFonts w:ascii="Times New Roman" w:hAnsi="Times New Roman" w:eastAsia="Times New Roman" w:cs="Times New Roman"/>
-          <w:color w:val="000000"/>
-          <w:sz w:val="24"/>
-        </w:rPr>
-        <w:t>uses latent truth and is explanatory, not available prospectively. Shared families and</w:t>
-      </w:r>
-    </w:p>
-    <w:p>
-      <w:pPr>
-        <w:widowControl/>
-      </w:pPr>
-      <w:r>
-        <w:rPr>
-          <w:rFonts w:ascii="Times New Roman" w:hAnsi="Times New Roman" w:eastAsia="Times New Roman" w:cs="Times New Roman"/>
-          <w:color w:val="000000"/>
-          <w:sz w:val="24"/>
-        </w:rPr>
-        <w:t>ordered prevalences make the cells dependent and nonexchangeable.</w:t>
-      </w:r>
-    </w:p>
-    <w:p>
-      <w:pPr>
-        <w:widowControl/>
-      </w:pPr>
-      <w:r>
-        <w:rPr>
-          <w:rFonts w:ascii="Times New Roman" w:hAnsi="Times New Roman" w:eastAsia="Times New Roman" w:cs="Times New Roman"/>
-          <w:color w:val="000000"/>
-          <w:sz w:val="24"/>
-        </w:rPr>
-        <w:t>For the biology-shaped but synthetic Hill family at prevalence 0.70, under those</w:t>
-      </w:r>
-    </w:p>
-    <w:p>
-      <w:pPr>
-        <w:widowControl/>
-      </w:pPr>
-      <w:r>
-        <w:rPr>
-          <w:rFonts w:ascii="Times New Roman" w:hAnsi="Times New Roman" w:eastAsia="Times New Roman" w:cs="Times New Roman"/>
-          <w:color w:val="000000"/>
-          <w:sz w:val="24"/>
-        </w:rPr>
-        <w:t>same settings, SPADE answered 40/64 and contained truth in 40/40 (ordinary-binomial</w:t>
-      </w:r>
-    </w:p>
-    <w:p>
-      <w:pPr>
-        <w:widowControl/>
-      </w:pPr>
-      <w:r>
-        <w:rPr>
-          <w:rFonts w:ascii="Times New Roman" w:hAnsi="Times New Roman" w:eastAsia="Times New Roman" w:cs="Times New Roman"/>
-          <w:color w:val="000000"/>
-          <w:sz w:val="24"/>
-        </w:rPr>
-        <w:t>lower bound 0.9278). qLogNEI answered 27/64 and contained 27/27; its limitation was</w:t>
-      </w:r>
-    </w:p>
-    <w:p>
-      <w:pPr>
-        <w:widowControl/>
-      </w:pPr>
-      <w:r>
-        <w:rPr>
-          <w:rFonts w:ascii="Times New Roman" w:hAnsi="Times New Roman" w:eastAsia="Times New Roman" w:cs="Times New Roman"/>
-          <w:color w:val="000000"/>
-          <w:sz w:val="24"/>
-        </w:rPr>
-        <w:t>the answer count required by the registered gate, not failure to return contained</w:t>
-      </w:r>
-    </w:p>
-    <w:p>
-      <w:pPr>
-        <w:widowControl/>
-      </w:pPr>
-      <w:r>
-        <w:rPr>
-          <w:rFonts w:ascii="Times New Roman" w:hAnsi="Times New Roman" w:eastAsia="Times New Roman" w:cs="Times New Roman"/>
-          <w:color w:val="000000"/>
-          <w:sz w:val="24"/>
-        </w:rPr>
-        <w:t>regions.</w:t>
+        <w:t>For the biology-shaped but synthetic Hill family at prevalence 0.70, under those same settings, SPADE answered 40/64 and contained truth in 40/40 (ordinary-binomial lower bound 0.9278). qLogNEI answered 27/64 and contained 27/27; its limitation was the answer count required by the registered gate, not failure to return contained regions.</w:t>
       </w:r>
     </w:p>
     <w:p>
@@ -5303,98 +3228,7 @@
           <w:color w:val="000000"/>
           <w:sz w:val="24"/>
         </w:rPr>
-        <w:t>Treating the fitted GP mean as fixed had little effect in synthetic diagnostics:</w:t>
-      </w:r>
-    </w:p>
-    <w:p>
-      <w:pPr>
-        <w:widowControl/>
-      </w:pPr>
-      <w:r>
-        <w:rPr>
-          <w:rFonts w:ascii="Times New Roman" w:hAnsi="Times New Roman" w:eastAsia="Times New Roman" w:cs="Times New Roman"/>
-          <w:color w:val="000000"/>
-          <w:sz w:val="24"/>
-        </w:rPr>
-        <w:t>mean-marginalised posterior width increased by 1.004x–1.011x. The same correction</w:t>
-      </w:r>
-    </w:p>
-    <w:p>
-      <w:pPr>
-        <w:widowControl/>
-      </w:pPr>
-      <w:r>
-        <w:rPr>
-          <w:rFonts w:ascii="Times New Roman" w:hAnsi="Times New Roman" w:eastAsia="Times New Roman" w:cs="Times New Roman"/>
-          <w:color w:val="000000"/>
-          <w:sz w:val="24"/>
-        </w:rPr>
-        <w:t>increased mean posterior marginal SD approximately 484x for the in-house candidate</w:t>
-      </w:r>
-    </w:p>
-    <w:p>
-      <w:pPr>
-        <w:widowControl/>
-      </w:pPr>
-      <w:r>
-        <w:rPr>
-          <w:rFonts w:ascii="Times New Roman" w:hAnsi="Times New Roman" w:eastAsia="Times New Roman" w:cs="Times New Roman"/>
-          <w:color w:val="000000"/>
-          <w:sz w:val="24"/>
-        </w:rPr>
-        <w:t>dataset and 297x for published Hall–Ogle data. Observation-prediction LOO inflation</w:t>
-      </w:r>
-    </w:p>
-    <w:p>
-      <w:pPr>
-        <w:widowControl/>
-      </w:pPr>
-      <w:r>
-        <w:rPr>
-          <w:rFonts w:ascii="Times New Roman" w:hAnsi="Times New Roman" w:eastAsia="Times New Roman" w:cs="Times New Roman"/>
-          <w:color w:val="000000"/>
-          <w:sz w:val="24"/>
-        </w:rPr>
-        <w:t>was assay-specific (c=0.712 in-house and c=0.526 published). These S2/S3 values are</w:t>
-      </w:r>
-    </w:p>
-    <w:p>
-      <w:pPr>
-        <w:widowControl/>
-      </w:pPr>
-      <w:r>
-        <w:rPr>
-          <w:rFonts w:ascii="Times New Roman" w:hAnsi="Times New Roman" w:eastAsia="Times New Roman" w:cs="Times New Roman"/>
-          <w:color w:val="000000"/>
-          <w:sz w:val="24"/>
-        </w:rPr>
-        <w:t>retrospective, stdout-reproduced support without structured numerical guards. LOO</w:t>
-      </w:r>
-    </w:p>
-    <w:p>
-      <w:pPr>
-        <w:widowControl/>
-      </w:pPr>
-      <w:r>
-        <w:rPr>
-          <w:rFonts w:ascii="Times New Roman" w:hAnsi="Times New Roman" w:eastAsia="Times New Roman" w:cs="Times New Roman"/>
-          <w:color w:val="000000"/>
-          <w:sz w:val="24"/>
-        </w:rPr>
-        <w:t>prediction does not identify latent-function uncertainty, and the in-house CD31 gates</w:t>
-      </w:r>
-    </w:p>
-    <w:p>
-      <w:pPr>
-        <w:widowControl/>
-      </w:pPr>
-      <w:r>
-        <w:rPr>
-          <w:rFonts w:ascii="Times New Roman" w:hAnsi="Times New Roman" w:eastAsia="Times New Roman" w:cs="Times New Roman"/>
-          <w:color w:val="000000"/>
-          <w:sz w:val="24"/>
-        </w:rPr>
-        <w:t xml:space="preserve">remain </w:t>
+        <w:t xml:space="preserve">Treating the fitted GP mean as fixed had little effect in synthetic diagnostics: mean-marginalised posterior width increased by 1.004x–1.011x. The same correction increased mean posterior marginal SD approximately 484x for the in-house candidate dataset and 297x for published Hall–Ogle data. Observation-prediction LOO inflation was assay-specific (c=0.712 in-house and c=0.526 published). These S2/S3 values are retrospective, stdout-reproduced support without structured numerical guards. LOO prediction does not identify latent-function uncertainty, and the in-house CD31 gates remain </w:t>
       </w:r>
       <w:r>
         <w:rPr>
@@ -5438,7 +3272,7 @@
           <w:color w:val="000000"/>
           <w:sz w:val="24"/>
         </w:rPr>
-        <w:t>The target-aligned acquisition did not earn adoption. Relative to committed SPADE, its</w:t>
+        <w:t>The target-aligned acquisition did not earn adoption. Relative to committed SPADE, its certified-volume change was +0.000425 (95% CI [-0.000022, +0.000875]) and its regret was worse by +0.0301 (95% CI [+0.0169, +0.0450], p &lt; 0.0001). Family effects cancelled. This failure is why SPADE's value is described architecturally rather than as a successful targeting mechanism.</w:t>
       </w:r>
     </w:p>
     <w:p>
@@ -5451,7 +3285,7 @@
           <w:color w:val="000000"/>
           <w:sz w:val="24"/>
         </w:rPr>
-        <w:t>certified-volume change was +0.000425 (95% CI</w:t>
+        <w:t>At measured real-assay relative noise 0.68, no tested arm certified. Replication and independent noise identification are therefore prerequisites for prospective use at that noise level.</w:t>
       </w:r>
     </w:p>
     <w:p>
@@ -5464,124 +3298,7 @@
           <w:color w:val="000000"/>
           <w:sz w:val="24"/>
         </w:rPr>
-        <w:t>[-0.000022, +0.000875]) and its regret was worse by +0.0301</w:t>
-      </w:r>
-    </w:p>
-    <w:p>
-      <w:pPr>
-        <w:widowControl/>
-      </w:pPr>
-      <w:r>
-        <w:rPr>
-          <w:rFonts w:ascii="Times New Roman" w:hAnsi="Times New Roman" w:eastAsia="Times New Roman" w:cs="Times New Roman"/>
-          <w:color w:val="000000"/>
-          <w:sz w:val="24"/>
-        </w:rPr>
-        <w:t>(95% CI [+0.0169, +0.0450], p &lt; 0.0001). Family effects cancelled. This failure is</w:t>
-      </w:r>
-    </w:p>
-    <w:p>
-      <w:pPr>
-        <w:widowControl/>
-      </w:pPr>
-      <w:r>
-        <w:rPr>
-          <w:rFonts w:ascii="Times New Roman" w:hAnsi="Times New Roman" w:eastAsia="Times New Roman" w:cs="Times New Roman"/>
-          <w:color w:val="000000"/>
-          <w:sz w:val="24"/>
-        </w:rPr>
-        <w:t>why SPADE's value is described architecturally rather than as a successful targeting</w:t>
-      </w:r>
-    </w:p>
-    <w:p>
-      <w:pPr>
-        <w:widowControl/>
-      </w:pPr>
-      <w:r>
-        <w:rPr>
-          <w:rFonts w:ascii="Times New Roman" w:hAnsi="Times New Roman" w:eastAsia="Times New Roman" w:cs="Times New Roman"/>
-          <w:color w:val="000000"/>
-          <w:sz w:val="24"/>
-        </w:rPr>
-        <w:t>mechanism.</w:t>
-      </w:r>
-    </w:p>
-    <w:p>
-      <w:pPr>
-        <w:widowControl/>
-      </w:pPr>
-      <w:r>
-        <w:rPr>
-          <w:rFonts w:ascii="Times New Roman" w:hAnsi="Times New Roman" w:eastAsia="Times New Roman" w:cs="Times New Roman"/>
-          <w:color w:val="000000"/>
-          <w:sz w:val="24"/>
-        </w:rPr>
-        <w:t>At measured real-assay relative noise 0.68, no tested arm certified. Replication and</w:t>
-      </w:r>
-    </w:p>
-    <w:p>
-      <w:pPr>
-        <w:widowControl/>
-      </w:pPr>
-      <w:r>
-        <w:rPr>
-          <w:rFonts w:ascii="Times New Roman" w:hAnsi="Times New Roman" w:eastAsia="Times New Roman" w:cs="Times New Roman"/>
-          <w:color w:val="000000"/>
-          <w:sz w:val="24"/>
-        </w:rPr>
-        <w:t>independent noise identification are therefore prerequisites for prospective use at</w:t>
-      </w:r>
-    </w:p>
-    <w:p>
-      <w:pPr>
-        <w:widowControl/>
-      </w:pPr>
-      <w:r>
-        <w:rPr>
-          <w:rFonts w:ascii="Times New Roman" w:hAnsi="Times New Roman" w:eastAsia="Times New Roman" w:cs="Times New Roman"/>
-          <w:color w:val="000000"/>
-          <w:sz w:val="24"/>
-        </w:rPr>
-        <w:t>that noise level.</w:t>
-      </w:r>
-    </w:p>
-    <w:p>
-      <w:pPr>
-        <w:widowControl/>
-      </w:pPr>
-      <w:r>
-        <w:rPr>
-          <w:rFonts w:ascii="Times New Roman" w:hAnsi="Times New Roman" w:eastAsia="Times New Roman" w:cs="Times New Roman"/>
-          <w:color w:val="000000"/>
-          <w:sz w:val="24"/>
-        </w:rPr>
-        <w:t>A later future-response development grid evaluated nine candidate protocols on five</w:t>
-      </w:r>
-    </w:p>
-    <w:p>
-      <w:pPr>
-        <w:widowControl/>
-      </w:pPr>
-      <w:r>
-        <w:rPr>
-          <w:rFonts w:ascii="Times New Roman" w:hAnsi="Times New Roman" w:eastAsia="Times New Roman" w:cs="Times New Roman"/>
-          <w:color w:val="000000"/>
-          <w:sz w:val="24"/>
-        </w:rPr>
-        <w:t>families. Table 3 reports its preserved ranges; every candidate missed the registered</w:t>
-      </w:r>
-    </w:p>
-    <w:p>
-      <w:pPr>
-        <w:widowControl/>
-      </w:pPr>
-      <w:r>
-        <w:rPr>
-          <w:rFonts w:ascii="Times New Roman" w:hAnsi="Times New Roman" w:eastAsia="Times New Roman" w:cs="Times New Roman"/>
-          <w:color w:val="000000"/>
-          <w:sz w:val="24"/>
-        </w:rPr>
-        <w:t xml:space="preserve">containment floor on at least one family. The selector returned </w:t>
+        <w:t xml:space="preserve">A later future-response development grid evaluated nine candidate protocols on five families. Table 3 reports its preserved ranges; every candidate missed the registered containment floor on at least one family. The selector returned </w:t>
       </w:r>
       <w:r>
         <w:rPr>
@@ -5598,20 +3315,7 @@
           <w:color w:val="000000"/>
           <w:sz w:val="24"/>
         </w:rPr>
-        <w:t>, no</w:t>
-      </w:r>
-    </w:p>
-    <w:p>
-      <w:pPr>
-        <w:widowControl/>
-      </w:pPr>
-      <w:r>
-        <w:rPr>
-          <w:rFonts w:ascii="Times New Roman" w:hAnsi="Times New Roman" w:eastAsia="Times New Roman" w:cs="Times New Roman"/>
-          <w:color w:val="000000"/>
-          <w:sz w:val="24"/>
-        </w:rPr>
-        <w:t xml:space="preserve">power artifact was authorized, and the lockbox remained </w:t>
+        <w:t xml:space="preserve">, no power artifact was authorized, and the lockbox remained </w:t>
       </w:r>
       <w:r>
         <w:rPr>
@@ -5628,20 +3332,7 @@
           <w:color w:val="000000"/>
           <w:sz w:val="24"/>
         </w:rPr>
-        <w:t>. No lockbox</w:t>
-      </w:r>
-    </w:p>
-    <w:p>
-      <w:pPr>
-        <w:widowControl/>
-      </w:pPr>
-      <w:r>
-        <w:rPr>
-          <w:rFonts w:ascii="Times New Roman" w:hAnsi="Times New Roman" w:eastAsia="Times New Roman" w:cs="Times New Roman"/>
-          <w:color w:val="000000"/>
-          <w:sz w:val="24"/>
-        </w:rPr>
-        <w:t>evidence was opened.</w:t>
+        <w:t>. No lockbox evidence was opened.</w:t>
       </w:r>
     </w:p>
     <w:p>
@@ -6199,7 +3890,7 @@
           <w:color w:val="000000"/>
           <w:sz w:val="24"/>
         </w:rPr>
-        <w:t>The primary conclusion is decision-specific. At five matched rounds, SPADE produced</w:t>
+        <w:t>The primary conclusion is decision-specific. At five matched rounds, SPADE produced greater certified volume than qLogNEI under registered LOFO calibration. In the DC comparison its answered regions also had stronger observed truth containment than the tested DoE pipelines. Those findings support SPADE when the requested deliverable is a conservative operating region and abstention is acceptable.</w:t>
       </w:r>
     </w:p>
     <w:p>
@@ -6212,7 +3903,7 @@
           <w:color w:val="000000"/>
           <w:sz w:val="24"/>
         </w:rPr>
-        <w:t>greater certified volume than qLogNEI under registered LOFO calibration. In the DC</w:t>
+        <w:t>They do not support a universal ranking. The qLogNEI point comparison showed no detectable difference and did not establish equivalence. Screened DoE found a substantially better point recipe in fewer rounds. A laboratory requiring one recipe may rationally prefer a point optimizer; a laboratory requiring a region faces a different loss function.</w:t>
       </w:r>
     </w:p>
     <w:p>
@@ -6225,176 +3916,7 @@
           <w:color w:val="000000"/>
           <w:sz w:val="24"/>
         </w:rPr>
-        <w:t>comparison its answered regions also had stronger observed truth containment than the</w:t>
-      </w:r>
-    </w:p>
-    <w:p>
-      <w:pPr>
-        <w:widowControl/>
-      </w:pPr>
-      <w:r>
-        <w:rPr>
-          <w:rFonts w:ascii="Times New Roman" w:hAnsi="Times New Roman" w:eastAsia="Times New Roman" w:cs="Times New Roman"/>
-          <w:color w:val="000000"/>
-          <w:sz w:val="24"/>
-        </w:rPr>
-        <w:t>tested DoE pipelines. Those findings support SPADE when the requested deliverable is a</w:t>
-      </w:r>
-    </w:p>
-    <w:p>
-      <w:pPr>
-        <w:widowControl/>
-      </w:pPr>
-      <w:r>
-        <w:rPr>
-          <w:rFonts w:ascii="Times New Roman" w:hAnsi="Times New Roman" w:eastAsia="Times New Roman" w:cs="Times New Roman"/>
-          <w:color w:val="000000"/>
-          <w:sz w:val="24"/>
-        </w:rPr>
-        <w:t>conservative operating region and abstention is acceptable.</w:t>
-      </w:r>
-    </w:p>
-    <w:p>
-      <w:pPr>
-        <w:widowControl/>
-      </w:pPr>
-      <w:r>
-        <w:rPr>
-          <w:rFonts w:ascii="Times New Roman" w:hAnsi="Times New Roman" w:eastAsia="Times New Roman" w:cs="Times New Roman"/>
-          <w:color w:val="000000"/>
-          <w:sz w:val="24"/>
-        </w:rPr>
-        <w:t>They do not support a universal ranking. The qLogNEI point comparison showed no</w:t>
-      </w:r>
-    </w:p>
-    <w:p>
-      <w:pPr>
-        <w:widowControl/>
-      </w:pPr>
-      <w:r>
-        <w:rPr>
-          <w:rFonts w:ascii="Times New Roman" w:hAnsi="Times New Roman" w:eastAsia="Times New Roman" w:cs="Times New Roman"/>
-          <w:color w:val="000000"/>
-          <w:sz w:val="24"/>
-        </w:rPr>
-        <w:t>detectable difference and did not establish equivalence. Screened DoE found a</w:t>
-      </w:r>
-    </w:p>
-    <w:p>
-      <w:pPr>
-        <w:widowControl/>
-      </w:pPr>
-      <w:r>
-        <w:rPr>
-          <w:rFonts w:ascii="Times New Roman" w:hAnsi="Times New Roman" w:eastAsia="Times New Roman" w:cs="Times New Roman"/>
-          <w:color w:val="000000"/>
-          <w:sz w:val="24"/>
-        </w:rPr>
-        <w:t>substantially better point recipe in fewer rounds. A laboratory requiring one recipe</w:t>
-      </w:r>
-    </w:p>
-    <w:p>
-      <w:pPr>
-        <w:widowControl/>
-      </w:pPr>
-      <w:r>
-        <w:rPr>
-          <w:rFonts w:ascii="Times New Roman" w:hAnsi="Times New Roman" w:eastAsia="Times New Roman" w:cs="Times New Roman"/>
-          <w:color w:val="000000"/>
-          <w:sz w:val="24"/>
-        </w:rPr>
-        <w:t>may rationally prefer a point optimizer; a laboratory requiring a region faces a</w:t>
-      </w:r>
-    </w:p>
-    <w:p>
-      <w:pPr>
-        <w:widowControl/>
-      </w:pPr>
-      <w:r>
-        <w:rPr>
-          <w:rFonts w:ascii="Times New Roman" w:hAnsi="Times New Roman" w:eastAsia="Times New Roman" w:cs="Times New Roman"/>
-          <w:color w:val="000000"/>
-          <w:sz w:val="24"/>
-        </w:rPr>
-        <w:t>different loss function.</w:t>
-      </w:r>
-    </w:p>
-    <w:p>
-      <w:pPr>
-        <w:widowControl/>
-      </w:pPr>
-      <w:r>
-        <w:rPr>
-          <w:rFonts w:ascii="Times New Roman" w:hAnsi="Times New Roman" w:eastAsia="Times New Roman" w:cs="Times New Roman"/>
-          <w:color w:val="000000"/>
-          <w:sz w:val="24"/>
-        </w:rPr>
-        <w:t>The contribution is integration and evidence, not theoretical priority. GP level-set</w:t>
-      </w:r>
-    </w:p>
-    <w:p>
-      <w:pPr>
-        <w:widowControl/>
-      </w:pPr>
-      <w:r>
-        <w:rPr>
-          <w:rFonts w:ascii="Times New Roman" w:hAnsi="Times New Roman" w:eastAsia="Times New Roman" w:cs="Times New Roman"/>
-          <w:color w:val="000000"/>
-          <w:sz w:val="24"/>
-        </w:rPr>
-        <w:t>learning, Vorob'ev summaries, simultaneous posterior inclusion, and conservative</w:t>
-      </w:r>
-    </w:p>
-    <w:p>
-      <w:pPr>
-        <w:widowControl/>
-      </w:pPr>
-      <w:r>
-        <w:rPr>
-          <w:rFonts w:ascii="Times New Roman" w:hAnsi="Times New Roman" w:eastAsia="Times New Roman" w:cs="Times New Roman"/>
-          <w:color w:val="000000"/>
-          <w:sz w:val="24"/>
-        </w:rPr>
-        <w:t>excursion sets are established. SPADE adapts them to a fixed-well assay architecture,</w:t>
-      </w:r>
-    </w:p>
-    <w:p>
-      <w:pPr>
-        <w:widowControl/>
-      </w:pPr>
-      <w:r>
-        <w:rPr>
-          <w:rFonts w:ascii="Times New Roman" w:hAnsi="Times New Roman" w:eastAsia="Times New Roman" w:cs="Times New Roman"/>
-          <w:color w:val="000000"/>
-          <w:sz w:val="24"/>
-        </w:rPr>
-        <w:t>uses common regional post-processing across comparator observations, and permits an</w:t>
-      </w:r>
-    </w:p>
-    <w:p>
-      <w:pPr>
-        <w:widowControl/>
-      </w:pPr>
-      <w:r>
-        <w:rPr>
-          <w:rFonts w:ascii="Times New Roman" w:hAnsi="Times New Roman" w:eastAsia="Times New Roman" w:cs="Times New Roman"/>
-          <w:color w:val="000000"/>
-          <w:sz w:val="24"/>
-        </w:rPr>
-        <w:t>empty answer. The failed target-alignment experiment prevents attributing the observed</w:t>
-      </w:r>
-    </w:p>
-    <w:p>
-      <w:pPr>
-        <w:widowControl/>
-      </w:pPr>
-      <w:r>
-        <w:rPr>
-          <w:rFonts w:ascii="Times New Roman" w:hAnsi="Times New Roman" w:eastAsia="Times New Roman" w:cs="Times New Roman"/>
-          <w:color w:val="000000"/>
-          <w:sz w:val="24"/>
-        </w:rPr>
-        <w:t>regional result to successful threshold targeting.</w:t>
+        <w:t>The contribution is integration and evidence, not theoretical priority. GP level-set learning, Vorob'ev summaries, simultaneous posterior inclusion, and conservative excursion sets are established. SPADE adapts them to a fixed-well assay architecture, uses common regional post-processing across comparator observations, and permits an empty answer. The failed target-alignment experiment prevents attributing the observed regional result to successful threshold targeting.</w:t>
       </w:r>
     </w:p>
     <w:p>
@@ -6421,7 +3943,7 @@
           <w:color w:val="000000"/>
           <w:sz w:val="24"/>
         </w:rPr>
-        <w:t>All comparative landscapes were synthetic, the domain was evaluated on finite grids,</w:t>
+        <w:t>All comparative landscapes were synthetic, the domain was evaluated on finite grids, and headline noise was 0.25. Families, seeds, target prevalences, kernels, acquisition implementations, and one 48-well budget bound the result. The tested DoE is one low-order response-surface pipeline and qLogNEI is one BO acquisition.</w:t>
       </w:r>
     </w:p>
     <w:p>
@@ -6434,7 +3956,7 @@
           <w:color w:val="000000"/>
           <w:sz w:val="24"/>
         </w:rPr>
-        <w:t>and headline noise was 0.25. Families, seeds, target prevalences, kernels, acquisition</w:t>
+        <w:t>Inference is conditional on the frozen benchmark. The flat-cell bootstrap may be too narrow because repeated family-seed-prevalence cells are dependent. Pooled binomial bounds do not become cluster-aware merely because they are exact under an ordinary Bernoulli model. C2 calibration is within-sample; only C3 holds a family out during inflation selection. Neither procedure supplies distribution-free or regulatory coverage.</w:t>
       </w:r>
     </w:p>
     <w:p>
@@ -6447,150 +3969,7 @@
           <w:color w:val="000000"/>
           <w:sz w:val="24"/>
         </w:rPr>
-        <w:t>implementations, and one 48-well budget bound the result. The tested DoE is one</w:t>
-      </w:r>
-    </w:p>
-    <w:p>
-      <w:pPr>
-        <w:widowControl/>
-      </w:pPr>
-      <w:r>
-        <w:rPr>
-          <w:rFonts w:ascii="Times New Roman" w:hAnsi="Times New Roman" w:eastAsia="Times New Roman" w:cs="Times New Roman"/>
-          <w:color w:val="000000"/>
-          <w:sz w:val="24"/>
-        </w:rPr>
-        <w:t>low-order response-surface pipeline and qLogNEI is one BO acquisition.</w:t>
-      </w:r>
-    </w:p>
-    <w:p>
-      <w:pPr>
-        <w:widowControl/>
-      </w:pPr>
-      <w:r>
-        <w:rPr>
-          <w:rFonts w:ascii="Times New Roman" w:hAnsi="Times New Roman" w:eastAsia="Times New Roman" w:cs="Times New Roman"/>
-          <w:color w:val="000000"/>
-          <w:sz w:val="24"/>
-        </w:rPr>
-        <w:t>Inference is conditional on the frozen benchmark. The flat-cell bootstrap may be too</w:t>
-      </w:r>
-    </w:p>
-    <w:p>
-      <w:pPr>
-        <w:widowControl/>
-      </w:pPr>
-      <w:r>
-        <w:rPr>
-          <w:rFonts w:ascii="Times New Roman" w:hAnsi="Times New Roman" w:eastAsia="Times New Roman" w:cs="Times New Roman"/>
-          <w:color w:val="000000"/>
-          <w:sz w:val="24"/>
-        </w:rPr>
-        <w:t>narrow because repeated family-seed-prevalence cells are dependent. Pooled binomial</w:t>
-      </w:r>
-    </w:p>
-    <w:p>
-      <w:pPr>
-        <w:widowControl/>
-      </w:pPr>
-      <w:r>
-        <w:rPr>
-          <w:rFonts w:ascii="Times New Roman" w:hAnsi="Times New Roman" w:eastAsia="Times New Roman" w:cs="Times New Roman"/>
-          <w:color w:val="000000"/>
-          <w:sz w:val="24"/>
-        </w:rPr>
-        <w:t>bounds do not become cluster-aware merely because they are exact under an ordinary</w:t>
-      </w:r>
-    </w:p>
-    <w:p>
-      <w:pPr>
-        <w:widowControl/>
-      </w:pPr>
-      <w:r>
-        <w:rPr>
-          <w:rFonts w:ascii="Times New Roman" w:hAnsi="Times New Roman" w:eastAsia="Times New Roman" w:cs="Times New Roman"/>
-          <w:color w:val="000000"/>
-          <w:sz w:val="24"/>
-        </w:rPr>
-        <w:t>Bernoulli model. C2 calibration is within-sample; only C3 holds a family out during</w:t>
-      </w:r>
-    </w:p>
-    <w:p>
-      <w:pPr>
-        <w:widowControl/>
-      </w:pPr>
-      <w:r>
-        <w:rPr>
-          <w:rFonts w:ascii="Times New Roman" w:hAnsi="Times New Roman" w:eastAsia="Times New Roman" w:cs="Times New Roman"/>
-          <w:color w:val="000000"/>
-          <w:sz w:val="24"/>
-        </w:rPr>
-        <w:t>inflation selection. Neither procedure supplies distribution-free or regulatory</w:t>
-      </w:r>
-    </w:p>
-    <w:p>
-      <w:pPr>
-        <w:widowControl/>
-      </w:pPr>
-      <w:r>
-        <w:rPr>
-          <w:rFonts w:ascii="Times New Roman" w:hAnsi="Times New Roman" w:eastAsia="Times New Roman" w:cs="Times New Roman"/>
-          <w:color w:val="000000"/>
-          <w:sz w:val="24"/>
-        </w:rPr>
-        <w:t>coverage.</w:t>
-      </w:r>
-    </w:p>
-    <w:p>
-      <w:pPr>
-        <w:widowControl/>
-      </w:pPr>
-      <w:r>
-        <w:rPr>
-          <w:rFonts w:ascii="Times New Roman" w:hAnsi="Times New Roman" w:eastAsia="Times New Roman" w:cs="Times New Roman"/>
-          <w:color w:val="000000"/>
-          <w:sz w:val="24"/>
-        </w:rPr>
-        <w:t>The real-data analyses are retrospective diagnostics. They do not establish recipe</w:t>
-      </w:r>
-    </w:p>
-    <w:p>
-      <w:pPr>
-        <w:widowControl/>
-      </w:pPr>
-      <w:r>
-        <w:rPr>
-          <w:rFonts w:ascii="Times New Roman" w:hAnsi="Times New Roman" w:eastAsia="Times New Roman" w:cs="Times New Roman"/>
-          <w:color w:val="000000"/>
-          <w:sz w:val="24"/>
-        </w:rPr>
-        <w:t>equivalence, manufacturing qualification, regulatory validation, or prospective</w:t>
-      </w:r>
-    </w:p>
-    <w:p>
-      <w:pPr>
-        <w:widowControl/>
-      </w:pPr>
-      <w:r>
-        <w:rPr>
-          <w:rFonts w:ascii="Times New Roman" w:hAnsi="Times New Roman" w:eastAsia="Times New Roman" w:cs="Times New Roman"/>
-          <w:color w:val="000000"/>
-          <w:sz w:val="24"/>
-        </w:rPr>
-        <w:t>wet-lab performance. The relative-noise ceiling, unsigned in-house gates, missing</w:t>
-      </w:r>
-    </w:p>
-    <w:p>
-      <w:pPr>
-        <w:widowControl/>
-      </w:pPr>
-      <w:r>
-        <w:rPr>
-          <w:rFonts w:ascii="Times New Roman" w:hAnsi="Times New Roman" w:eastAsia="Times New Roman" w:cs="Times New Roman"/>
-          <w:color w:val="000000"/>
-          <w:sz w:val="24"/>
-        </w:rPr>
-        <w:t xml:space="preserve">replicate-tube noise identification, joint-protocol </w:t>
+        <w:t xml:space="preserve">The real-data analyses are retrospective diagnostics. They do not establish recipe equivalence, manufacturing qualification, regulatory validation, or prospective wet-lab performance. The relative-noise ceiling, unsigned in-house gates, missing replicate-tube noise identification, joint-protocol </w:t>
       </w:r>
       <w:r>
         <w:rPr>
@@ -6607,20 +3986,7 @@
           <w:color w:val="000000"/>
           <w:sz w:val="24"/>
         </w:rPr>
-        <w:t>, and unopened</w:t>
-      </w:r>
-    </w:p>
-    <w:p>
-      <w:pPr>
-        <w:widowControl/>
-      </w:pPr>
-      <w:r>
-        <w:rPr>
-          <w:rFonts w:ascii="Times New Roman" w:hAnsi="Times New Roman" w:eastAsia="Times New Roman" w:cs="Times New Roman"/>
-          <w:color w:val="000000"/>
-          <w:sz w:val="24"/>
-        </w:rPr>
-        <w:t>lockbox preclude such claims.</w:t>
+        <w:t>, and unopened lockbox preclude such claims.</w:t>
       </w:r>
     </w:p>
     <w:p>
@@ -6647,46 +4013,7 @@
           <w:color w:val="000000"/>
           <w:sz w:val="24"/>
         </w:rPr>
-        <w:t>Table 4 situates the contribution. Physical and biological optimization studies provide</w:t>
-      </w:r>
-    </w:p>
-    <w:p>
-      <w:pPr>
-        <w:widowControl/>
-      </w:pPr>
-      <w:r>
-        <w:rPr>
-          <w:rFonts w:ascii="Times New Roman" w:hAnsi="Times New Roman" w:eastAsia="Times New Roman" w:cs="Times New Roman"/>
-          <w:color w:val="000000"/>
-          <w:sz w:val="24"/>
-        </w:rPr>
-        <w:t>wet-lab relevance but usually answer different budget and decision questions.</w:t>
-      </w:r>
-    </w:p>
-    <w:p>
-      <w:pPr>
-        <w:widowControl/>
-      </w:pPr>
-      <w:r>
-        <w:rPr>
-          <w:rFonts w:ascii="Times New Roman" w:hAnsi="Times New Roman" w:eastAsia="Times New Roman" w:cs="Times New Roman"/>
-          <w:color w:val="000000"/>
-          <w:sz w:val="24"/>
-        </w:rPr>
-        <w:t>Methodological papers supply the level-set and conservative-set foundations. The</w:t>
-      </w:r>
-    </w:p>
-    <w:p>
-      <w:pPr>
-        <w:widowControl/>
-      </w:pPr>
-      <w:r>
-        <w:rPr>
-          <w:rFonts w:ascii="Times New Roman" w:hAnsi="Times New Roman" w:eastAsia="Times New Roman" w:cs="Times New Roman"/>
-          <w:color w:val="000000"/>
-          <w:sz w:val="24"/>
-        </w:rPr>
-        <w:t>present simulation offers known truth but no biological validation.</w:t>
+        <w:t>Table 4 situates the contribution. Physical and biological optimization studies provide wet-lab relevance but usually answer different budget and decision questions. Methodological papers supply the level-set and conservative-set foundations. The present simulation offers known truth but no biological validation.</w:t>
       </w:r>
     </w:p>
     <w:p>
@@ -7935,7 +5262,7 @@
           <w:color w:val="000000"/>
           <w:sz w:val="24"/>
         </w:rPr>
-        <w:t>SPADE performed better for the tested operating-region decision: at matched five rounds</w:t>
+        <w:t>SPADE performed better for the tested operating-region decision: at matched five rounds it returned greater certified volume than qLogNEI, and its answered DC regions had stronger observed containment than the tested DoE pipelines. That regional conclusion coexists with no detectable point-regret difference from longer qLogNEI, an interval that did not establish equivalence, and a clear adverse result in which three-round DoE found a better point recipe than five-round SPADE.</w:t>
       </w:r>
     </w:p>
     <w:p>
@@ -7948,111 +5275,7 @@
           <w:color w:val="000000"/>
           <w:sz w:val="24"/>
         </w:rPr>
-        <w:t>it returned greater certified volume than qLogNEI, and its answered DC regions had</w:t>
-      </w:r>
-    </w:p>
-    <w:p>
-      <w:pPr>
-        <w:widowControl/>
-      </w:pPr>
-      <w:r>
-        <w:rPr>
-          <w:rFonts w:ascii="Times New Roman" w:hAnsi="Times New Roman" w:eastAsia="Times New Roman" w:cs="Times New Roman"/>
-          <w:color w:val="000000"/>
-          <w:sz w:val="24"/>
-        </w:rPr>
-        <w:t>stronger observed containment than the tested DoE pipelines. That regional conclusion</w:t>
-      </w:r>
-    </w:p>
-    <w:p>
-      <w:pPr>
-        <w:widowControl/>
-      </w:pPr>
-      <w:r>
-        <w:rPr>
-          <w:rFonts w:ascii="Times New Roman" w:hAnsi="Times New Roman" w:eastAsia="Times New Roman" w:cs="Times New Roman"/>
-          <w:color w:val="000000"/>
-          <w:sz w:val="24"/>
-        </w:rPr>
-        <w:t>coexists with no detectable point-regret difference from longer qLogNEI, an interval</w:t>
-      </w:r>
-    </w:p>
-    <w:p>
-      <w:pPr>
-        <w:widowControl/>
-      </w:pPr>
-      <w:r>
-        <w:rPr>
-          <w:rFonts w:ascii="Times New Roman" w:hAnsi="Times New Roman" w:eastAsia="Times New Roman" w:cs="Times New Roman"/>
-          <w:color w:val="000000"/>
-          <w:sz w:val="24"/>
-        </w:rPr>
-        <w:t>that did not establish equivalence, and a clear adverse result in which three-round DoE</w:t>
-      </w:r>
-    </w:p>
-    <w:p>
-      <w:pPr>
-        <w:widowControl/>
-      </w:pPr>
-      <w:r>
-        <w:rPr>
-          <w:rFonts w:ascii="Times New Roman" w:hAnsi="Times New Roman" w:eastAsia="Times New Roman" w:cs="Times New Roman"/>
-          <w:color w:val="000000"/>
-          <w:sz w:val="24"/>
-        </w:rPr>
-        <w:t>found a better point recipe than five-round SPADE.</w:t>
-      </w:r>
-    </w:p>
-    <w:p>
-      <w:pPr>
-        <w:widowControl/>
-      </w:pPr>
-      <w:r>
-        <w:rPr>
-          <w:rFonts w:ascii="Times New Roman" w:hAnsi="Times New Roman" w:eastAsia="Times New Roman" w:cs="Times New Roman"/>
-          <w:color w:val="000000"/>
-          <w:sz w:val="24"/>
-        </w:rPr>
-        <w:t>Choose SPADE when a moderate-noise, fixed-well campaign must return a conservative</w:t>
-      </w:r>
-    </w:p>
-    <w:p>
-      <w:pPr>
-        <w:widowControl/>
-      </w:pPr>
-      <w:r>
-        <w:rPr>
-          <w:rFonts w:ascii="Times New Roman" w:hAnsi="Times New Roman" w:eastAsia="Times New Roman" w:cs="Times New Roman"/>
-          <w:color w:val="000000"/>
-          <w:sz w:val="24"/>
-        </w:rPr>
-        <w:t>operating region and may abstain; choose a point optimizer when only one recipe is</w:t>
-      </w:r>
-    </w:p>
-    <w:p>
-      <w:pPr>
-        <w:widowControl/>
-      </w:pPr>
-      <w:r>
-        <w:rPr>
-          <w:rFonts w:ascii="Times New Roman" w:hAnsi="Times New Roman" w:eastAsia="Times New Roman" w:cs="Times New Roman"/>
-          <w:color w:val="000000"/>
-          <w:sz w:val="24"/>
-        </w:rPr>
-        <w:t>required. These computational results do not establish recipe equivalence,</w:t>
-      </w:r>
-    </w:p>
-    <w:p>
-      <w:pPr>
-        <w:widowControl/>
-      </w:pPr>
-      <w:r>
-        <w:rPr>
-          <w:rFonts w:ascii="Times New Roman" w:hAnsi="Times New Roman" w:eastAsia="Times New Roman" w:cs="Times New Roman"/>
-          <w:color w:val="000000"/>
-          <w:sz w:val="24"/>
-        </w:rPr>
-        <w:t>manufacturing qualification, regulatory validation, or prospective wet-lab performance.</w:t>
+        <w:t>Choose SPADE when a moderate-noise, fixed-well campaign must return a conservative operating region and may abstain; choose a point optimizer when only one recipe is required. These computational results do not establish recipe equivalence, manufacturing qualification, regulatory validation, or prospective wet-lab performance.</w:t>
       </w:r>
     </w:p>
     <w:p>
@@ -8079,52 +5302,8 @@
           <w:color w:val="000000"/>
           <w:sz w:val="24"/>
         </w:rPr>
-        <w:t>Primary result files, analysis scripts, protocols, and supporting tables are available</w:t>
+        <w:t xml:space="preserve">Primary result files, analysis scripts, protocols, and supporting tables are available in the project repository at https://github.com/akwnn/nutrigene-ai-bo-ipsec. Original software is released under the MIT License; original research materials (manuscript, figures, synthetic datasets, and retained results) are released under CC BY 4.0 (see </w:t>
       </w:r>
-    </w:p>
-    <w:p>
-      <w:pPr>
-        <w:widowControl/>
-      </w:pPr>
-      <w:r>
-        <w:rPr>
-          <w:rFonts w:ascii="Times New Roman" w:hAnsi="Times New Roman" w:eastAsia="Times New Roman" w:cs="Times New Roman"/>
-          <w:color w:val="000000"/>
-          <w:sz w:val="24"/>
-        </w:rPr>
-        <w:t>in the project repository at https://github.com/akwnn/nutrigene-ai-bo-ipsec. Original</w:t>
-      </w:r>
-    </w:p>
-    <w:p>
-      <w:pPr>
-        <w:widowControl/>
-      </w:pPr>
-      <w:r>
-        <w:rPr>
-          <w:rFonts w:ascii="Times New Roman" w:hAnsi="Times New Roman" w:eastAsia="Times New Roman" w:cs="Times New Roman"/>
-          <w:color w:val="000000"/>
-          <w:sz w:val="24"/>
-        </w:rPr>
-        <w:t>software is released under the MIT License; original research materials (manuscript,</w:t>
-      </w:r>
-    </w:p>
-    <w:p>
-      <w:pPr>
-        <w:widowControl/>
-      </w:pPr>
-      <w:r>
-        <w:rPr>
-          <w:rFonts w:ascii="Times New Roman" w:hAnsi="Times New Roman" w:eastAsia="Times New Roman" w:cs="Times New Roman"/>
-          <w:color w:val="000000"/>
-          <w:sz w:val="24"/>
-        </w:rPr>
-        <w:t>figures, synthetic datasets, and retained results) are released under CC BY 4.0 (see</w:t>
-      </w:r>
-    </w:p>
-    <w:p>
-      <w:pPr>
-        <w:widowControl/>
-      </w:pPr>
       <w:r>
         <w:rPr>
           <w:rFonts w:ascii="Times New Roman" w:hAnsi="Times New Roman" w:eastAsia="Times New Roman" w:cs="Times New Roman"/>
@@ -8156,13 +5335,8 @@
           <w:color w:val="000000"/>
           <w:sz w:val="24"/>
         </w:rPr>
-        <w:t>). Audited reproduction paths are indexed in</w:t>
+        <w:t xml:space="preserve">). Audited reproduction paths are indexed in </w:t>
       </w:r>
-    </w:p>
-    <w:p>
-      <w:pPr>
-        <w:widowControl/>
-      </w:pPr>
       <w:r>
         <w:rPr>
           <w:rFonts w:ascii="Courier New" w:hAnsi="Courier New" w:eastAsia="Courier New" w:cs="Courier New"/>
@@ -8177,20 +5351,7 @@
           <w:color w:val="000000"/>
           <w:sz w:val="24"/>
         </w:rPr>
-        <w:t>. A DOI-bearing archival deposit remains pending;</w:t>
-      </w:r>
-    </w:p>
-    <w:p>
-      <w:pPr>
-        <w:widowControl/>
-      </w:pPr>
-      <w:r>
-        <w:rPr>
-          <w:rFonts w:ascii="Times New Roman" w:hAnsi="Times New Roman" w:eastAsia="Times New Roman" w:cs="Times New Roman"/>
-          <w:color w:val="000000"/>
-          <w:sz w:val="24"/>
-        </w:rPr>
-        <w:t>the repository is the current source of the materials described here.</w:t>
+        <w:t>. A DOI-bearing archival deposit remains pending; the repository is the current source of the materials described here.</w:t>
       </w:r>
     </w:p>
     <w:p>
@@ -8226,33 +5387,7 @@
           <w:color w:val="000000"/>
           <w:sz w:val="24"/>
         </w:rPr>
-        <w:t xml:space="preserve"> Conceptualization; Formal analysis; Investigation; Methodology;</w:t>
-      </w:r>
-    </w:p>
-    <w:p>
-      <w:pPr>
-        <w:widowControl/>
-      </w:pPr>
-      <w:r>
-        <w:rPr>
-          <w:rFonts w:ascii="Times New Roman" w:hAnsi="Times New Roman" w:eastAsia="Times New Roman" w:cs="Times New Roman"/>
-          <w:color w:val="000000"/>
-          <w:sz w:val="24"/>
-        </w:rPr>
-        <w:t>Project administration; Validation; Visualization; Writing – original draft; Writing –</w:t>
-      </w:r>
-    </w:p>
-    <w:p>
-      <w:pPr>
-        <w:widowControl/>
-      </w:pPr>
-      <w:r>
-        <w:rPr>
-          <w:rFonts w:ascii="Times New Roman" w:hAnsi="Times New Roman" w:eastAsia="Times New Roman" w:cs="Times New Roman"/>
-          <w:color w:val="000000"/>
-          <w:sz w:val="24"/>
-        </w:rPr>
-        <w:t>review &amp; editing.</w:t>
+        <w:t xml:space="preserve"> Conceptualization; Formal analysis; Investigation; Methodology; Project administration; Validation; Visualization; Writing – original draft; Writing – review &amp; editing.</w:t>
       </w:r>
     </w:p>
     <w:p>
@@ -8274,20 +5409,7 @@
           <w:color w:val="000000"/>
           <w:sz w:val="24"/>
         </w:rPr>
-        <w:t xml:space="preserve"> Conceptualization; Data curation; Formal analysis; Investigation;</w:t>
-      </w:r>
-    </w:p>
-    <w:p>
-      <w:pPr>
-        <w:widowControl/>
-      </w:pPr>
-      <w:r>
-        <w:rPr>
-          <w:rFonts w:ascii="Times New Roman" w:hAnsi="Times New Roman" w:eastAsia="Times New Roman" w:cs="Times New Roman"/>
-          <w:color w:val="000000"/>
-          <w:sz w:val="24"/>
-        </w:rPr>
-        <w:t>Methodology; Software; Validation; Writing – review &amp; editing.</w:t>
+        <w:t xml:space="preserve"> Conceptualization; Data curation; Formal analysis; Investigation; Methodology; Software; Validation; Writing – review &amp; editing.</w:t>
       </w:r>
     </w:p>
     <w:p>
@@ -8327,33 +5449,7 @@
           <w:color w:val="000000"/>
           <w:sz w:val="24"/>
         </w:rPr>
-        <w:t>We thank the Obermeyer Research Group at Columbia University for research context on</w:t>
-      </w:r>
-    </w:p>
-    <w:p>
-      <w:pPr>
-        <w:widowControl/>
-      </w:pPr>
-      <w:r>
-        <w:rPr>
-          <w:rFonts w:ascii="Times New Roman" w:hAnsi="Times New Roman" w:eastAsia="Times New Roman" w:cs="Times New Roman"/>
-          <w:color w:val="000000"/>
-          <w:sz w:val="24"/>
-        </w:rPr>
-        <w:t>multicomponent formulation design. Computational experiments used synthetic landscapes;</w:t>
-      </w:r>
-    </w:p>
-    <w:p>
-      <w:pPr>
-        <w:widowControl/>
-      </w:pPr>
-      <w:r>
-        <w:rPr>
-          <w:rFonts w:ascii="Times New Roman" w:hAnsi="Times New Roman" w:eastAsia="Times New Roman" w:cs="Times New Roman"/>
-          <w:color w:val="000000"/>
-          <w:sz w:val="24"/>
-        </w:rPr>
-        <w:t>no wet-lab samples were generated for this study.</w:t>
+        <w:t>We thank the Obermeyer Research Group at Columbia University for research context on multicomponent formulation design. Computational experiments used synthetic landscapes; no wet-lab samples were generated for this study.</w:t>
       </w:r>
     </w:p>
     <w:p>
@@ -8684,46 +5780,7 @@
           <w:color w:val="000000"/>
           <w:sz w:val="24"/>
         </w:rPr>
-        <w:t>Main text Figures 1–4 follow the region-first presentation: method selection (Fig 1),</w:t>
-      </w:r>
-    </w:p>
-    <w:p>
-      <w:pPr>
-        <w:widowControl/>
-      </w:pPr>
-      <w:r>
-        <w:rPr>
-          <w:rFonts w:ascii="Times New Roman" w:hAnsi="Times New Roman" w:eastAsia="Times New Roman" w:cs="Times New Roman"/>
-          <w:color w:val="000000"/>
-          <w:sz w:val="24"/>
-        </w:rPr>
-        <w:t>SPADE’s certified-volume and containment advantage (Fig 2), the secondary point-recipe</w:t>
-      </w:r>
-    </w:p>
-    <w:p>
-      <w:pPr>
-        <w:widowControl/>
-      </w:pPr>
-      <w:r>
-        <w:rPr>
-          <w:rFonts w:ascii="Times New Roman" w:hAnsi="Times New Roman" w:eastAsia="Times New Roman" w:cs="Times New Roman"/>
-          <w:color w:val="000000"/>
-          <w:sz w:val="24"/>
-        </w:rPr>
-        <w:t>trade-off (Fig 3), and additional locked SPADE evidence C4/C6 (Fig 4). Numeric sources</w:t>
-      </w:r>
-    </w:p>
-    <w:p>
-      <w:pPr>
-        <w:widowControl/>
-      </w:pPr>
-      <w:r>
-        <w:rPr>
-          <w:rFonts w:ascii="Times New Roman" w:hAnsi="Times New Roman" w:eastAsia="Times New Roman" w:cs="Times New Roman"/>
-          <w:color w:val="000000"/>
-          <w:sz w:val="24"/>
-        </w:rPr>
-        <w:t xml:space="preserve">are in </w:t>
+        <w:t xml:space="preserve">Main text Figures 1–4 follow the region-first presentation: method selection (Fig 1), SPADE’s certified-volume and containment advantage (Fig 2), the secondary point-recipe trade-off (Fig 3), and additional locked SPADE evidence C4/C6 (Fig 4). Numeric sources are in </w:t>
       </w:r>
       <w:r>
         <w:rPr>

</xml_diff>

<commit_message>
docs: reframe C3 as answer-rate–driven volume and fix audit leftovers
Report SPADE 116/320 vs qLogNEI 6/320 answers, unconditional vs conditional
volumes, clearer CI wording, drop the doubled Fig 1 caption, and repair
jargon-substitution damage around the confirmation store.
</commit_message>
<xml_diff>
--- a/manuscript/SPADE-PLOS-ONE-submission.docx
+++ b/manuscript/SPADE-PLOS-ONE-submission.docx
@@ -239,7 +239,7 @@
           <w:color w:val="000000"/>
           <w:sz w:val="24"/>
         </w:rPr>
-        <w:t>When a cell-culture or bioprocess campaign has a fixed well budget, the end goal may be one best recipe or a trustworthy set of settings that still clear a threshold. Those are different jobs, so which experimental method looks best can change with the job. We compared SPADE (Synthetic Posterior Abstaining Design for Excursions)—a workflow built to return a conservative “good enough” operating region and to abstain when evidence is weak—with noisy Bayesian optimization (qLogNEI) and classical response-surface design of experiments (DoE) on shared synthetic test surfaces under a common 48-well budget. The main conclusion is decision-specific: on this benchmark SPADE is preferable when the deliverable is a trusted operating region, not when the deliverable is a single optimized recipe. At matched five feedback rounds, SPADE’s returned regions were larger on average than qLogNEI’s (mean certified volume 0.000864 versus 0.000009, about 92-fold; difference +0.000855, 95% CI [+0.000691, +0.001028], p &lt; 0.000125; n = 320 paired contrasts). Certified volume is the fraction of a fixed 2,000-point scoring grid inside the region the method calls acceptable (one grid point equals 0.0005 of volume). At prevalence 0.30, every region SPADE returned contained truth (66/66 answered), whereas DoE answered more often but issued many incorrect regions (screened 85/122 contained among answers; unscreened 77/134); counting every campaign, contained totals were 66/160 for SPADE versus 85/160 and 77/160 for the DoE arms. That pattern fits an asymmetric loss in which a false certified region is costlier than abstention. By contrast, screened three-round DoE found better point recipes (+0.1026 SPADE-minus-DoE regret), and five-round SPADE showed no detectable regret difference from ten-round qLogNEI (−0.0005, 95% CI [−0.0221, +0.0207], p = 0.96; n = 160) without establishing equivalence. Results are limited to these synthetic surfaces, moderate noise, and finite grids; they do not establish wet-lab or regulatory performance.</w:t>
+        <w:t>When a cell-culture or bioprocess campaign has a fixed well budget, the end goal may be one best recipe or a trustworthy set of settings that still clear a threshold. Those are different jobs, so which method looks best can change with the job. We compared SPADE (Synthetic Posterior Abstaining Design for Excursions)—built to return a conservative operating region and to abstain when unsure—with noisy Bayesian optimization (qLogNEI) and classical response-surface DoE on shared synthetic surfaces under a common 48-well budget. The main conclusion is decision-specific: on this benchmark SPADE is preferable for a trusted operating region, not for a single optimized recipe. At matched five rounds, the volume contrast is driven mainly by how often each method returns any region at all: SPADE answered 116/320 contrasts versus 6/320 for qLogNEI. Mean certified volume across all contrasts, with abstentions scored as zero, was 0.000864 versus 0.0000094 (difference +0.000855, 95% CI +0.000691 to +0.001028, p &lt; 0.000125). Certified volume is the fraction of a 2,000-point grid inside the returned region (one point = 0.0005). Conditional on answering, mean volumes were 0.00238 (SPADE) and 0.00050 (qLogNEI). At prevalence 0.30 versus DoE, SPADE contained truth in all answered regions (66/66) but abstained more; DoE answered more often with many incorrect regions. Screened three-round DoE found better point recipes (+0.1026 SPADE-minus-DoE regret), and five-round SPADE showed no detectable regret gap versus ten-round qLogNEI (−0.0005, 95% CI −0.0221 to +0.0207, p = 0.96; n = 160) without proving equivalence. Results are limited to these synthetic surfaces, moderate noise, and finite grids—not wet-lab or regulatory performance.</w:t>
       </w:r>
     </w:p>
     <w:p>
@@ -657,7 +657,7 @@
           <w:color w:val="000000"/>
           <w:sz w:val="20"/>
         </w:rPr>
-        <w:t>Fig 1. Study design under a fixed 48-well budget. (A) Every arm uses the same 48-well campaign; the method chooses round structure and the terminal return. (B) The campaign is scored as a point-recipe decision (simple regret) and/or an operating-region decision (certified volume, containment, or abstention). (C) Comparators in this study: SPADE (region-first), qLogNEI (noisy Bayesian optimization), and DoE response-surface pipelines. This schematic defines the benchmark and contains no performance result.</w:t>
+        <w:t>Fig 1. Study design under a fixed 48-well budget.</w:t>
       </w:r>
       <w:r>
         <w:rPr>
@@ -665,7 +665,7 @@
           <w:color w:val="000000"/>
           <w:sz w:val="20"/>
         </w:rPr>
-        <w:t xml:space="preserve"> (A) Choose SPADE when the campaign must return a trusted operating region with honest abstention. (B) Choose a point optimizer (DoE or Bayesian optimization) when only one carry-forward recipe is required. (C) Under very high assay-like noise, abstain and replicate rather than claiming a region. This schematic defines the decision framing and contains no performance result.</w:t>
+        <w:t xml:space="preserve"> (A) Every arm uses the same 48-well campaign; the method chooses round structure and the terminal return. (B) The campaign is scored as a point-recipe decision (simple regret) and/or an operating-region decision (certified volume, containment, or abstention). (C) Comparators: SPADE (region-first), qLogNEI (noisy Bayesian optimization), and DoE response-surface pipelines. This schematic defines the benchmark and contains no performance result.</w:t>
       </w:r>
     </w:p>
     <w:p>
@@ -1704,7 +1704,7 @@
           <w:color w:val="000000"/>
           <w:sz w:val="24"/>
         </w:rPr>
-        <w:t>The regret smallest effect of interest was 0.02. An interval extending beyond that boundary was not interpreted as equivalence. The C5 Spearman coefficient is descriptive over 25 nested, nonexchangeable family-prevalence cells; no naive independence-based p-value is interpreted.</w:t>
+        <w:t>The C5 Spearman coefficient is descriptive over 25 nested, nonexchangeable family-prevalence cells; no naive independence-based p-value is interpreted.</w:t>
       </w:r>
     </w:p>
     <w:p>
@@ -1849,7 +1849,7 @@
           <w:color w:val="000000"/>
           <w:sz w:val="24"/>
         </w:rPr>
-        <w:t>Table 1 states the local certification dimensions for C3. Under registered leave-one-family-out calibration, five-round SPADE returned greater certified volume than five-round qLogNEI. Mean certified volumes on the 2,000-point scoring grid were 0.000864 for SPADE and 0.000009 for qLogNEI (about a 92-fold ratio). The SPADE-minus-qLogNEI difference was +0.000855 (95% CI [+0.000691, +0.001028], p &lt; 0.000125, n = 320 dependent cells). Because certified volume is a fraction of that grid, one grid point equals 0.0005 of volume; the mean difference is about 1.7 grid points. No smallest effect of interest was registered for volume, so we treat this as directional support for the tested operating-region decision rather than a universal method ranking. The analogous positive three-round claim was withdrawn after extension to 32 seeds.</w:t>
+        <w:t>Table 1 states the local certification dimensions for C3. Under registered leave-one-family-out calibration at matched five rounds, qLogNEI almost never returned a non-empty conservative set (6/320 contrasts; mean certified volume 0.0000094 ≈ 0.019 grid points per contrast), whereas SPADE returned a non-empty set in 116/320 contrasts (mean 0.000864 ≈ 1.73 grid points). Abstentions are scored as zero volume, so these means are unconditional. The SPADE-minus-qLogNEI difference was +0.000855 (95% CI +0.000691 to +0.001028, p &lt; 0.000125; n = 320 paired contrasts). The volume contrast is therefore driven primarily by answer rate rather than by larger regions among answered campaigns: conditional on answering, mean volumes were 0.00238 for SPADE and 0.00050 for qLogNEI (one grid point). Certified volume is the fraction of the 2,000-point scoring grid inside the returned region (one point = 0.0005). No smallest effect of interest was registered for volume; we treat the contrast as directional support for the tested operating-region decision, not universal superiority. The analogous positive three-round claim was withdrawn after extension to 32 seeds.</w:t>
       </w:r>
     </w:p>
     <w:p>
@@ -1864,7 +1864,7 @@
           <w:color w:val="000000"/>
           <w:sz w:val="20"/>
         </w:rPr>
-        <w:t>Fig 2. SPADE’s primary advantage: trusted operating regions.</w:t>
+        <w:t>Fig 2. SPADE’s primary regional advantage versus qLogNEI.</w:t>
       </w:r>
       <w:r>
         <w:rPr>
@@ -1872,7 +1872,7 @@
           <w:color w:val="000000"/>
           <w:sz w:val="20"/>
         </w:rPr>
-        <w:t xml:space="preserve"> (A) Certified-volume difference (SPADE minus qLogNEI) at matched five rounds: +0.000855 (95% CI [+0.000691, +0.001028], p &lt; 0.000125, n = 320). Absolute means were 0.000864 (SPADE) and 0.000009 (qLogNEI) on the 2,000-point grid (one point = 0.0005 of volume). (B) Observed truth containment among answered regions at prevalence 0.30: SPADE 66/66 versus screened DoE 85/122 and unscreened DoE 77/134. Unconditional contained counts are 66/160, 85/160, and 77/160.</w:t>
+        <w:t xml:space="preserve"> (A) Certified-volume difference at matched five rounds (+0.000855, 95% CI +0.000691 to +0.001028, p &lt; 0.000125; n = 320), with abstentions scored as zero. SPADE answered 116/320 contrasts versus 6/320 for qLogNEI. (B) Versus DoE at prevalence 0.30: containment among answered regions (SPADE 66/66; screened DoE 85/122; unscreened DoE 77/134). Unconditional contained counts are 66/160, 85/160, and 77/160. (A) Certified-volume difference (SPADE minus qLogNEI) at matched five rounds: +0.000855 (95% CI [+0.000691, +0.001028], p &lt; 0.000125, n = 320). Absolute means were 0.000864 (SPADE) and 0.000009 (qLogNEI) on the 2,000-point grid (one point = 0.0005 of volume). (B) Observed truth containment among answered regions at prevalence 0.30: SPADE 66/66 versus screened DoE 85/122 and unscreened DoE 77/134. Unconditional contained counts are 66/160, 85/160, and 77/160.</w:t>
       </w:r>
     </w:p>
     <w:p>
@@ -3352,7 +3352,7 @@
           <w:color w:val="000000"/>
           <w:sz w:val="20"/>
         </w:rPr>
-        <w:t xml:space="preserve"> (A) Point-regret advantage of three-round SPADE over one-shot Latin hypercube sampling (LHS minus SPADE = +0.0783; n = 80; locked C4 mean). Higher values favor SPADE. (B) On the biology-shaped Hill family at prevalence 0.70, SPADE answered 40/64 regions versus 27/64 for qLogNEI; both arms contained truth in every answered cell (descriptive counts; C6).</w:t>
+        <w:t xml:space="preserve"> (A) Point-regret difference LHS minus SPADE at three rounds (+0.0783; higher favors SPADE). n = 80 because C4 uses four Latin-hypercube families × 20 shared seeds (Hill and seeds 20–31 excluded by protocol), unlike the five-family n = 160 contrasts elsewhere. (B) On biology-shaped Hill at prevalence 0.70, SPADE answered 40/64 versus 27/64 for qLogNEI; both contained truth in every answered cell (descriptive; C6). (A) Point-regret advantage of three-round SPADE over one-shot Latin hypercube sampling (LHS minus SPADE = +0.0783; n = 80; locked C4 mean). Higher values favor SPADE. (B) On the biology-shaped Hill family at prevalence 0.70, SPADE answered 40/64 regions versus 27/64 for qLogNEI; both arms contained truth in every answered cell (descriptive counts; C6).</w:t>
       </w:r>
     </w:p>
     <w:p>
@@ -3433,7 +3433,7 @@
           <w:color w:val="000000"/>
           <w:sz w:val="24"/>
         </w:rPr>
-        <w:t>Failed targeting, the real-noise ceiling, and the unopened lockbox</w:t>
+        <w:t>Failed targeting, the real-noise ceiling, and the unopened confirmation store</w:t>
       </w:r>
     </w:p>
     <w:p>
@@ -3472,7 +3472,7 @@
           <w:color w:val="000000"/>
           <w:sz w:val="24"/>
         </w:rPr>
-        <w:t>A later future-response development grid evaluated nine candidate protocols on five families. Table 3 reports its preserved ranges; every candidate missed the registered containment floor on at least one family. The selector returned a development outcome that selected no protocol, no post-hoc power calculation was authorized, and the held-out confirmation store remained a frozen, unopened confirmation store. No lockbox evidence was opened.</w:t>
+        <w:t>A later future-response development grid evaluated nine candidate protocols on five families. Table 3 reports its preserved ranges; every candidate missed the registered containment floor on at least one family. The selector returned no protocol, no post-hoc power calculation was authorized, and the held-out confirmation records remained frozen and unopened. No confirmation evidence was released.</w:t>
       </w:r>
     </w:p>
     <w:p>
@@ -4109,7 +4109,7 @@
           <w:color w:val="000000"/>
           <w:sz w:val="24"/>
         </w:rPr>
-        <w:t>The real-data analyses are retrospective diagnostics. They do not establish recipe equivalence, manufacturing qualification, regulatory validation, or prospective wet-lab performance. The relative-noise ceiling, unsigned in-house gates, missing replicate-tube noise identification, joint-protocol a development outcome that selected no protocol, and unopened lockbox preclude such claims.</w:t>
+        <w:t>The real-data analyses are retrospective diagnostics. They do not establish recipe equivalence, manufacturing qualification, regulatory validation, or prospective wet-lab performance. The relative-noise ceiling, unsigned in-house gates, missing replicate-tube noise identification, the joint-protocol development outcome that selected no protocol, and the unopened confirmation store preclude such claims.</w:t>
       </w:r>
     </w:p>
     <w:p>

</xml_diff>

<commit_message>
docs: explain SPADE results in plain English before the statistics
Rewrite the abstract, C3/C1/C2 Results, Outcomes intro, and Conclusions so
each claim states the question and takeaway first, then the numbers; remove
doubled Fig 2/4 captions.
</commit_message>
<xml_diff>
--- a/manuscript/SPADE-PLOS-ONE-submission.docx
+++ b/manuscript/SPADE-PLOS-ONE-submission.docx
@@ -239,7 +239,7 @@
           <w:color w:val="000000"/>
           <w:sz w:val="24"/>
         </w:rPr>
-        <w:t>When a cell-culture or bioprocess campaign has a fixed well budget, the end goal may be one best recipe or a trustworthy set of settings that still clear a threshold. Those are different jobs, so which method looks best can change with the job. We compared SPADE (Synthetic Posterior Abstaining Design for Excursions)—built to return a conservative operating region and to abstain when unsure—with noisy Bayesian optimization (qLogNEI) and classical response-surface DoE on shared synthetic surfaces under a common 48-well budget. The main conclusion is decision-specific: on this benchmark SPADE is preferable for a trusted operating region, not for a single optimized recipe. At matched five rounds, the volume contrast is driven mainly by how often each method returns any region at all: SPADE answered 116/320 contrasts versus 6/320 for qLogNEI. Mean certified volume across all contrasts, with abstentions scored as zero, was 0.000864 versus 0.0000094 (difference +0.000855, 95% CI +0.000691 to +0.001028, p &lt; 0.000125). Certified volume is the fraction of a 2,000-point grid inside the returned region (one point = 0.0005). Conditional on answering, mean volumes were 0.00238 (SPADE) and 0.00050 (qLogNEI). At prevalence 0.30 versus DoE, SPADE contained truth in all answered regions (66/66) but abstained more; DoE answered more often with many incorrect regions. Screened three-round DoE found better point recipes (+0.1026 SPADE-minus-DoE regret), and five-round SPADE showed no detectable regret gap versus ten-round qLogNEI (−0.0005, 95% CI −0.0221 to +0.0207, p = 0.96; n = 160) without proving equivalence. Results are limited to these synthetic surfaces, moderate noise, and finite grids—not wet-lab or regulatory performance.</w:t>
+        <w:t>With a fixed number of experimental wells, a lab may want either one best recipe or a set of settings it can trust to stay above a quality threshold. Those goals are different, so the “best” method can change with the goal. We tested SPADE (Synthetic Posterior Abstaining Design for Excursions)—software that tries to return a conservative operating region and may say “not sure” instead of guessing—against noisy Bayesian optimization (qLogNEI) and classical response-surface DoE on synthetic test problems, all with the same 48-well budget. Conclusion: on this benchmark, choose SPADE when you need a trusted region; choose DoE (or similar) when you only need one recipe. Against qLogNEI at five matched rounds, SPADE returned a usable region much more often (116 of 320 comparisons versus 6 of 320). When a method returned nothing, we counted volume as zero. Average region size was therefore higher for SPADE (0.000864 versus 0.0000094 on a 2,000-point map; difference +0.000855). A 95% confidence interval for that average difference ran from +0.000691 to +0.001028 and did not include zero; a randomization check gave p &lt; 0.000125. “Certified volume” here means the share of that map inside the region the method is willing to call acceptable. Among the rare times qLogNEI did answer, its regions were still smaller on average (0.00050 versus 0.00238 for SPADE). Against DoE, SPADE’s answered regions always matched truth (66/66), while DoE answered more often but was often wrong. DoE did win at finding a single best recipe. Five-round SPADE looked similar to longer ten-round qLogNEI on recipe quality, without proving they are equivalent. These findings are for synthetic surfaces and moderate noise only—not wet-lab proof.</w:t>
       </w:r>
     </w:p>
     <w:p>
@@ -1563,6 +1563,19 @@
           <w:color w:val="000000"/>
           <w:sz w:val="24"/>
         </w:rPr>
+        <w:t>In plain language we score two end-of-run decisions. A point recipe is “pick one setting”; we measure how far that pick is from the true best (simple regret; lower is better). An operating region is “which settings are still good enough?”; we measure how large a conservative region the method returns (certified volume), whether that region sits inside truth when it answers (containment), and how often it refuses to answer (abstention).</w:t>
+      </w:r>
+    </w:p>
+    <w:p>
+      <w:pPr>
+        <w:widowControl/>
+      </w:pPr>
+      <w:r>
+        <w:rPr>
+          <w:rFonts w:ascii="Times New Roman" w:hAnsi="Times New Roman" w:eastAsia="Times New Roman" w:cs="Times New Roman"/>
+          <w:color w:val="000000"/>
+          <w:sz w:val="24"/>
+        </w:rPr>
         <w:t xml:space="preserve">The terminal point recommendation was the visited condition with the largest observed response; it was then scored by latent truth. Because each family was normalized to optimum one, simple regret was </w:t>
       </w:r>
       <m:oMath>
@@ -1849,7 +1862,33 @@
           <w:color w:val="000000"/>
           <w:sz w:val="24"/>
         </w:rPr>
-        <w:t>Table 1 states the local certification dimensions for C3. Under registered leave-one-family-out calibration at matched five rounds, qLogNEI almost never returned a non-empty conservative set (6/320 contrasts; mean certified volume 0.0000094 ≈ 0.019 grid points per contrast), whereas SPADE returned a non-empty set in 116/320 contrasts (mean 0.000864 ≈ 1.73 grid points). Abstentions are scored as zero volume, so these means are unconditional. The SPADE-minus-qLogNEI difference was +0.000855 (95% CI +0.000691 to +0.001028, p &lt; 0.000125; n = 320 paired contrasts). The volume contrast is therefore driven primarily by answer rate rather than by larger regions among answered campaigns: conditional on answering, mean volumes were 0.00238 for SPADE and 0.00050 for qLogNEI (one grid point). Certified volume is the fraction of the 2,000-point scoring grid inside the returned region (one point = 0.0005). No smallest effect of interest was registered for volume; we treat the contrast as directional support for the tested operating-region decision, not universal superiority. The analogous positive three-round claim was withdrawn after extension to 32 seeds.</w:t>
+        <w:t>Table 1 lists the settings for this comparison (C3). In plain terms: after the same number of feedback rounds and the same 48 wells, does SPADE return a trustworthy operating region more usefully than qLogNEI?</w:t>
+      </w:r>
+    </w:p>
+    <w:p>
+      <w:pPr>
+        <w:widowControl/>
+      </w:pPr>
+      <w:r>
+        <w:rPr>
+          <w:rFonts w:ascii="Times New Roman" w:hAnsi="Times New Roman" w:eastAsia="Times New Roman" w:cs="Times New Roman"/>
+          <w:color w:val="000000"/>
+          <w:sz w:val="24"/>
+        </w:rPr>
+        <w:t>Yes—mainly because SPADE answers more often. Under leave-one-family-out calibration, SPADE returned a non-empty region in 116 of 320 paired contrasts (36%), while qLogNEI did so in only 6 of 320 (2%). We score “no region” as volume zero. Average certified volume across all contrasts was therefore 0.000864 for SPADE versus 0.0000094 for qLogNEI (about 1.73 versus 0.019 points on the 2,000-point scoring grid). The average difference was +0.000855. A 95% confidence interval for that average ran from +0.000691 to +0.001028 (entirely above zero); a bootstrap check gave p &lt; 0.000125 (n = 320 paired contrasts).</w:t>
+      </w:r>
+    </w:p>
+    <w:p>
+      <w:pPr>
+        <w:widowControl/>
+      </w:pPr>
+      <w:r>
+        <w:rPr>
+          <w:rFonts w:ascii="Times New Roman" w:hAnsi="Times New Roman" w:eastAsia="Times New Roman" w:cs="Times New Roman"/>
+          <w:color w:val="000000"/>
+          <w:sz w:val="24"/>
+        </w:rPr>
+        <w:t>So the headline is mostly an answer-rate result: qLogNEI almost never certifies anything under these rules. When both methods did answer, SPADE’s regions were still larger on average (0.00238 versus 0.00050, i.e., about one grid point for qLogNEI). Certified volume means the fraction of the scoring grid inside the returned region. We did not pre-register a “how big a volume win counts” threshold, so we treat this as directional support for the region decision—not a claim that SPADE is always best. A similar three-round volume claim was withdrawn after more seeds were run.</w:t>
       </w:r>
     </w:p>
     <w:p>
@@ -1864,7 +1903,7 @@
           <w:color w:val="000000"/>
           <w:sz w:val="20"/>
         </w:rPr>
-        <w:t>Fig 2. SPADE’s primary regional advantage versus qLogNEI.</w:t>
+        <w:t>Fig 2. SPADE’s regional advantage versus qLogNEI and DoE.</w:t>
       </w:r>
       <w:r>
         <w:rPr>
@@ -1872,7 +1911,7 @@
           <w:color w:val="000000"/>
           <w:sz w:val="20"/>
         </w:rPr>
-        <w:t xml:space="preserve"> (A) Certified-volume difference at matched five rounds (+0.000855, 95% CI +0.000691 to +0.001028, p &lt; 0.000125; n = 320), with abstentions scored as zero. SPADE answered 116/320 contrasts versus 6/320 for qLogNEI. (B) Versus DoE at prevalence 0.30: containment among answered regions (SPADE 66/66; screened DoE 85/122; unscreened DoE 77/134). Unconditional contained counts are 66/160, 85/160, and 77/160. (A) Certified-volume difference (SPADE minus qLogNEI) at matched five rounds: +0.000855 (95% CI [+0.000691, +0.001028], p &lt; 0.000125, n = 320). Absolute means were 0.000864 (SPADE) and 0.000009 (qLogNEI) on the 2,000-point grid (one point = 0.0005 of volume). (B) Observed truth containment among answered regions at prevalence 0.30: SPADE 66/66 versus screened DoE 85/122 and unscreened DoE 77/134. Unconditional contained counts are 66/160, 85/160, and 77/160.</w:t>
+        <w:t xml:space="preserve"> (A) How much larger SPADE’s average certified volume is than qLogNEI’s at matched five rounds (+0.000855; 95% CI +0.000691 to +0.001028; p &lt; 0.000125; n = 320), counting “no region” as zero volume. SPADE returned a region in 116/320 comparisons; qLogNEI in 6/320. (B) When each method did return a region versus DoE at prevalence 0.30: SPADE 66/66 correct; screened DoE 85/122; unscreened DoE 77/134. Counting every campaign (including no-answers): 66/160, 85/160, and 77/160 correct. (A) Certified-volume difference at matched five rounds (+0.000855, 95% CI +0.000691 to +0.001028, p &lt; 0.000125; n = 320), with abstentions scored as zero. SPADE answered 116/320 contrasts versus 6/320 for qLogNEI. (B) Versus DoE at prevalence 0.30: containment among answered regions (SPADE 66/66; screened DoE 85/122; unscreened DoE 77/134). Unconditional contained counts are 66/160, 85/160, and 77/160. (A) Certified-volume difference (SPADE minus qLogNEI) at matched five rounds: +0.000855 (95% CI [+0.000691, +0.001028], p &lt; 0.000125, n = 320). Absolute means were 0.000864 (SPADE) and 0.000009 (qLogNEI) on the 2,000-point grid (one point = 0.0005 of volume). (B) Observed truth containment among answered regions at prevalence 0.30: SPADE 66/66 versus screened DoE 85/122 and unscreened DoE 77/134. Unconditional contained counts are 66/160, 85/160, and 77/160.</w:t>
       </w:r>
     </w:p>
     <w:p>
@@ -2375,7 +2414,7 @@
           <w:color w:val="000000"/>
           <w:sz w:val="24"/>
         </w:rPr>
-        <w:t>In DC, SPADE R5 minus qLogNEI R10 regret was -0.0005 (95% CI [-0.0221, +0.0207], p = 0.96, n = 160, five families x 32 seeds). Both used 48 wells. This is no detectable regret difference, not equivalence: the interval extends slightly beyond the registered ±0.02 effect boundary, and neither calendar duration nor cost was measured.</w:t>
+        <w:t>Here the question is recipe quality, not regions (comparison C1). Both methods used 48 wells; SPADE used five rounds and qLogNEI used ten. Average simple regret differed by −0.0005 (SPADE minus qLogNEI), with a 95% confidence interval from −0.0221 to +0.0207 (p = 0.96; n = 160 family–seed pairs). In words: we see no clear winner on the single best recipe, and the interval is wide enough that we also cannot claim the two methods are practically equivalent within the pre-set ±0.02 margin. Calendar time and dollar cost were not measured.</w:t>
       </w:r>
     </w:p>
     <w:p>
@@ -2417,7 +2456,7 @@
           <w:color w:val="000000"/>
           <w:sz w:val="24"/>
         </w:rPr>
-        <w:t>The adverse point result is essential: screened DoE found the better point recipe in three rounds. SPADE R5 minus screened-DoE R3 regret was +0.1026 (95% CI [+0.0486, +0.1578], p = 0.0003, n = 160). SPADE used five rounds.</w:t>
+        <w:t>Against classical DoE the trade-off is clear (Table 2). On finding one best recipe, screened DoE won: SPADE’s regret was worse by +0.1026 (95% CI +0.0486 to +0.1578, p = 0.0003; n = 160). DoE used three rounds; SPADE used five.</w:t>
       </w:r>
     </w:p>
     <w:p>
@@ -2430,7 +2469,7 @@
           <w:color w:val="000000"/>
           <w:sz w:val="24"/>
         </w:rPr>
-        <w:t>Regional evidence moved in the opposite direction (Table 2). At prevalence 0.30, relative noise 0.25, assurance 0.95, 48 wells, and five families × 32 seeds, SPADE selected inflation c = 1 within the same comparison sample, answered 66/160 campaigns, and contained truth in 66/66 answered regions (conditional containment 1.0000; ordinary binomial lower bound 0.9556). Neither DoE arm passed at any tested inflation, so DoE counts are fallback diagnostics at baseline c = 1: screened DoE answered 122/160 with 85 contained (0.6967 among answers); unscreened DoE answered 134/160 with 77 contained (0.5746). SPADE’s inflation was selected on these cells while the DoE arms had no passing inflation to select, so the comparison is not calibration-matched; it reports what each pipeline returns under its own best available setting. Per eligible campaign, contained counts were 66/160 for SPADE versus 85/160 (screened DoE) and 77/160 (unscreened DoE). DoE therefore returns more correct regions on an unconditional count only because it answers more often, including incorrect certificates (37 wrong among screened answers; 57 wrong among unscreened answers). SPADE abstains more often (94/160). Under an asymmetric loss in which a false certified region is treated as a manufacturing failure and abstention is treated as a request for more data, the conditional 66/66 record is the primary regional score and the unconditional gap does not overturn it. These within-sample descriptive results do not condemn DoE as a class or establish transportable coverage.</w:t>
+        <w:t>On trustworthy regions, the ranking flips. At the main region setting (30% of the space truly “good,” moderate noise), SPADE returned a region in 66 of 160 campaigns and every one of those 66 matched truth (100%; statistical lower bound 0.9556). SPADE used a within-sample inflation choice of c = 1. Neither DoE arm passed at any tested inflation, so DoE counts are fallback diagnostics at baseline c = 1: screened DoE answered 122/160 with 85 contained (0.6967 among answers); unscreened DoE answered 134/160 with 77 contained (0.5746). SPADE’s inflation was selected on these cells while the DoE arms had no passing inflation to select, so the comparison is not calibration-matched; it reports what each pipeline returns under its own best available setting. Per eligible campaign, contained counts were 66/160 for SPADE versus 85/160 (screened DoE) and 77/160 (unscreened DoE). DoE therefore returns more correct regions on an unconditional count only because it answers more often, including incorrect certificates (37 wrong among screened answers; 57 wrong among unscreened answers). SPADE abstains more often (94/160). Under an asymmetric loss in which a false certified region is treated as a manufacturing failure and abstention is treated as a request for more data, the conditional 66/66 record is the primary regional score and the unconditional gap does not overturn it. These within-sample descriptive results do not condemn DoE as a class or establish transportable coverage.</w:t>
       </w:r>
     </w:p>
     <w:p>
@@ -3344,7 +3383,7 @@
           <w:color w:val="000000"/>
           <w:sz w:val="20"/>
         </w:rPr>
-        <w:t>Fig 4. Additional locked SPADE evidence (C4 and C6).</w:t>
+        <w:t>Fig 4. Extra SPADE checks (C4 and C6).</w:t>
       </w:r>
       <w:r>
         <w:rPr>
@@ -3352,7 +3391,7 @@
           <w:color w:val="000000"/>
           <w:sz w:val="20"/>
         </w:rPr>
-        <w:t xml:space="preserve"> (A) Point-regret difference LHS minus SPADE at three rounds (+0.0783; higher favors SPADE). n = 80 because C4 uses four Latin-hypercube families × 20 shared seeds (Hill and seeds 20–31 excluded by protocol), unlike the five-family n = 160 contrasts elsewhere. (B) On biology-shaped Hill at prevalence 0.70, SPADE answered 40/64 versus 27/64 for qLogNEI; both contained truth in every answered cell (descriptive; C6). (A) Point-regret advantage of three-round SPADE over one-shot Latin hypercube sampling (LHS minus SPADE = +0.0783; n = 80; locked C4 mean). Higher values favor SPADE. (B) On the biology-shaped Hill family at prevalence 0.70, SPADE answered 40/64 regions versus 27/64 for qLogNEI; both arms contained truth in every answered cell (descriptive counts; C6).</w:t>
+        <w:t xml:space="preserve"> (A) SPADE beats one-shot Latin hypercube sampling on recipe quality at three rounds (advantage +0.0783). Sample size is n = 80 (four families × 20 seeds), not n = 160, by protocol. (B) On a biology-shaped Hill test at prevalence 0.70, SPADE answered more often than qLogNEI (40/64 versus 27/64); every answered region for both methods was correct. (A) Point-regret difference LHS minus SPADE at three rounds (+0.0783; higher favors SPADE). n = 80 because C4 uses four Latin-hypercube families × 20 shared seeds (Hill and seeds 20–31 excluded by protocol), unlike the five-family n = 160 contrasts elsewhere. (B) On biology-shaped Hill at prevalence 0.70, SPADE answered 40/64 versus 27/64 for qLogNEI; both contained truth in every answered cell (descriptive; C6). (A) Point-regret advantage of three-round SPADE over one-shot Latin hypercube sampling (LHS minus SPADE = +0.0783; n = 80; locked C4 mean). Higher values favor SPADE. (B) On the biology-shaped Hill family at prevalence 0.70, SPADE answered 40/64 regions versus 27/64 for qLogNEI; both arms contained truth in every answered cell (descriptive counts; C6).</w:t>
       </w:r>
     </w:p>
     <w:p>
@@ -5385,20 +5424,7 @@
           <w:color w:val="000000"/>
           <w:sz w:val="24"/>
         </w:rPr>
-        <w:t>SPADE performed better for the tested operating-region decision: at matched five rounds it returned greater certified volume than qLogNEI, and its answered DC regions had stronger observed containment than the tested DoE pipelines. That regional conclusion coexists with no detectable point-regret difference from longer qLogNEI, an interval that did not establish equivalence, and a clear adverse result in which three-round DoE found a better point recipe than five-round SPADE.</w:t>
-      </w:r>
-    </w:p>
-    <w:p>
-      <w:pPr>
-        <w:widowControl/>
-      </w:pPr>
-      <w:r>
-        <w:rPr>
-          <w:rFonts w:ascii="Times New Roman" w:hAnsi="Times New Roman" w:eastAsia="Times New Roman" w:cs="Times New Roman"/>
-          <w:color w:val="000000"/>
-          <w:sz w:val="24"/>
-        </w:rPr>
-        <w:t>Choose SPADE when a moderate-noise, fixed-well campaign must return a conservative operating region and may abstain; choose a point optimizer when only one recipe is required. SPADE’s regional advantage is conditional honesty among answered campaigns, not a higher unconditional hit rate than DoE. These computational results do not establish recipe equivalence, manufacturing qualification, regulatory validation, or prospective wet-lab performance.</w:t>
+        <w:t>On this synthetic 48-well benchmark, SPADE is the better tool when the job is a trusted operating region with honest abstention: it returns a region far more often than qLogNEI under the same conservative rules, and when it answers against DoE it stays inside truth. It is not the better tool when the job is only one carry-forward recipe—DoE wins that comparison. Five-round SPADE looks similar to longer qLogNEI on recipe quality without proving equivalence. These computer results do not replace wet-lab validation or regulatory qualification.</w:t>
       </w:r>
     </w:p>
     <w:p>

</xml_diff>

<commit_message>
fix: dedupe Fig 2–4 captions after clarity rewrite
Replace stacked legacy captions with a single plain-English caption per
figure so Word no longer shows three (A)(B) blocks in a row.
</commit_message>
<xml_diff>
--- a/manuscript/SPADE-PLOS-ONE-submission.docx
+++ b/manuscript/SPADE-PLOS-ONE-submission.docx
@@ -1911,7 +1911,7 @@
           <w:color w:val="000000"/>
           <w:sz w:val="20"/>
         </w:rPr>
-        <w:t xml:space="preserve"> (A) How much larger SPADE’s average certified volume is than qLogNEI’s at matched five rounds (+0.000855; 95% CI +0.000691 to +0.001028; p &lt; 0.000125; n = 320), counting “no region” as zero volume. SPADE returned a region in 116/320 comparisons; qLogNEI in 6/320. (B) When each method did return a region versus DoE at prevalence 0.30: SPADE 66/66 correct; screened DoE 85/122; unscreened DoE 77/134. Counting every campaign (including no-answers): 66/160, 85/160, and 77/160 correct. (A) Certified-volume difference at matched five rounds (+0.000855, 95% CI +0.000691 to +0.001028, p &lt; 0.000125; n = 320), with abstentions scored as zero. SPADE answered 116/320 contrasts versus 6/320 for qLogNEI. (B) Versus DoE at prevalence 0.30: containment among answered regions (SPADE 66/66; screened DoE 85/122; unscreened DoE 77/134). Unconditional contained counts are 66/160, 85/160, and 77/160. (A) Certified-volume difference (SPADE minus qLogNEI) at matched five rounds: +0.000855 (95% CI [+0.000691, +0.001028], p &lt; 0.000125, n = 320). Absolute means were 0.000864 (SPADE) and 0.000009 (qLogNEI) on the 2,000-point grid (one point = 0.0005 of volume). (B) Observed truth containment among answered regions at prevalence 0.30: SPADE 66/66 versus screened DoE 85/122 and unscreened DoE 77/134. Unconditional contained counts are 66/160, 85/160, and 77/160.</w:t>
+        <w:t xml:space="preserve"> (A) How much larger SPADE’s average certified volume is than qLogNEI’s at matched five rounds (+0.000855; 95% CI +0.000691 to +0.001028; p &lt; 0.000125; n = 320), counting “no region” as zero volume. SPADE returned a region in 116/320 comparisons; qLogNEI in 6/320. (B) When each method did return a region versus DoE at prevalence 0.30: SPADE 66/66 correct; screened DoE 85/122; unscreened DoE 77/134. Counting every campaign (including no-answers): 66/160, 85/160, and 77/160 correct.</w:t>
       </w:r>
     </w:p>
     <w:p>
@@ -2429,7 +2429,15 @@
           <w:color w:val="000000"/>
           <w:sz w:val="20"/>
         </w:rPr>
-        <w:t>Fig 3. Point-recipe trade-off (secondary to the region decision). (A) SPADE at five rounds minus qLogNEI at ten rounds on simple regret: no detectable difference (-0.0005, 95% CI [-0.0221, +0.0207], n = 160); not claimed as equivalence. (B) SPADE at five rounds minus screened DoE at three rounds: DoE finds the better single recipe (+0.1026, 95% CI [+0.0486, +0.1578]); expected when the goal is one point rather than a region.</w:t>
+        <w:t>Fig 3. Point-recipe trade-off (secondary to the region decision).</w:t>
+      </w:r>
+      <w:r>
+        <w:rPr>
+          <w:rFonts w:ascii="Times New Roman" w:hAnsi="Times New Roman" w:eastAsia="Times New Roman" w:cs="Times New Roman"/>
+          <w:color w:val="000000"/>
+          <w:sz w:val="20"/>
+        </w:rPr>
+        <w:t xml:space="preserve"> (A) SPADE at five rounds versus qLogNEI at ten rounds on simple regret: no clear difference (−0.0005; 95% CI −0.0221 to +0.0207; n = 160)—not claimed as equivalence. (B) SPADE at five rounds versus screened DoE at three rounds: DoE finds the better single recipe (+0.1026; 95% CI +0.0486 to +0.1578).</w:t>
       </w:r>
     </w:p>
     <w:p>
@@ -3391,7 +3399,7 @@
           <w:color w:val="000000"/>
           <w:sz w:val="20"/>
         </w:rPr>
-        <w:t xml:space="preserve"> (A) SPADE beats one-shot Latin hypercube sampling on recipe quality at three rounds (advantage +0.0783). Sample size is n = 80 (four families × 20 seeds), not n = 160, by protocol. (B) On a biology-shaped Hill test at prevalence 0.70, SPADE answered more often than qLogNEI (40/64 versus 27/64); every answered region for both methods was correct. (A) Point-regret difference LHS minus SPADE at three rounds (+0.0783; higher favors SPADE). n = 80 because C4 uses four Latin-hypercube families × 20 shared seeds (Hill and seeds 20–31 excluded by protocol), unlike the five-family n = 160 contrasts elsewhere. (B) On biology-shaped Hill at prevalence 0.70, SPADE answered 40/64 versus 27/64 for qLogNEI; both contained truth in every answered cell (descriptive; C6). (A) Point-regret advantage of three-round SPADE over one-shot Latin hypercube sampling (LHS minus SPADE = +0.0783; n = 80; locked C4 mean). Higher values favor SPADE. (B) On the biology-shaped Hill family at prevalence 0.70, SPADE answered 40/64 regions versus 27/64 for qLogNEI; both arms contained truth in every answered cell (descriptive counts; C6).</w:t>
+        <w:t xml:space="preserve"> (A) SPADE beats one-shot Latin hypercube sampling on recipe quality at three rounds (advantage +0.0783). Sample size is n = 80 (four families × 20 seeds), not n = 160, by protocol. (B) On a biology-shaped Hill test at prevalence 0.70, SPADE answered more often than qLogNEI (40/64 versus 27/64); every answered region for both methods was correct.</w:t>
       </w:r>
     </w:p>
     <w:p>

</xml_diff>

<commit_message>
docs: standardize abstract and Results on certified volume
Use certified volume as the sole size metric name after one plain-English
definition; remove interchangeable “region size” / “bigger region” wording
that could read as a second score.
</commit_message>
<xml_diff>
--- a/manuscript/SPADE-PLOS-ONE-submission.docx
+++ b/manuscript/SPADE-PLOS-ONE-submission.docx
@@ -239,7 +239,7 @@
           <w:color w:val="000000"/>
           <w:sz w:val="24"/>
         </w:rPr>
-        <w:t>With a fixed number of experimental wells, a lab may want either one best recipe or a set of settings it can trust to stay above a quality threshold. Those goals are different, so the “best” method can change with the goal. We tested SPADE (Synthetic Posterior Abstaining Design for Excursions)—software that tries to return a conservative operating region and may say “not sure” instead of guessing—against noisy Bayesian optimization (qLogNEI) and classical response-surface DoE on synthetic test problems, all with the same 48-well budget. Conclusion: on this benchmark, choose SPADE when you need a trusted region; choose DoE (or similar) when you only need one recipe. Against qLogNEI at five matched rounds, SPADE returned a usable region much more often (116 of 320 comparisons versus 6 of 320). When a method returned nothing, we counted volume as zero. Average region size was therefore higher for SPADE (0.000864 versus 0.0000094 on a 2,000-point map; difference +0.000855). A 95% confidence interval for that average difference ran from +0.000691 to +0.001028 and did not include zero; a randomization check gave p &lt; 0.000125. “Certified volume” here means the share of that map inside the region the method is willing to call acceptable. Among the rare times qLogNEI did answer, its regions were still smaller on average (0.00050 versus 0.00238 for SPADE). Against DoE, SPADE’s answered regions always matched truth (66/66), while DoE answered more often but was often wrong. DoE did win at finding a single best recipe. Five-round SPADE looked similar to longer ten-round qLogNEI on recipe quality, without proving they are equivalent. These findings are for synthetic surfaces and moderate noise only—not wet-lab proof.</w:t>
+        <w:t>With a fixed number of experimental wells, a lab may want either one best recipe or a set of settings it can trust to stay above a quality threshold. Those goals are different, so the “best” method can change with the goal. We tested SPADE (Synthetic Posterior Abstaining Design for Excursions)—software that tries to return a conservative operating region and may say “not sure” instead of guessing—against noisy Bayesian optimization (qLogNEI) and classical response-surface DoE on synthetic test problems, all with the same 48-well budget. Conclusion: on this benchmark, choose SPADE when you need a trusted region; choose DoE (or similar) when you only need one recipe. Against qLogNEI at five matched rounds, SPADE returned a usable region much more often (116 of 320 comparisons versus 6 of 320). When a method returned nothing, we counted certified volume as zero. Mean certified volume was therefore higher for SPADE (0.000864 versus 0.0000094 on a 2,000-point scoring grid; difference +0.000855). A 95% confidence interval for that average difference ran from +0.000691 to +0.001028 and did not include zero; a randomization check gave p &lt; 0.000125. Certified volume means the fraction of that scoring grid inside the region the method is willing to call acceptable (one grid point = 0.0005). Among the rare times qLogNEI did answer, its mean certified volume was still lower (0.00050 versus 0.00238 for SPADE). Against DoE, SPADE’s answered regions always matched truth (66/66), while DoE answered more often but was often wrong. DoE did win at finding a single best recipe. Five-round SPADE looked similar to longer ten-round qLogNEI on recipe quality, without proving they are equivalent. These findings are for synthetic surfaces and moderate noise only—not wet-lab proof.</w:t>
       </w:r>
     </w:p>
     <w:p>
@@ -1563,7 +1563,7 @@
           <w:color w:val="000000"/>
           <w:sz w:val="24"/>
         </w:rPr>
-        <w:t>In plain language we score two end-of-run decisions. A point recipe is “pick one setting”; we measure how far that pick is from the true best (simple regret; lower is better). An operating region is “which settings are still good enough?”; we measure how large a conservative region the method returns (certified volume), whether that region sits inside truth when it answers (containment), and how often it refuses to answer (abstention).</w:t>
+        <w:t>In plain language we score two end-of-run decisions. A point recipe is “pick one setting”; we measure how far that pick is from the true best (simple regret; lower is better). An operating region is “which settings are still good enough?”; we measure certified volume (the fraction of the scoring grid inside the returned region), whether that region sits inside truth when it answers (containment), and how often it refuses to answer (abstention).</w:t>
       </w:r>
     </w:p>
     <w:p>
@@ -1862,7 +1862,7 @@
           <w:color w:val="000000"/>
           <w:sz w:val="24"/>
         </w:rPr>
-        <w:t>Table 1 lists the settings for this comparison (C3). In plain terms: after the same number of feedback rounds and the same 48 wells, does SPADE return a trustworthy operating region more usefully than qLogNEI?</w:t>
+        <w:t>Table 1 lists the settings for this comparison (C3). In plain terms: after the same number of feedback rounds and the same 48 wells, does SPADE achieve higher certified volume than qLogNEI under the same regional rules?</w:t>
       </w:r>
     </w:p>
     <w:p>
@@ -1875,7 +1875,7 @@
           <w:color w:val="000000"/>
           <w:sz w:val="24"/>
         </w:rPr>
-        <w:t>Yes—mainly because SPADE answers more often. Under leave-one-family-out calibration, SPADE returned a non-empty region in 116 of 320 paired contrasts (36%), while qLogNEI did so in only 6 of 320 (2%). We score “no region” as volume zero. Average certified volume across all contrasts was therefore 0.000864 for SPADE versus 0.0000094 for qLogNEI (about 1.73 versus 0.019 points on the 2,000-point scoring grid). The average difference was +0.000855. A 95% confidence interval for that average ran from +0.000691 to +0.001028 (entirely above zero); a bootstrap check gave p &lt; 0.000125 (n = 320 paired contrasts).</w:t>
+        <w:t>Yes—mainly because SPADE returns a non-empty region more often, which raises mean certified volume when abstentions count as zero. Under leave-one-family-out calibration, SPADE returned a non-empty region in 116 of 320 paired contrasts (36%), while qLogNEI did so in only 6 of 320 (2%). We score “no region” as volume zero. Average certified volume across all contrasts was therefore 0.000864 for SPADE versus 0.0000094 for qLogNEI (about 1.73 versus 0.019 grid points of certified volume on the 2,000-point scoring grid). The average difference was +0.000855. A 95% confidence interval for that average ran from +0.000691 to +0.001028 (entirely above zero); a bootstrap check gave p &lt; 0.000125 (n = 320 paired contrasts).</w:t>
       </w:r>
     </w:p>
     <w:p>
@@ -1888,7 +1888,7 @@
           <w:color w:val="000000"/>
           <w:sz w:val="24"/>
         </w:rPr>
-        <w:t>So the headline is mostly an answer-rate result: qLogNEI almost never certifies anything under these rules. When both methods did answer, SPADE’s regions were still larger on average (0.00238 versus 0.00050, i.e., about one grid point for qLogNEI). Certified volume means the fraction of the scoring grid inside the returned region. We did not pre-register a “how big a volume win counts” threshold, so we treat this as directional support for the region decision—not a claim that SPADE is always best. A similar three-round volume claim was withdrawn after more seeds were run.</w:t>
+        <w:t>So the headline is mostly an answer-rate result: qLogNEI almost never returns non-zero certified volume under these rules. When both methods did answer, SPADE’s mean certified volume was still higher (0.00238 versus 0.00050, i.e., about one grid point for qLogNEI). We did not pre-register a “how big a volume win counts” threshold, so we treat this as directional support for the region decision—not a claim that SPADE is always best. A similar three-round volume claim was withdrawn after more seeds were run.</w:t>
       </w:r>
     </w:p>
     <w:p>
@@ -1911,7 +1911,7 @@
           <w:color w:val="000000"/>
           <w:sz w:val="20"/>
         </w:rPr>
-        <w:t xml:space="preserve"> (A) How much larger SPADE’s average certified volume is than qLogNEI’s at matched five rounds (+0.000855; 95% CI +0.000691 to +0.001028; p &lt; 0.000125; n = 320), counting “no region” as zero volume. SPADE returned a region in 116/320 comparisons; qLogNEI in 6/320. (B) When each method did return a region versus DoE at prevalence 0.30: SPADE 66/66 correct; screened DoE 85/122; unscreened DoE 77/134. Counting every campaign (including no-answers): 66/160, 85/160, and 77/160 correct.</w:t>
+        <w:t xml:space="preserve"> (A) SPADE’s mean certified volume minus qLogNEI’s than qLogNEI’s at matched five rounds (+0.000855; 95% CI +0.000691 to +0.001028; p &lt; 0.000125; n = 320), counting “no region” as zero volume. SPADE returned a region in 116/320 comparisons; qLogNEI in 6/320. (B) When each method did return a region versus DoE at prevalence 0.30: SPADE 66/66 correct; screened DoE 85/122; unscreened DoE 77/134. Counting every campaign (including no-answers): 66/160, 85/160, and 77/160 correct.</w:t>
       </w:r>
     </w:p>
     <w:p>

</xml_diff>

<commit_message>
docs: remove internal C/S claim codes from PLOS manuscript
Replace C1–C6 and analysis S1–S3 labels with plain comparison names for
journal readers; keep PLOS S1–S3 Table captions and the claims ledger IDs
in publication/CLAIMS-AND-SOURCES.md.
</commit_message>
<xml_diff>
--- a/manuscript/SPADE-PLOS-ONE-submission.docx
+++ b/manuscript/SPADE-PLOS-ONE-submission.docx
@@ -318,7 +318,7 @@
           <w:color w:val="000000"/>
           <w:sz w:val="24"/>
         </w:rPr>
-        <w:t>We report linked findings labeled C1–C6 and S1–S3. C3 asks whether matched five-round SPADE returns greater certified volume than qLogNEI. C1 asks whether five-round SPADE differs detectably from ten-round qLogNEI on point regret. C2 compares regional containment and point regret with one screened and one unscreened response-surface DoE pipeline. C4 asks whether three-round SPADE improves point regret relative to one-shot Latin hypercube sampling. C5 and C6 examine family/prevalence scope. Supporting analyses S2 and S3 diagnose real-data posterior collapse and assay-specific calibration (reported as supporting information summaries). Finally, S1, a real-noise ceiling, and a later development gate that selected no protocol define where positive interpretation must stop.</w:t>
+        <w:t>We report several linked comparisons. The primary regional question is whether matched five-round SPADE returns greater certified volume than qLogNEI. A second question is whether five-round SPADE differs detectably from ten-round qLogNEI on point regret. A third compares regional containment and point regret with one screened and one unscreened response-surface DoE pipeline. We also ask whether three-round SPADE improves point regret relative to one-shot Latin hypercube sampling, and we examine how answer rates vary with family and prevalence. Supporting retrospective analyses diagnose real-data posterior collapse and assay-specific calibration. A failed targeting variant, a real-noise ceiling, and a later development gate that selected no protocol define where positive interpretation must stop.</w:t>
       </w:r>
     </w:p>
     <w:p>
@@ -629,7 +629,7 @@
           <w:color w:val="000000"/>
           <w:sz w:val="24"/>
         </w:rPr>
-        <w:t>DC supplied the one-process point comparison (C1) and DoE comparison (C2). LC supplied the leave-one-family-out matched-round comparison (C3). TAU supplied the prevalence and margin-to-noise analyses (C5/C6). TT tested the proposed targeting mechanism (S1). Retrospective in-house and published Hall–Ogle data supplied supporting uncertainty diagnostics (S2/S3), not prospective validation.</w:t>
+        <w:t>The DC program supplied the one-process point comparison and the DoE comparison. The LC program supplied the leave-one-family-out matched-round volume comparison. The TAU program supplied the prevalence and margin-to-noise analyses. The TT program tested the proposed targeting mechanism. Retrospective in-house and published Hall–Ogle data supplied supporting uncertainty diagnostics, not prospective validation.</w:t>
       </w:r>
     </w:p>
     <w:p>
@@ -1664,7 +1664,7 @@
           <w:color w:val="000000"/>
           <w:sz w:val="24"/>
         </w:rPr>
-        <w:t>C3 selected the smallest posterior inflation c that passed the registered rule on four families and evaluated volume on the held-out fifth family. It pooled prevalence 0.30 and 0.10, yielding five families x 32 seeds x two prevalences = 320 dependent family-seed-prevalence cells. C2 used a weaker procedure: SPADE selected c=1 within the DC cells themselves. Neither DoE arm passed at any tested inflation, so its reported counts are fallback diagnostics at baseline c=1. C2 is within-sample and not transportable; it is not the held-out-family calibration used for C3.</w:t>
+        <w:t>The matched-round volume comparison selected the smallest posterior inflation c that passed the registered rule on four families and evaluated volume on the held-out fifth family. It pooled prevalence 0.30 and 0.10, yielding five families × 32 seeds × two prevalences = 320 dependent family-seed-prevalence cells. The DoE regional comparison used a weaker procedure: SPADE selected c = 1 within the DC cells themselves. Neither DoE arm passed at any tested inflation, so its reported counts are fallback diagnostics at baseline c = 1. That DoE comparison is within-sample and not transportable; it is not the held-out-family calibration used for the matched-round volume comparison.</w:t>
       </w:r>
     </w:p>
     <w:p>
@@ -1717,7 +1717,7 @@
           <w:color w:val="000000"/>
           <w:sz w:val="24"/>
         </w:rPr>
-        <w:t>The C5 Spearman coefficient is descriptive over 25 nested, nonexchangeable family-prevalence cells; no naive independence-based p-value is interpreted.</w:t>
+        <w:t>The family–prevalence Spearman coefficient relating answer rate to margin-to-noise is descriptive over 25 nested, nonexchangeable cells; no naive independence-based p-value is interpreted.</w:t>
       </w:r>
     </w:p>
     <w:p>
@@ -1760,7 +1760,7 @@
           <w:color w:val="000000"/>
           <w:sz w:val="24"/>
         </w:rPr>
-        <w:t xml:space="preserve">. The active PLOS source remains in this repository. Consolidated C1–C6/S1 provenance is pinned to repository commit </w:t>
+        <w:t xml:space="preserve">. The active PLOS source remains in this repository. Consolidated claim provenance is pinned to repository commit </w:t>
       </w:r>
       <w:r>
         <w:rPr>
@@ -1862,7 +1862,7 @@
           <w:color w:val="000000"/>
           <w:sz w:val="24"/>
         </w:rPr>
-        <w:t>Table 1 lists the settings for this comparison (C3). In plain terms: after the same number of feedback rounds and the same 48 wells, does SPADE achieve higher certified volume than qLogNEI under the same regional rules?</w:t>
+        <w:t>Table 1 lists the settings for this matched-round volume comparison. In plain terms: after the same number of feedback rounds and the same 48 wells, does SPADE achieve higher certified volume than qLogNEI under the same regional rules?</w:t>
       </w:r>
     </w:p>
     <w:p>
@@ -1911,7 +1911,7 @@
           <w:color w:val="000000"/>
           <w:sz w:val="20"/>
         </w:rPr>
-        <w:t xml:space="preserve"> (A) SPADE’s mean certified volume minus qLogNEI’s than qLogNEI’s at matched five rounds (+0.000855; 95% CI +0.000691 to +0.001028; p &lt; 0.000125; n = 320), counting “no region” as zero volume. SPADE returned a region in 116/320 comparisons; qLogNEI in 6/320. (B) When each method did return a region versus DoE at prevalence 0.30: SPADE 66/66 correct; screened DoE 85/122; unscreened DoE 77/134. Counting every campaign (including no-answers): 66/160, 85/160, and 77/160 correct.</w:t>
+        <w:t xml:space="preserve"> (A) Mean certified-volume difference (SPADE minus qLogNEI) at matched five rounds (+0.000855; 95% CI +0.000691 to +0.001028; p &lt; 0.000125; n = 320), counting “no region” as zero volume. SPADE returned a region in 116/320 comparisons; qLogNEI in 6/320. (B) When each method did return a region versus DoE at prevalence 0.30: SPADE 66/66 correct; screened DoE 85/122; unscreened DoE 77/134. Counting every campaign (including no-answers): 66/160, 85/160, and 77/160 correct.</w:t>
       </w:r>
     </w:p>
     <w:p>
@@ -1927,7 +1927,7 @@
           <w:color w:val="000000"/>
           <w:sz w:val="24"/>
         </w:rPr>
-        <w:t>Table 1. C3 matched-round regional comparison.</w:t>
+        <w:t>Table 1. Matched-round certified-volume comparison (SPADE vs qLogNEI).</w:t>
       </w:r>
     </w:p>
     <w:tbl>
@@ -2414,7 +2414,7 @@
           <w:color w:val="000000"/>
           <w:sz w:val="24"/>
         </w:rPr>
-        <w:t>Here the question is recipe quality, not regions (comparison C1). Both methods used 48 wells; SPADE used five rounds and qLogNEI used ten. Average simple regret differed by −0.0005 (SPADE minus qLogNEI), with a 95% confidence interval from −0.0221 to +0.0207 (p = 0.96; n = 160 family–seed pairs). In words: we see no clear winner on the single best recipe, and the interval is wide enough that we also cannot claim the two methods are practically equivalent within the pre-set ±0.02 margin. Calendar time and dollar cost were not measured.</w:t>
+        <w:t>Here the question is recipe quality, not regions. Both methods used 48 wells; SPADE used five rounds and qLogNEI used ten. Average simple regret differed by −0.0005 (SPADE minus qLogNEI), with a 95% confidence interval from −0.0221 to +0.0207 (p = 0.96; n = 160 family–seed pairs). In words: we see no clear winner on the single best recipe, and the interval is wide enough that we also cannot claim the two methods are practically equivalent within the pre-set ±0.02 margin. Calendar time and dollar cost were not measured.</w:t>
       </w:r>
     </w:p>
     <w:p>
@@ -2493,7 +2493,7 @@
           <w:color w:val="000000"/>
           <w:sz w:val="24"/>
         </w:rPr>
-        <w:t>Table 2. C2 regional answers and point trade-off.</w:t>
+        <w:t>Table 2. Regional answers and point trade-off versus DoE.</w:t>
       </w:r>
     </w:p>
     <w:tbl>
@@ -3391,7 +3391,7 @@
           <w:color w:val="000000"/>
           <w:sz w:val="20"/>
         </w:rPr>
-        <w:t>Fig 4. Extra SPADE checks (C4 and C6).</w:t>
+        <w:t>Fig 4. Extra SPADE checks versus space-filling sampling and on Hill.</w:t>
       </w:r>
       <w:r>
         <w:rPr>
@@ -3466,7 +3466,7 @@
           <w:color w:val="000000"/>
           <w:sz w:val="24"/>
         </w:rPr>
-        <w:t>Treating the fitted GP mean as fixed had little effect in synthetic diagnostics: mean-marginalised posterior width increased by 1.004x–1.011x. The same correction increased mean posterior marginal SD approximately 484x for the in-house candidate dataset and 297x for published Hall–Ogle data. Observation-prediction LOO inflation was assay-specific (c=0.712 in-house and c=0.526 published). These S2/S3 values are retrospective, stdout-reproduced support without structured numerical guards. LOO prediction does not identify latent-function uncertainty, and the in-house CD31 gates remain awaiting human confirmation.</w:t>
+        <w:t>Treating the fitted GP mean as fixed had little effect in synthetic diagnostics: mean-marginalised posterior width increased by 1.004x–1.011x. The same correction increased mean posterior marginal SD approximately 484x for the in-house candidate dataset and 297x for published Hall–Ogle data. Observation-prediction LOO inflation was assay-specific (c=0.712 in-house and c=0.526 published). These retrospective values are stdout-reproduced support without structured numerical guards. LOO prediction does not identify latent-function uncertainty, and the in-house CD31 gates remain awaiting human confirmation.</w:t>
       </w:r>
     </w:p>
     <w:p>
@@ -4143,7 +4143,7 @@
           <w:color w:val="000000"/>
           <w:sz w:val="24"/>
         </w:rPr>
-        <w:t>Inference is conditional on the frozen benchmark. The flat-cell bootstrap may be too narrow because repeated family-seed-prevalence cells are dependent. Pooled binomial bounds do not become cluster-aware merely because they are exact under an ordinary Bernoulli model. C2 calibration is within-sample; only C3 holds a family out during inflation selection. Neither procedure supplies distribution-free or regulatory coverage.</w:t>
+        <w:t>Inference is conditional on the frozen benchmark. The flat-cell bootstrap may be too narrow because repeated family-seed-prevalence cells are dependent. Pooled binomial bounds do not become cluster-aware merely because they are exact under an ordinary Bernoulli model. DoE-comparison calibration is within-sample; only the matched-round volume comparison holds a family out during inflation selection. Neither procedure supplies distribution-free or regulatory coverage.</w:t>
       </w:r>
     </w:p>
     <w:p>
@@ -5888,7 +5888,7 @@
           <w:color w:val="000000"/>
           <w:sz w:val="24"/>
         </w:rPr>
-        <w:t xml:space="preserve">Main text Figures 1–4 follow the region-first presentation: method selection (Fig 1), SPADE’s certified-volume and containment advantage (Fig 2), the secondary point-recipe trade-off (Fig 3), and additional locked SPADE evidence C4/C6 (Fig 4). Numeric sources are in </w:t>
+        <w:t xml:space="preserve">Main text Figures 1–4 follow the region-first presentation: method selection (Fig 1), SPADE’s certified-volume and containment advantage (Fig 2), the secondary point-recipe trade-off (Fig 3), and additional SPADE checks versus space-filling sampling and on Hill (Fig 4). Numeric sources are in </w:t>
       </w:r>
       <w:r>
         <w:rPr>
@@ -5955,7 +5955,7 @@
           <w:color w:val="000000"/>
           <w:sz w:val="24"/>
         </w:rPr>
-        <w:t>Motivation only; not a current C1 claim.</w:t>
+        <w:t>Motivation only; not part of the current point-regret comparison.</w:t>
       </w:r>
     </w:p>
     <w:p>
@@ -5990,7 +5990,7 @@
           <w:color w:val="000000"/>
           <w:sz w:val="24"/>
         </w:rPr>
-        <w:t>Motivation only; not a current C3 claim.</w:t>
+        <w:t>Motivation only; not part of the current matched-round volume comparison.</w:t>
       </w:r>
     </w:p>
     <w:p>
@@ -6025,7 +6025,7 @@
           <w:color w:val="000000"/>
           <w:sz w:val="24"/>
         </w:rPr>
-        <w:t>These do not replace empirical containment or the C3 certified-volume result.</w:t>
+        <w:t>These do not replace empirical containment or the matched-round certified-volume result.</w:t>
       </w:r>
     </w:p>
     <w:sectPr>

</xml_diff>

<commit_message>
docs: define DC, LC, TAU, and TT at first mention
Expand the study-program abbreviations in Materials and Methods so readers
meet the full names before the short labels.
</commit_message>
<xml_diff>
--- a/manuscript/SPADE-PLOS-ONE-submission.docx
+++ b/manuscript/SPADE-PLOS-ONE-submission.docx
@@ -359,7 +359,7 @@
           <w:color w:val="000000"/>
           <w:sz w:val="24"/>
         </w:rPr>
-        <w:t>The confirmatory DC and LC programs used five synthetic response families—Ackley, Hartmann6, biphasic Hill, Levy, and Rosenbrock—32 deterministic seeds per family, six normalized factors, 48 measured wells, and relative observation noise 0.25. TAU used 64 seeds per family. Hill varied by registered instance; other evaluators used fixed landscapes with design and noise varying by seed. Known latent truth was used only for synthetic scoring. These landscapes are structural test functions, not fits to endothelial-cell measurements.</w:t>
+        <w:t>The confirmatory one-process comparison program (DC) and leave-one-family-out matched-round program (LC) used five synthetic response families—Ackley, Hartmann6, biphasic Hill, Levy, and Rosenbrock—32 deterministic seeds per family, six normalized factors, 48 measured wells, and relative observation noise 0.25. The prevalence and margin-to-noise program (TAU) used 64 seeds per family. Hill varied by registered instance; other evaluators used fixed landscapes with design and noise varying by seed. Known latent truth was used only for synthetic scoring. These landscapes are structural test functions, not fits to endothelial-cell measurements.</w:t>
       </w:r>
     </w:p>
     <w:p>
@@ -629,7 +629,7 @@
           <w:color w:val="000000"/>
           <w:sz w:val="24"/>
         </w:rPr>
-        <w:t>The DC program supplied the one-process point comparison and the DoE comparison. The LC program supplied the leave-one-family-out matched-round volume comparison. The TAU program supplied the prevalence and margin-to-noise analyses. The TT program tested the proposed targeting mechanism. Retrospective in-house and published Hall–Ogle data supplied supporting uncertainty diagnostics, not prospective validation.</w:t>
+        <w:t>DC supplied the one-process point comparison and the DoE comparison. LC supplied the leave-one-family-out matched-round volume comparison. TAU supplied the prevalence and margin-to-noise analyses. A separate targeting-test program (TT) tested the proposed targeting mechanism. Retrospective in-house and published Hall–Ogle data supplied supporting uncertainty diagnostics, not prospective validation.</w:t>
       </w:r>
     </w:p>
     <w:p>

</xml_diff>

<commit_message>
docs: fix Table 2 footnote escape and define Rn shorthand
Drop the leaked Markdown backslash before the Unscreened DoE
asterisk footnote, and state that Rn means an n-round schedule
before R3/R5 appear in Methods and tables.
</commit_message>
<xml_diff>
--- a/manuscript/SPADE-PLOS-ONE-submission.docx
+++ b/manuscript/SPADE-PLOS-ONE-submission.docx
@@ -642,7 +642,7 @@
           <w:color w:val="000000"/>
           <w:sz w:val="24"/>
         </w:rPr>
-        <w:t>All synthetic arms used 48 wells. SPADE at three rounds used an opening of 32 followed by two batches of 8; SPADE at five rounds used an opening of 16 followed by four batches of 8. Matched qLogNEI R3 and R5 used the same respective allocations. qLogNEI R10 used a 14-point Sobol opening, eight batches of four, and a final batch of two. The screened DoE R3 workflow used a 20-run six-factor screen, a 27-run four-factor face-centred response-surface design, and one confirmation well. The registered unscreened comparator omitted screening, used one 47-run full-dimensional face-centred central-composite design, and measured one confirmation well; it retained the protocol's DoE R3 comparator label even though its executed measurements comprise design and confirmation stages. Equal wells therefore did not mean equal sequential rounds.</w:t>
+        <w:t>All synthetic arms used 48 wells. We write Rn for an n-round schedule (for example, R5 means five sequential rounds). SPADE at three rounds used an opening of 32 followed by two batches of 8; SPADE at five rounds used an opening of 16 followed by four batches of 8. Matched qLogNEI R3 and R5 used the same respective allocations. qLogNEI R10 used a 14-point Sobol opening, eight batches of four, and a final batch of two. The screened DoE R3 workflow used a 20-run six-factor screen, a 27-run four-factor face-centred response-surface design, and one confirmation well. The registered unscreened comparator omitted screening, used one 47-run full-dimensional face-centred central-composite design, and measured one confirmation well; it retained the protocol's DoE R3 comparator label even though its executed measurements comprise design and confirmation stages. Equal wells therefore did not mean equal sequential rounds.</w:t>
       </w:r>
     </w:p>
     <w:p>
@@ -3376,7 +3376,7 @@
           <w:color w:val="000000"/>
           <w:sz w:val="24"/>
         </w:rPr>
-        <w:t>\*Unscreened DoE executes a design stage plus one confirmation well (two measurement stages) but retains the protocol’s “R3” comparator label.</w:t>
+        <w:t>*Unscreened DoE executes a design stage plus one confirmation well (two measurement stages) but retains the protocol’s “R3” comparator label.</w:t>
       </w:r>
     </w:p>
     <w:p>

</xml_diff>

<commit_message>
docs: restore abstract balances, small-region scope, LOFO family table
Put 66/160 vs 85/160 and +0.1026 back in the abstract, state that all
six qLogNEI answers are one grid point, link small certified volumes to
margin-to-noise and the noise ceiling, collapse duplicate outcome
definitions, tidy Results register, and add descriptive Table 1a.
</commit_message>
<xml_diff>
--- a/manuscript/SPADE-PLOS-ONE-submission.docx
+++ b/manuscript/SPADE-PLOS-ONE-submission.docx
@@ -239,7 +239,7 @@
           <w:color w:val="000000"/>
           <w:sz w:val="24"/>
         </w:rPr>
-        <w:t>With a fixed number of experimental wells, a lab may want either one best recipe or a set of settings it can trust to stay above a quality threshold. Those goals are different, so the “best” method can change with the goal. We tested SPADE (Synthetic Posterior Abstaining Design for Excursions)—software that tries to return a conservative operating region and may say “not sure” instead of guessing—against noisy Bayesian optimization (qLogNEI) and classical response-surface DoE on synthetic test problems, all with the same 48-well budget. Conclusion: on this benchmark, choose SPADE when you need a trusted region; choose DoE (or similar) when you only need one recipe. Against qLogNEI at five matched rounds, SPADE returned a usable region much more often (116 of 320 comparisons versus 6 of 320). When a method returned nothing, we counted certified volume as zero. Mean certified volume was therefore higher for SPADE (0.000864 versus 0.0000094 on a 2,000-point scoring grid; difference +0.000855). A 95% confidence interval for that average difference ran from +0.000691 to +0.001028 and did not include zero; a randomization check gave p &lt; 0.000125. Certified volume means the fraction of that scoring grid inside the region the method is willing to call acceptable (one grid point = 0.0005). Among the rare times qLogNEI did answer, its mean certified volume was still lower (0.00050 versus 0.00238 for SPADE). Against DoE, SPADE’s answered regions always matched truth (66/66), while DoE answered more often but was often wrong. DoE did win at finding a single best recipe. Five-round SPADE looked similar to longer ten-round qLogNEI on recipe quality, without proving they are equivalent. These findings are for synthetic surfaces and moderate noise only—not wet-lab proof.</w:t>
+        <w:t>With a fixed number of experimental wells, a laboratory may need either one best recipe or a set of settings expected to remain above a quality threshold. Those goals differ, so method rankings can change with the decision. We compared SPADE (Synthetic Posterior Abstaining Design for Excursions)—an abstaining conservative-region procedure—with noisy Bayesian optimization (qLogNEI) and classical response-surface DoE on synthetic test problems under a shared 48-well budget. On this benchmark, choose SPADE when the deliverable is a trusted operating region; choose DoE when only one recipe is needed. Against qLogNEI at five matched rounds, SPADE returned a usable region far more often (116 of 320 comparisons versus 6 of 320). Abstentions were scored as zero certified volume, so mean certified volume was higher for SPADE (0.000864 versus 0.0000094 on a 2,000-point scoring grid; difference +0.000855; 95% CI +0.000691 to +0.001028; p &lt; 0.000125). Certified volume is the fraction of that grid inside the returned region (one grid point = 0.0005). All six qLogNEI answers were exactly one grid point; SPADE’s conditional mean among answers was 0.00238. Against DoE, SPADE’s answered regions always matched truth (66/66), though counting every campaign screened DoE returned more correct regions (85/160 versus 66/160) because it answers more often and sometimes wrongly. Screened DoE won on single-recipe quality (SPADE−DoE regret +0.1026). Five-round SPADE showed no detectable regret difference from ten-round qLogNEI (−0.0005), without proving equivalence. Results are for synthetic surfaces and moderate noise only—not wet-lab proof.</w:t>
       </w:r>
     </w:p>
     <w:p>
@@ -1563,7 +1563,7 @@
           <w:color w:val="000000"/>
           <w:sz w:val="24"/>
         </w:rPr>
-        <w:t>In plain language we score two end-of-run decisions. A point recipe is “pick one setting”; we measure how far that pick is from the true best (simple regret; lower is better). An operating region is “which settings are still good enough?”; we measure certified volume (the fraction of the scoring grid inside the returned region), whether that region sits inside truth when it answers (containment), and how often it refuses to answer (abstention).</w:t>
+        <w:t>We score two end-of-run decisions: a point recipe (simple regret) and an operating region (certified volume, truth containment when the method answers, and abstention).</w:t>
       </w:r>
     </w:p>
     <w:p>
@@ -1651,7 +1651,7 @@
           <w:color w:val="000000"/>
           <w:sz w:val="24"/>
         </w:rPr>
-        <w:t>A regional answered outcome was a non-empty returned conservative set. contained recorded whether an answered set was a subset of the known synthetic acceptable region; answer rate was answered divided by eligible cells, conditional empirical containment was contained divided by answered, and certified volume was the returned fraction of the 2,000-point scoring grid. Abstention was not counted as containment. The registered cross-cell gate required a one-sided 95% Clopper–Pearson lower bound of at least 0.90 among answered cells and answer rate of at least 0.05.</w:t>
+        <w:t>A regional answered outcome was a non-empty returned conservative set. contained recorded whether an answered set was a subset of the known synthetic acceptable region; answer rate was answered divided by eligible cells; conditional empirical containment was contained divided by answered; and certified volume was the returned fraction of the 2,000-point scoring grid. Abstention was not counted as containment. The registered cross-cell gate required a one-sided 95% Clopper–Pearson lower bound of at least 0.90 among answered cells and answer rate of at least 0.05.</w:t>
       </w:r>
     </w:p>
     <w:p>
@@ -1862,7 +1862,7 @@
           <w:color w:val="000000"/>
           <w:sz w:val="24"/>
         </w:rPr>
-        <w:t>Table 1 lists the settings for this matched-round volume comparison. In plain terms: after the same number of feedback rounds and the same 48 wells, does SPADE achieve higher certified volume than qLogNEI under the same regional rules?</w:t>
+        <w:t>Table 1 lists the settings for this matched-round volume comparison. After the same number of feedback rounds and the same 48 wells, does SPADE achieve higher certified volume than qLogNEI under the same regional rules?</w:t>
       </w:r>
     </w:p>
     <w:p>
@@ -1875,7 +1875,7 @@
           <w:color w:val="000000"/>
           <w:sz w:val="24"/>
         </w:rPr>
-        <w:t>Yes—mainly because SPADE returns a non-empty region more often, which raises mean certified volume when abstentions count as zero. Under leave-one-family-out calibration, SPADE returned a non-empty region in 116 of 320 paired contrasts (36%), while qLogNEI did so in only 6 of 320 (2%). We score “no region” as volume zero. Average certified volume across all contrasts was therefore 0.000864 for SPADE versus 0.0000094 for qLogNEI (about 1.73 versus 0.019 grid points of certified volume on the 2,000-point scoring grid). The average difference was +0.000855. A 95% confidence interval for that average ran from +0.000691 to +0.001028 (entirely above zero); a bootstrap check gave p &lt; 0.000125 (n = 320 paired contrasts).</w:t>
+        <w:t>SPADE returns a non-empty region more often, which raises mean certified volume when abstentions count as zero. Under leave-one-family-out calibration, SPADE returned a non-empty region in 116 of 320 paired contrasts (36%), while qLogNEI did so in only 6 of 320 (2%). We score “no region” as volume zero. Average certified volume across all contrasts was therefore 0.000864 for SPADE versus 0.0000094 for qLogNEI (about 1.73 versus 0.019 grid points of certified volume on the 2,000-point scoring grid). The average difference was +0.000855. A 95% confidence interval for that average ran from +0.000691 to +0.001028 (entirely above zero); a bootstrap check gave p &lt; 0.000125 (n = 320 paired contrasts).</w:t>
       </w:r>
     </w:p>
     <w:p>
@@ -1888,7 +1888,20 @@
           <w:color w:val="000000"/>
           <w:sz w:val="24"/>
         </w:rPr>
-        <w:t>So the headline is mostly an answer-rate result: qLogNEI almost never returns non-zero certified volume under these rules. When both methods did answer, SPADE’s mean certified volume was still higher (0.00238 versus 0.00050, i.e., about one grid point for qLogNEI). We did not pre-register a “how big a volume win counts” threshold, so we treat this as directional support for the region decision—not a claim that SPADE is always best. A similar three-round volume claim was withdrawn after more seeds were run.</w:t>
+        <w:t>The headline is therefore mostly an answer-rate result: qLogNEI almost never returns non-zero certified volume under these rules. When a method did answer, SPADE’s mean certified volume was still higher (0.00238 versus 0.00050). All six qLogNEI answers were exactly one scoring-grid point (volume 0.0005); SPADE’s answered regions averaged about 4.8 grid points. We did not pre-register a smallest effect of interest for certified volume, so we treat this as directional support for the region decision—not a claim that SPADE is always best. A similar three-round volume claim was withdrawn after more seeds were run.</w:t>
+      </w:r>
+    </w:p>
+    <w:p>
+      <w:pPr>
+        <w:widowControl/>
+      </w:pPr>
+      <w:r>
+        <w:rPr>
+          <w:rFonts w:ascii="Times New Roman" w:hAnsi="Times New Roman" w:eastAsia="Times New Roman" w:cs="Times New Roman"/>
+          <w:color w:val="000000"/>
+          <w:sz w:val="24"/>
+        </w:rPr>
+        <w:t>Table 1a reports leave-one-family-out answer counts by family. SPADE answered more often than qLogNEI in four of five families; both arms returned zero answers on Rosenbrock under the selected inflations. These family-level counts are descriptive summaries of the same LOFO comparison and are not a separate confirmatory test.</w:t>
       </w:r>
     </w:p>
     <w:p>
@@ -2392,6 +2405,982 @@
     </w:p>
     <w:p>
       <w:pPr>
+        <w:widowControl/>
+      </w:pPr>
+      <w:r>
+        <w:rPr>
+          <w:rFonts w:ascii="Times New Roman" w:hAnsi="Times New Roman" w:eastAsia="Times New Roman" w:cs="Times New Roman"/>
+          <w:b/>
+          <w:color w:val="000000"/>
+          <w:sz w:val="24"/>
+        </w:rPr>
+        <w:t>Table 1a. Leave-one-family-out answer counts by family (SPADE vs qLogNEI, R5).</w:t>
+      </w:r>
+      <w:r>
+        <w:rPr>
+          <w:rFonts w:ascii="Times New Roman" w:hAnsi="Times New Roman" w:eastAsia="Times New Roman" w:cs="Times New Roman"/>
+          <w:color w:val="000000"/>
+          <w:sz w:val="24"/>
+        </w:rPr>
+        <w:t xml:space="preserve"> Each cell pools prevalences 0.30 and 0.10 (64 family–seed–prevalence cells). Inflation \(c\) is selected on the other four families; volume scoring uses the held-out family’s selected \(c\) (or baseline \(c=1\) with forced zero volume when no \(c\) passes). Totals match the 116/320 versus 6/320 headline.</w:t>
+      </w:r>
+    </w:p>
+    <w:tbl>
+      <w:tblPr>
+        <w:tblStyle w:val="TableGrid"/>
+        <w:tblW w:type="dxa" w:w="9360"/>
+        <w:jc w:val="left"/>
+        <w:tblLayout w:type="fixed"/>
+        <w:tblLook w:firstColumn="1" w:firstRow="1" w:lastColumn="0" w:lastRow="0" w:noHBand="0" w:noVBand="1" w:val="04A0"/>
+        <w:tblBorders>
+          <w:top w:val="single" w:sz="4" w:color="D9D9D9"/>
+          <w:left w:val="single" w:sz="4" w:color="D9D9D9"/>
+          <w:bottom w:val="single" w:sz="4" w:color="D9D9D9"/>
+          <w:right w:val="single" w:sz="4" w:color="D9D9D9"/>
+          <w:insideH w:val="single" w:sz="4" w:color="D9D9D9"/>
+          <w:insideV w:val="single" w:sz="4" w:color="D9D9D9"/>
+        </w:tblBorders>
+        <w:tblInd w:w="120" w:type="dxa"/>
+      </w:tblPr>
+      <w:tblGrid>
+        <w:gridCol w:w="3000"/>
+        <w:gridCol w:w="1050"/>
+        <w:gridCol w:w="1050"/>
+        <w:gridCol w:w="2100"/>
+        <w:gridCol w:w="2160"/>
+      </w:tblGrid>
+      <w:tr>
+        <w:trPr>
+          <w:cantSplit/>
+          <w:tblHeader w:val="true"/>
+        </w:trPr>
+        <w:tc>
+          <w:tcPr>
+            <w:tcW w:type="dxa" w:w="3000"/>
+            <w:shd w:fill="E7E6E6"/>
+            <w:vAlign w:val="center"/>
+            <w:tcMar>
+              <w:top w:w="80" w:type="dxa"/>
+              <w:bottom w:w="80" w:type="dxa"/>
+              <w:start w:w="120" w:type="dxa"/>
+              <w:end w:w="120" w:type="dxa"/>
+            </w:tcMar>
+          </w:tcPr>
+          <w:p>
+            <w:pPr>
+              <w:spacing w:before="0" w:after="0" w:line="240" w:lineRule="auto"/>
+            </w:pPr>
+            <w:r>
+              <w:rPr>
+                <w:rFonts w:ascii="Times New Roman" w:hAnsi="Times New Roman" w:eastAsia="Times New Roman" w:cs="Times New Roman"/>
+                <w:b/>
+                <w:color w:val="000000"/>
+                <w:sz w:val="17"/>
+              </w:rPr>
+              <w:t>Family</w:t>
+            </w:r>
+          </w:p>
+        </w:tc>
+        <w:tc>
+          <w:tcPr>
+            <w:tcW w:type="dxa" w:w="1050"/>
+            <w:shd w:fill="E7E6E6"/>
+            <w:vAlign w:val="center"/>
+            <w:tcMar>
+              <w:top w:w="80" w:type="dxa"/>
+              <w:bottom w:w="80" w:type="dxa"/>
+              <w:start w:w="120" w:type="dxa"/>
+              <w:end w:w="120" w:type="dxa"/>
+            </w:tcMar>
+          </w:tcPr>
+          <w:p>
+            <w:pPr>
+              <w:spacing w:before="0" w:after="0" w:line="240" w:lineRule="auto"/>
+            </w:pPr>
+            <w:r>
+              <w:rPr>
+                <w:rFonts w:ascii="Times New Roman" w:hAnsi="Times New Roman" w:eastAsia="Times New Roman" w:cs="Times New Roman"/>
+                <w:b/>
+                <w:color w:val="000000"/>
+                <w:sz w:val="17"/>
+              </w:rPr>
+              <w:t>SPADE answers</w:t>
+            </w:r>
+          </w:p>
+        </w:tc>
+        <w:tc>
+          <w:tcPr>
+            <w:tcW w:type="dxa" w:w="1050"/>
+            <w:shd w:fill="E7E6E6"/>
+            <w:vAlign w:val="center"/>
+            <w:tcMar>
+              <w:top w:w="80" w:type="dxa"/>
+              <w:bottom w:w="80" w:type="dxa"/>
+              <w:start w:w="120" w:type="dxa"/>
+              <w:end w:w="120" w:type="dxa"/>
+            </w:tcMar>
+          </w:tcPr>
+          <w:p>
+            <w:pPr>
+              <w:spacing w:before="0" w:after="0" w:line="240" w:lineRule="auto"/>
+            </w:pPr>
+            <w:r>
+              <w:rPr>
+                <w:rFonts w:ascii="Times New Roman" w:hAnsi="Times New Roman" w:eastAsia="Times New Roman" w:cs="Times New Roman"/>
+                <w:b/>
+                <w:color w:val="000000"/>
+                <w:sz w:val="17"/>
+              </w:rPr>
+              <w:t>qLogNEI answers</w:t>
+            </w:r>
+          </w:p>
+        </w:tc>
+        <w:tc>
+          <w:tcPr>
+            <w:tcW w:type="dxa" w:w="2100"/>
+            <w:shd w:fill="E7E6E6"/>
+            <w:vAlign w:val="center"/>
+            <w:tcMar>
+              <w:top w:w="80" w:type="dxa"/>
+              <w:bottom w:w="80" w:type="dxa"/>
+              <w:start w:w="120" w:type="dxa"/>
+              <w:end w:w="120" w:type="dxa"/>
+            </w:tcMar>
+          </w:tcPr>
+          <w:p>
+            <w:pPr>
+              <w:spacing w:before="0" w:after="0" w:line="240" w:lineRule="auto"/>
+            </w:pPr>
+            <w:r>
+              <w:rPr>
+                <w:rFonts w:ascii="Times New Roman" w:hAnsi="Times New Roman" w:eastAsia="Times New Roman" w:cs="Times New Roman"/>
+                <w:b/>
+                <w:color w:val="000000"/>
+                <w:sz w:val="17"/>
+              </w:rPr>
+              <w:t>SPADE selected \(c\)</w:t>
+            </w:r>
+          </w:p>
+        </w:tc>
+        <w:tc>
+          <w:tcPr>
+            <w:tcW w:type="dxa" w:w="2160"/>
+            <w:shd w:fill="E7E6E6"/>
+            <w:vAlign w:val="center"/>
+            <w:tcMar>
+              <w:top w:w="80" w:type="dxa"/>
+              <w:bottom w:w="80" w:type="dxa"/>
+              <w:start w:w="120" w:type="dxa"/>
+              <w:end w:w="120" w:type="dxa"/>
+            </w:tcMar>
+          </w:tcPr>
+          <w:p>
+            <w:pPr>
+              <w:spacing w:before="0" w:after="0" w:line="240" w:lineRule="auto"/>
+            </w:pPr>
+            <w:r>
+              <w:rPr>
+                <w:rFonts w:ascii="Times New Roman" w:hAnsi="Times New Roman" w:eastAsia="Times New Roman" w:cs="Times New Roman"/>
+                <w:b/>
+                <w:color w:val="000000"/>
+                <w:sz w:val="17"/>
+              </w:rPr>
+              <w:t>qLogNEI selected \(c\)</w:t>
+            </w:r>
+          </w:p>
+        </w:tc>
+      </w:tr>
+      <w:tr>
+        <w:trPr>
+          <w:cantSplit/>
+        </w:trPr>
+        <w:tc>
+          <w:tcPr>
+            <w:tcW w:type="dxa" w:w="3000"/>
+            <w:vAlign w:val="center"/>
+            <w:tcMar>
+              <w:top w:w="80" w:type="dxa"/>
+              <w:bottom w:w="80" w:type="dxa"/>
+              <w:start w:w="120" w:type="dxa"/>
+              <w:end w:w="120" w:type="dxa"/>
+            </w:tcMar>
+          </w:tcPr>
+          <w:p>
+            <w:pPr>
+              <w:spacing w:before="0" w:after="0" w:line="240" w:lineRule="auto"/>
+            </w:pPr>
+            <w:r>
+              <w:rPr>
+                <w:rFonts w:ascii="Times New Roman" w:hAnsi="Times New Roman" w:eastAsia="Times New Roman" w:cs="Times New Roman"/>
+                <w:color w:val="000000"/>
+                <w:sz w:val="17"/>
+              </w:rPr>
+              <w:t>Ackley</w:t>
+            </w:r>
+          </w:p>
+        </w:tc>
+        <w:tc>
+          <w:tcPr>
+            <w:tcW w:type="dxa" w:w="1050"/>
+            <w:vAlign w:val="center"/>
+            <w:tcMar>
+              <w:top w:w="80" w:type="dxa"/>
+              <w:bottom w:w="80" w:type="dxa"/>
+              <w:start w:w="120" w:type="dxa"/>
+              <w:end w:w="120" w:type="dxa"/>
+            </w:tcMar>
+          </w:tcPr>
+          <w:p>
+            <w:pPr>
+              <w:spacing w:before="0" w:after="0" w:line="240" w:lineRule="auto"/>
+            </w:pPr>
+            <w:r>
+              <w:rPr>
+                <w:rFonts w:ascii="Times New Roman" w:hAnsi="Times New Roman" w:eastAsia="Times New Roman" w:cs="Times New Roman"/>
+                <w:color w:val="000000"/>
+                <w:sz w:val="17"/>
+              </w:rPr>
+              <w:t>52/64</w:t>
+            </w:r>
+          </w:p>
+        </w:tc>
+        <w:tc>
+          <w:tcPr>
+            <w:tcW w:type="dxa" w:w="1050"/>
+            <w:vAlign w:val="center"/>
+            <w:tcMar>
+              <w:top w:w="80" w:type="dxa"/>
+              <w:bottom w:w="80" w:type="dxa"/>
+              <w:start w:w="120" w:type="dxa"/>
+              <w:end w:w="120" w:type="dxa"/>
+            </w:tcMar>
+          </w:tcPr>
+          <w:p>
+            <w:pPr>
+              <w:spacing w:before="0" w:after="0" w:line="240" w:lineRule="auto"/>
+            </w:pPr>
+            <w:r>
+              <w:rPr>
+                <w:rFonts w:ascii="Times New Roman" w:hAnsi="Times New Roman" w:eastAsia="Times New Roman" w:cs="Times New Roman"/>
+                <w:color w:val="000000"/>
+                <w:sz w:val="17"/>
+              </w:rPr>
+              <w:t>6/64</w:t>
+            </w:r>
+          </w:p>
+        </w:tc>
+        <w:tc>
+          <w:tcPr>
+            <w:tcW w:type="dxa" w:w="2100"/>
+            <w:vAlign w:val="center"/>
+            <w:tcMar>
+              <w:top w:w="80" w:type="dxa"/>
+              <w:bottom w:w="80" w:type="dxa"/>
+              <w:start w:w="120" w:type="dxa"/>
+              <w:end w:w="120" w:type="dxa"/>
+            </w:tcMar>
+          </w:tcPr>
+          <w:p>
+            <w:pPr>
+              <w:spacing w:before="0" w:after="0" w:line="240" w:lineRule="auto"/>
+            </w:pPr>
+            <w:r>
+              <w:rPr>
+                <w:rFonts w:ascii="Times New Roman" w:hAnsi="Times New Roman" w:eastAsia="Times New Roman" w:cs="Times New Roman"/>
+                <w:color w:val="000000"/>
+                <w:sz w:val="17"/>
+              </w:rPr>
+              <w:t>1.0</w:t>
+            </w:r>
+          </w:p>
+        </w:tc>
+        <w:tc>
+          <w:tcPr>
+            <w:tcW w:type="dxa" w:w="2160"/>
+            <w:vAlign w:val="center"/>
+            <w:tcMar>
+              <w:top w:w="80" w:type="dxa"/>
+              <w:bottom w:w="80" w:type="dxa"/>
+              <w:start w:w="120" w:type="dxa"/>
+              <w:end w:w="120" w:type="dxa"/>
+            </w:tcMar>
+          </w:tcPr>
+          <w:p>
+            <w:pPr>
+              <w:spacing w:before="0" w:after="0" w:line="240" w:lineRule="auto"/>
+            </w:pPr>
+            <w:r>
+              <w:rPr>
+                <w:rFonts w:ascii="Times New Roman" w:hAnsi="Times New Roman" w:eastAsia="Times New Roman" w:cs="Times New Roman"/>
+                <w:color w:val="000000"/>
+                <w:sz w:val="17"/>
+              </w:rPr>
+              <w:t>3.0</w:t>
+            </w:r>
+          </w:p>
+        </w:tc>
+      </w:tr>
+      <w:tr>
+        <w:trPr>
+          <w:cantSplit/>
+        </w:trPr>
+        <w:tc>
+          <w:tcPr>
+            <w:tcW w:type="dxa" w:w="3000"/>
+            <w:vAlign w:val="center"/>
+            <w:tcMar>
+              <w:top w:w="80" w:type="dxa"/>
+              <w:bottom w:w="80" w:type="dxa"/>
+              <w:start w:w="120" w:type="dxa"/>
+              <w:end w:w="120" w:type="dxa"/>
+            </w:tcMar>
+          </w:tcPr>
+          <w:p>
+            <w:pPr>
+              <w:spacing w:before="0" w:after="0" w:line="240" w:lineRule="auto"/>
+            </w:pPr>
+            <w:r>
+              <w:rPr>
+                <w:rFonts w:ascii="Times New Roman" w:hAnsi="Times New Roman" w:eastAsia="Times New Roman" w:cs="Times New Roman"/>
+                <w:color w:val="000000"/>
+                <w:sz w:val="17"/>
+              </w:rPr>
+              <w:t>Hartmann6</w:t>
+            </w:r>
+          </w:p>
+        </w:tc>
+        <w:tc>
+          <w:tcPr>
+            <w:tcW w:type="dxa" w:w="1050"/>
+            <w:vAlign w:val="center"/>
+            <w:tcMar>
+              <w:top w:w="80" w:type="dxa"/>
+              <w:bottom w:w="80" w:type="dxa"/>
+              <w:start w:w="120" w:type="dxa"/>
+              <w:end w:w="120" w:type="dxa"/>
+            </w:tcMar>
+          </w:tcPr>
+          <w:p>
+            <w:pPr>
+              <w:spacing w:before="0" w:after="0" w:line="240" w:lineRule="auto"/>
+            </w:pPr>
+            <w:r>
+              <w:rPr>
+                <w:rFonts w:ascii="Times New Roman" w:hAnsi="Times New Roman" w:eastAsia="Times New Roman" w:cs="Times New Roman"/>
+                <w:color w:val="000000"/>
+                <w:sz w:val="17"/>
+              </w:rPr>
+              <w:t>58/64</w:t>
+            </w:r>
+          </w:p>
+        </w:tc>
+        <w:tc>
+          <w:tcPr>
+            <w:tcW w:type="dxa" w:w="1050"/>
+            <w:vAlign w:val="center"/>
+            <w:tcMar>
+              <w:top w:w="80" w:type="dxa"/>
+              <w:bottom w:w="80" w:type="dxa"/>
+              <w:start w:w="120" w:type="dxa"/>
+              <w:end w:w="120" w:type="dxa"/>
+            </w:tcMar>
+          </w:tcPr>
+          <w:p>
+            <w:pPr>
+              <w:spacing w:before="0" w:after="0" w:line="240" w:lineRule="auto"/>
+            </w:pPr>
+            <w:r>
+              <w:rPr>
+                <w:rFonts w:ascii="Times New Roman" w:hAnsi="Times New Roman" w:eastAsia="Times New Roman" w:cs="Times New Roman"/>
+                <w:color w:val="000000"/>
+                <w:sz w:val="17"/>
+              </w:rPr>
+              <w:t>0/64</w:t>
+            </w:r>
+          </w:p>
+        </w:tc>
+        <w:tc>
+          <w:tcPr>
+            <w:tcW w:type="dxa" w:w="2100"/>
+            <w:vAlign w:val="center"/>
+            <w:tcMar>
+              <w:top w:w="80" w:type="dxa"/>
+              <w:bottom w:w="80" w:type="dxa"/>
+              <w:start w:w="120" w:type="dxa"/>
+              <w:end w:w="120" w:type="dxa"/>
+            </w:tcMar>
+          </w:tcPr>
+          <w:p>
+            <w:pPr>
+              <w:spacing w:before="0" w:after="0" w:line="240" w:lineRule="auto"/>
+            </w:pPr>
+            <w:r>
+              <w:rPr>
+                <w:rFonts w:ascii="Times New Roman" w:hAnsi="Times New Roman" w:eastAsia="Times New Roman" w:cs="Times New Roman"/>
+                <w:color w:val="000000"/>
+                <w:sz w:val="17"/>
+              </w:rPr>
+              <w:t>1.5</w:t>
+            </w:r>
+          </w:p>
+        </w:tc>
+        <w:tc>
+          <w:tcPr>
+            <w:tcW w:type="dxa" w:w="2160"/>
+            <w:vAlign w:val="center"/>
+            <w:tcMar>
+              <w:top w:w="80" w:type="dxa"/>
+              <w:bottom w:w="80" w:type="dxa"/>
+              <w:start w:w="120" w:type="dxa"/>
+              <w:end w:w="120" w:type="dxa"/>
+            </w:tcMar>
+          </w:tcPr>
+          <w:p>
+            <w:pPr>
+              <w:spacing w:before="0" w:after="0" w:line="240" w:lineRule="auto"/>
+            </w:pPr>
+            <w:r>
+              <w:rPr>
+                <w:rFonts w:ascii="Times New Roman" w:hAnsi="Times New Roman" w:eastAsia="Times New Roman" w:cs="Times New Roman"/>
+                <w:color w:val="000000"/>
+                <w:sz w:val="17"/>
+              </w:rPr>
+              <w:t>none</w:t>
+            </w:r>
+          </w:p>
+        </w:tc>
+      </w:tr>
+      <w:tr>
+        <w:trPr>
+          <w:cantSplit/>
+        </w:trPr>
+        <w:tc>
+          <w:tcPr>
+            <w:tcW w:type="dxa" w:w="3000"/>
+            <w:vAlign w:val="center"/>
+            <w:tcMar>
+              <w:top w:w="80" w:type="dxa"/>
+              <w:bottom w:w="80" w:type="dxa"/>
+              <w:start w:w="120" w:type="dxa"/>
+              <w:end w:w="120" w:type="dxa"/>
+            </w:tcMar>
+          </w:tcPr>
+          <w:p>
+            <w:pPr>
+              <w:spacing w:before="0" w:after="0" w:line="240" w:lineRule="auto"/>
+            </w:pPr>
+            <w:r>
+              <w:rPr>
+                <w:rFonts w:ascii="Times New Roman" w:hAnsi="Times New Roman" w:eastAsia="Times New Roman" w:cs="Times New Roman"/>
+                <w:color w:val="000000"/>
+                <w:sz w:val="17"/>
+              </w:rPr>
+              <w:t>Hill</w:t>
+            </w:r>
+          </w:p>
+        </w:tc>
+        <w:tc>
+          <w:tcPr>
+            <w:tcW w:type="dxa" w:w="1050"/>
+            <w:vAlign w:val="center"/>
+            <w:tcMar>
+              <w:top w:w="80" w:type="dxa"/>
+              <w:bottom w:w="80" w:type="dxa"/>
+              <w:start w:w="120" w:type="dxa"/>
+              <w:end w:w="120" w:type="dxa"/>
+            </w:tcMar>
+          </w:tcPr>
+          <w:p>
+            <w:pPr>
+              <w:spacing w:before="0" w:after="0" w:line="240" w:lineRule="auto"/>
+            </w:pPr>
+            <w:r>
+              <w:rPr>
+                <w:rFonts w:ascii="Times New Roman" w:hAnsi="Times New Roman" w:eastAsia="Times New Roman" w:cs="Times New Roman"/>
+                <w:color w:val="000000"/>
+                <w:sz w:val="17"/>
+              </w:rPr>
+              <w:t>5/64</w:t>
+            </w:r>
+          </w:p>
+        </w:tc>
+        <w:tc>
+          <w:tcPr>
+            <w:tcW w:type="dxa" w:w="1050"/>
+            <w:vAlign w:val="center"/>
+            <w:tcMar>
+              <w:top w:w="80" w:type="dxa"/>
+              <w:bottom w:w="80" w:type="dxa"/>
+              <w:start w:w="120" w:type="dxa"/>
+              <w:end w:w="120" w:type="dxa"/>
+            </w:tcMar>
+          </w:tcPr>
+          <w:p>
+            <w:pPr>
+              <w:spacing w:before="0" w:after="0" w:line="240" w:lineRule="auto"/>
+            </w:pPr>
+            <w:r>
+              <w:rPr>
+                <w:rFonts w:ascii="Times New Roman" w:hAnsi="Times New Roman" w:eastAsia="Times New Roman" w:cs="Times New Roman"/>
+                <w:color w:val="000000"/>
+                <w:sz w:val="17"/>
+              </w:rPr>
+              <w:t>0/64</w:t>
+            </w:r>
+          </w:p>
+        </w:tc>
+        <w:tc>
+          <w:tcPr>
+            <w:tcW w:type="dxa" w:w="2100"/>
+            <w:vAlign w:val="center"/>
+            <w:tcMar>
+              <w:top w:w="80" w:type="dxa"/>
+              <w:bottom w:w="80" w:type="dxa"/>
+              <w:start w:w="120" w:type="dxa"/>
+              <w:end w:w="120" w:type="dxa"/>
+            </w:tcMar>
+          </w:tcPr>
+          <w:p>
+            <w:pPr>
+              <w:spacing w:before="0" w:after="0" w:line="240" w:lineRule="auto"/>
+            </w:pPr>
+            <w:r>
+              <w:rPr>
+                <w:rFonts w:ascii="Times New Roman" w:hAnsi="Times New Roman" w:eastAsia="Times New Roman" w:cs="Times New Roman"/>
+                <w:color w:val="000000"/>
+                <w:sz w:val="17"/>
+              </w:rPr>
+              <w:t>1.0</w:t>
+            </w:r>
+          </w:p>
+        </w:tc>
+        <w:tc>
+          <w:tcPr>
+            <w:tcW w:type="dxa" w:w="2160"/>
+            <w:vAlign w:val="center"/>
+            <w:tcMar>
+              <w:top w:w="80" w:type="dxa"/>
+              <w:bottom w:w="80" w:type="dxa"/>
+              <w:start w:w="120" w:type="dxa"/>
+              <w:end w:w="120" w:type="dxa"/>
+            </w:tcMar>
+          </w:tcPr>
+          <w:p>
+            <w:pPr>
+              <w:spacing w:before="0" w:after="0" w:line="240" w:lineRule="auto"/>
+            </w:pPr>
+            <w:r>
+              <w:rPr>
+                <w:rFonts w:ascii="Times New Roman" w:hAnsi="Times New Roman" w:eastAsia="Times New Roman" w:cs="Times New Roman"/>
+                <w:color w:val="000000"/>
+                <w:sz w:val="17"/>
+              </w:rPr>
+              <w:t>1.5</w:t>
+            </w:r>
+          </w:p>
+        </w:tc>
+      </w:tr>
+      <w:tr>
+        <w:trPr>
+          <w:cantSplit/>
+        </w:trPr>
+        <w:tc>
+          <w:tcPr>
+            <w:tcW w:type="dxa" w:w="3000"/>
+            <w:vAlign w:val="center"/>
+            <w:tcMar>
+              <w:top w:w="80" w:type="dxa"/>
+              <w:bottom w:w="80" w:type="dxa"/>
+              <w:start w:w="120" w:type="dxa"/>
+              <w:end w:w="120" w:type="dxa"/>
+            </w:tcMar>
+          </w:tcPr>
+          <w:p>
+            <w:pPr>
+              <w:spacing w:before="0" w:after="0" w:line="240" w:lineRule="auto"/>
+            </w:pPr>
+            <w:r>
+              <w:rPr>
+                <w:rFonts w:ascii="Times New Roman" w:hAnsi="Times New Roman" w:eastAsia="Times New Roman" w:cs="Times New Roman"/>
+                <w:color w:val="000000"/>
+                <w:sz w:val="17"/>
+              </w:rPr>
+              <w:t>Levy</w:t>
+            </w:r>
+          </w:p>
+        </w:tc>
+        <w:tc>
+          <w:tcPr>
+            <w:tcW w:type="dxa" w:w="1050"/>
+            <w:vAlign w:val="center"/>
+            <w:tcMar>
+              <w:top w:w="80" w:type="dxa"/>
+              <w:bottom w:w="80" w:type="dxa"/>
+              <w:start w:w="120" w:type="dxa"/>
+              <w:end w:w="120" w:type="dxa"/>
+            </w:tcMar>
+          </w:tcPr>
+          <w:p>
+            <w:pPr>
+              <w:spacing w:before="0" w:after="0" w:line="240" w:lineRule="auto"/>
+            </w:pPr>
+            <w:r>
+              <w:rPr>
+                <w:rFonts w:ascii="Times New Roman" w:hAnsi="Times New Roman" w:eastAsia="Times New Roman" w:cs="Times New Roman"/>
+                <w:color w:val="000000"/>
+                <w:sz w:val="17"/>
+              </w:rPr>
+              <w:t>1/64</w:t>
+            </w:r>
+          </w:p>
+        </w:tc>
+        <w:tc>
+          <w:tcPr>
+            <w:tcW w:type="dxa" w:w="1050"/>
+            <w:vAlign w:val="center"/>
+            <w:tcMar>
+              <w:top w:w="80" w:type="dxa"/>
+              <w:bottom w:w="80" w:type="dxa"/>
+              <w:start w:w="120" w:type="dxa"/>
+              <w:end w:w="120" w:type="dxa"/>
+            </w:tcMar>
+          </w:tcPr>
+          <w:p>
+            <w:pPr>
+              <w:spacing w:before="0" w:after="0" w:line="240" w:lineRule="auto"/>
+            </w:pPr>
+            <w:r>
+              <w:rPr>
+                <w:rFonts w:ascii="Times New Roman" w:hAnsi="Times New Roman" w:eastAsia="Times New Roman" w:cs="Times New Roman"/>
+                <w:color w:val="000000"/>
+                <w:sz w:val="17"/>
+              </w:rPr>
+              <w:t>0/64</w:t>
+            </w:r>
+          </w:p>
+        </w:tc>
+        <w:tc>
+          <w:tcPr>
+            <w:tcW w:type="dxa" w:w="2100"/>
+            <w:vAlign w:val="center"/>
+            <w:tcMar>
+              <w:top w:w="80" w:type="dxa"/>
+              <w:bottom w:w="80" w:type="dxa"/>
+              <w:start w:w="120" w:type="dxa"/>
+              <w:end w:w="120" w:type="dxa"/>
+            </w:tcMar>
+          </w:tcPr>
+          <w:p>
+            <w:pPr>
+              <w:spacing w:before="0" w:after="0" w:line="240" w:lineRule="auto"/>
+            </w:pPr>
+            <w:r>
+              <w:rPr>
+                <w:rFonts w:ascii="Times New Roman" w:hAnsi="Times New Roman" w:eastAsia="Times New Roman" w:cs="Times New Roman"/>
+                <w:color w:val="000000"/>
+                <w:sz w:val="17"/>
+              </w:rPr>
+              <w:t>1.0</w:t>
+            </w:r>
+          </w:p>
+        </w:tc>
+        <w:tc>
+          <w:tcPr>
+            <w:tcW w:type="dxa" w:w="2160"/>
+            <w:vAlign w:val="center"/>
+            <w:tcMar>
+              <w:top w:w="80" w:type="dxa"/>
+              <w:bottom w:w="80" w:type="dxa"/>
+              <w:start w:w="120" w:type="dxa"/>
+              <w:end w:w="120" w:type="dxa"/>
+            </w:tcMar>
+          </w:tcPr>
+          <w:p>
+            <w:pPr>
+              <w:spacing w:before="0" w:after="0" w:line="240" w:lineRule="auto"/>
+            </w:pPr>
+            <w:r>
+              <w:rPr>
+                <w:rFonts w:ascii="Times New Roman" w:hAnsi="Times New Roman" w:eastAsia="Times New Roman" w:cs="Times New Roman"/>
+                <w:color w:val="000000"/>
+                <w:sz w:val="17"/>
+              </w:rPr>
+              <w:t>1.5</w:t>
+            </w:r>
+          </w:p>
+        </w:tc>
+      </w:tr>
+      <w:tr>
+        <w:trPr>
+          <w:cantSplit/>
+        </w:trPr>
+        <w:tc>
+          <w:tcPr>
+            <w:tcW w:type="dxa" w:w="3000"/>
+            <w:vAlign w:val="center"/>
+            <w:tcMar>
+              <w:top w:w="80" w:type="dxa"/>
+              <w:bottom w:w="80" w:type="dxa"/>
+              <w:start w:w="120" w:type="dxa"/>
+              <w:end w:w="120" w:type="dxa"/>
+            </w:tcMar>
+          </w:tcPr>
+          <w:p>
+            <w:pPr>
+              <w:spacing w:before="0" w:after="0" w:line="240" w:lineRule="auto"/>
+            </w:pPr>
+            <w:r>
+              <w:rPr>
+                <w:rFonts w:ascii="Times New Roman" w:hAnsi="Times New Roman" w:eastAsia="Times New Roman" w:cs="Times New Roman"/>
+                <w:color w:val="000000"/>
+                <w:sz w:val="17"/>
+              </w:rPr>
+              <w:t>Rosenbrock</w:t>
+            </w:r>
+          </w:p>
+        </w:tc>
+        <w:tc>
+          <w:tcPr>
+            <w:tcW w:type="dxa" w:w="1050"/>
+            <w:vAlign w:val="center"/>
+            <w:tcMar>
+              <w:top w:w="80" w:type="dxa"/>
+              <w:bottom w:w="80" w:type="dxa"/>
+              <w:start w:w="120" w:type="dxa"/>
+              <w:end w:w="120" w:type="dxa"/>
+            </w:tcMar>
+          </w:tcPr>
+          <w:p>
+            <w:pPr>
+              <w:spacing w:before="0" w:after="0" w:line="240" w:lineRule="auto"/>
+            </w:pPr>
+            <w:r>
+              <w:rPr>
+                <w:rFonts w:ascii="Times New Roman" w:hAnsi="Times New Roman" w:eastAsia="Times New Roman" w:cs="Times New Roman"/>
+                <w:color w:val="000000"/>
+                <w:sz w:val="17"/>
+              </w:rPr>
+              <w:t>0/64</w:t>
+            </w:r>
+          </w:p>
+        </w:tc>
+        <w:tc>
+          <w:tcPr>
+            <w:tcW w:type="dxa" w:w="1050"/>
+            <w:vAlign w:val="center"/>
+            <w:tcMar>
+              <w:top w:w="80" w:type="dxa"/>
+              <w:bottom w:w="80" w:type="dxa"/>
+              <w:start w:w="120" w:type="dxa"/>
+              <w:end w:w="120" w:type="dxa"/>
+            </w:tcMar>
+          </w:tcPr>
+          <w:p>
+            <w:pPr>
+              <w:spacing w:before="0" w:after="0" w:line="240" w:lineRule="auto"/>
+            </w:pPr>
+            <w:r>
+              <w:rPr>
+                <w:rFonts w:ascii="Times New Roman" w:hAnsi="Times New Roman" w:eastAsia="Times New Roman" w:cs="Times New Roman"/>
+                <w:color w:val="000000"/>
+                <w:sz w:val="17"/>
+              </w:rPr>
+              <w:t>0/64</w:t>
+            </w:r>
+          </w:p>
+        </w:tc>
+        <w:tc>
+          <w:tcPr>
+            <w:tcW w:type="dxa" w:w="2100"/>
+            <w:vAlign w:val="center"/>
+            <w:tcMar>
+              <w:top w:w="80" w:type="dxa"/>
+              <w:bottom w:w="80" w:type="dxa"/>
+              <w:start w:w="120" w:type="dxa"/>
+              <w:end w:w="120" w:type="dxa"/>
+            </w:tcMar>
+          </w:tcPr>
+          <w:p>
+            <w:pPr>
+              <w:spacing w:before="0" w:after="0" w:line="240" w:lineRule="auto"/>
+            </w:pPr>
+            <w:r>
+              <w:rPr>
+                <w:rFonts w:ascii="Times New Roman" w:hAnsi="Times New Roman" w:eastAsia="Times New Roman" w:cs="Times New Roman"/>
+                <w:color w:val="000000"/>
+                <w:sz w:val="17"/>
+              </w:rPr>
+              <w:t>1.0</w:t>
+            </w:r>
+          </w:p>
+        </w:tc>
+        <w:tc>
+          <w:tcPr>
+            <w:tcW w:type="dxa" w:w="2160"/>
+            <w:vAlign w:val="center"/>
+            <w:tcMar>
+              <w:top w:w="80" w:type="dxa"/>
+              <w:bottom w:w="80" w:type="dxa"/>
+              <w:start w:w="120" w:type="dxa"/>
+              <w:end w:w="120" w:type="dxa"/>
+            </w:tcMar>
+          </w:tcPr>
+          <w:p>
+            <w:pPr>
+              <w:spacing w:before="0" w:after="0" w:line="240" w:lineRule="auto"/>
+            </w:pPr>
+            <w:r>
+              <w:rPr>
+                <w:rFonts w:ascii="Times New Roman" w:hAnsi="Times New Roman" w:eastAsia="Times New Roman" w:cs="Times New Roman"/>
+                <w:color w:val="000000"/>
+                <w:sz w:val="17"/>
+              </w:rPr>
+              <w:t>1.5</w:t>
+            </w:r>
+          </w:p>
+        </w:tc>
+      </w:tr>
+      <w:tr>
+        <w:trPr>
+          <w:cantSplit/>
+        </w:trPr>
+        <w:tc>
+          <w:tcPr>
+            <w:tcW w:type="dxa" w:w="3000"/>
+            <w:vAlign w:val="center"/>
+            <w:tcMar>
+              <w:top w:w="80" w:type="dxa"/>
+              <w:bottom w:w="80" w:type="dxa"/>
+              <w:start w:w="120" w:type="dxa"/>
+              <w:end w:w="120" w:type="dxa"/>
+            </w:tcMar>
+          </w:tcPr>
+          <w:p>
+            <w:pPr>
+              <w:spacing w:before="0" w:after="0" w:line="240" w:lineRule="auto"/>
+            </w:pPr>
+            <w:r>
+              <w:rPr>
+                <w:rFonts w:ascii="Times New Roman" w:hAnsi="Times New Roman" w:eastAsia="Times New Roman" w:cs="Times New Roman"/>
+                <w:b/>
+                <w:color w:val="000000"/>
+                <w:sz w:val="17"/>
+              </w:rPr>
+              <w:t>Total</w:t>
+            </w:r>
+          </w:p>
+        </w:tc>
+        <w:tc>
+          <w:tcPr>
+            <w:tcW w:type="dxa" w:w="1050"/>
+            <w:vAlign w:val="center"/>
+            <w:tcMar>
+              <w:top w:w="80" w:type="dxa"/>
+              <w:bottom w:w="80" w:type="dxa"/>
+              <w:start w:w="120" w:type="dxa"/>
+              <w:end w:w="120" w:type="dxa"/>
+            </w:tcMar>
+          </w:tcPr>
+          <w:p>
+            <w:pPr>
+              <w:spacing w:before="0" w:after="0" w:line="240" w:lineRule="auto"/>
+            </w:pPr>
+            <w:r>
+              <w:rPr>
+                <w:rFonts w:ascii="Times New Roman" w:hAnsi="Times New Roman" w:eastAsia="Times New Roman" w:cs="Times New Roman"/>
+                <w:b/>
+                <w:color w:val="000000"/>
+                <w:sz w:val="17"/>
+              </w:rPr>
+              <w:t>116/320</w:t>
+            </w:r>
+          </w:p>
+        </w:tc>
+        <w:tc>
+          <w:tcPr>
+            <w:tcW w:type="dxa" w:w="1050"/>
+            <w:vAlign w:val="center"/>
+            <w:tcMar>
+              <w:top w:w="80" w:type="dxa"/>
+              <w:bottom w:w="80" w:type="dxa"/>
+              <w:start w:w="120" w:type="dxa"/>
+              <w:end w:w="120" w:type="dxa"/>
+            </w:tcMar>
+          </w:tcPr>
+          <w:p>
+            <w:pPr>
+              <w:spacing w:before="0" w:after="0" w:line="240" w:lineRule="auto"/>
+            </w:pPr>
+            <w:r>
+              <w:rPr>
+                <w:rFonts w:ascii="Times New Roman" w:hAnsi="Times New Roman" w:eastAsia="Times New Roman" w:cs="Times New Roman"/>
+                <w:b/>
+                <w:color w:val="000000"/>
+                <w:sz w:val="17"/>
+              </w:rPr>
+              <w:t>6/320</w:t>
+            </w:r>
+          </w:p>
+        </w:tc>
+        <w:tc>
+          <w:tcPr>
+            <w:tcW w:type="dxa" w:w="2100"/>
+            <w:vAlign w:val="center"/>
+            <w:tcMar>
+              <w:top w:w="80" w:type="dxa"/>
+              <w:bottom w:w="80" w:type="dxa"/>
+              <w:start w:w="120" w:type="dxa"/>
+              <w:end w:w="120" w:type="dxa"/>
+            </w:tcMar>
+          </w:tcPr>
+          <w:p>
+            <w:pPr>
+              <w:spacing w:before="0" w:after="0" w:line="240" w:lineRule="auto"/>
+            </w:pPr>
+            <w:r>
+              <w:rPr>
+                <w:rFonts w:ascii="Times New Roman" w:hAnsi="Times New Roman" w:eastAsia="Times New Roman" w:cs="Times New Roman"/>
+                <w:color w:val="000000"/>
+                <w:sz w:val="17"/>
+              </w:rPr>
+              <w:t>—</w:t>
+            </w:r>
+          </w:p>
+        </w:tc>
+        <w:tc>
+          <w:tcPr>
+            <w:tcW w:type="dxa" w:w="2160"/>
+            <w:vAlign w:val="center"/>
+            <w:tcMar>
+              <w:top w:w="80" w:type="dxa"/>
+              <w:bottom w:w="80" w:type="dxa"/>
+              <w:start w:w="120" w:type="dxa"/>
+              <w:end w:w="120" w:type="dxa"/>
+            </w:tcMar>
+          </w:tcPr>
+          <w:p>
+            <w:pPr>
+              <w:spacing w:before="0" w:after="0" w:line="240" w:lineRule="auto"/>
+            </w:pPr>
+            <w:r>
+              <w:rPr>
+                <w:rFonts w:ascii="Times New Roman" w:hAnsi="Times New Roman" w:eastAsia="Times New Roman" w:cs="Times New Roman"/>
+                <w:color w:val="000000"/>
+                <w:sz w:val="17"/>
+              </w:rPr>
+              <w:t>—</w:t>
+            </w:r>
+          </w:p>
+        </w:tc>
+      </w:tr>
+    </w:tbl>
+    <w:p>
+      <w:pPr>
+        <w:spacing w:after="40"/>
+      </w:pPr>
+    </w:p>
+    <w:p>
+      <w:pPr>
         <w:pStyle w:val="Heading2"/>
         <w:widowControl/>
       </w:pPr>
@@ -2414,7 +3403,7 @@
           <w:color w:val="000000"/>
           <w:sz w:val="24"/>
         </w:rPr>
-        <w:t>Here the question is recipe quality, not regions. Both methods used 48 wells; SPADE used five rounds and qLogNEI used ten. Average simple regret differed by −0.0005 (SPADE minus qLogNEI), with a 95% confidence interval from −0.0221 to +0.0207 (p = 0.96; n = 160 family–seed pairs). In words: we see no clear winner on the single best recipe, and the interval is wide enough that we also cannot claim the two methods are practically equivalent within the pre-set ±0.02 margin. Calendar time and dollar cost were not measured.</w:t>
+        <w:t>This comparison concerns recipe quality rather than regions. Both methods used 48 wells; SPADE used five rounds and qLogNEI used ten. Average simple regret differed by −0.0005 (SPADE minus qLogNEI), with a 95% confidence interval from −0.0221 to +0.0207 (p = 0.96; n = 160 family–seed pairs). There is no clear winner on the single best recipe, and the interval is wide enough that equivalence within the pre-set ±0.02 margin also cannot be claimed. Calendar time and dollar cost were not measured.</w:t>
       </w:r>
     </w:p>
     <w:p>
@@ -4091,6 +5080,19 @@
           <w:sz w:val="24"/>
         </w:rPr>
         <w:t>They do not support a universal ranking. The qLogNEI point comparison showed no detectable difference and did not establish equivalence. Screened DoE found a substantially better point recipe in fewer rounds. A laboratory requiring one recipe may rationally prefer a point optimizer; a laboratory requiring a region faces a different loss function.</w:t>
+      </w:r>
+    </w:p>
+    <w:p>
+      <w:pPr>
+        <w:widowControl/>
+      </w:pPr>
+      <w:r>
+        <w:rPr>
+          <w:rFonts w:ascii="Times New Roman" w:hAnsi="Times New Roman" w:eastAsia="Times New Roman" w:cs="Times New Roman"/>
+          <w:color w:val="000000"/>
+          <w:sz w:val="24"/>
+        </w:rPr>
+        <w:t>Absolute certified volumes remain small on this benchmark: when SPADE answered, the mean returned region covered about 0.24% of the scoring grid (roughly five of 2,000 points). At 48 wells and relative noise 0.25, that scarcity is consistent with the margin-to-noise association and with the real-noise ceiling at which no tested arm certified: SPADE’s regional advantage is that it locates a non-empty conservative set under these rules at all, not that it returns a large fraction of the design space.</w:t>
       </w:r>
     </w:p>
     <w:p>

</xml_diff>

<commit_message>
docs: plain-text inflation c in Table 1a headers
Avoid Markdown math delimiters leaking into the Word table cells.
</commit_message>
<xml_diff>
--- a/manuscript/SPADE-PLOS-ONE-submission.docx
+++ b/manuscript/SPADE-PLOS-ONE-submission.docx
@@ -2422,7 +2422,7 @@
           <w:color w:val="000000"/>
           <w:sz w:val="24"/>
         </w:rPr>
-        <w:t xml:space="preserve"> Each cell pools prevalences 0.30 and 0.10 (64 family–seed–prevalence cells). Inflation \(c\) is selected on the other four families; volume scoring uses the held-out family’s selected \(c\) (or baseline \(c=1\) with forced zero volume when no \(c\) passes). Totals match the 116/320 versus 6/320 headline.</w:t>
+        <w:t xml:space="preserve"> Each cell pools prevalences 0.30 and 0.10 (64 family–seed–prevalence cells). Inflation c is selected on the other four families; volume scoring uses the held-out family’s selected c (or baseline c=1 with forced zero volume when no c passes). Totals match the 116/320 versus 6/320 headline.</w:t>
       </w:r>
     </w:p>
     <w:tbl>
@@ -2558,7 +2558,7 @@
                 <w:color w:val="000000"/>
                 <w:sz w:val="17"/>
               </w:rPr>
-              <w:t>SPADE selected \(c\)</w:t>
+              <w:t>SPADE selected c</w:t>
             </w:r>
           </w:p>
         </w:tc>
@@ -2585,7 +2585,7 @@
                 <w:color w:val="000000"/>
                 <w:sz w:val="17"/>
               </w:rPr>
-              <w:t>qLogNEI selected \(c\)</w:t>
+              <w:t>qLogNEI selected c</w:t>
             </w:r>
           </w:p>
         </w:tc>

</xml_diff>